<commit_message>
Adding additional people to the Motion for COV.
</commit_message>
<xml_diff>
--- a/docassemble/USCISApplications/data/templates/COV_motion.docx
+++ b/docassemble/USCISApplications/data/templates/COV_motion.docx
@@ -470,7 +470,33 @@
         <w:rPr>
           <w:bCs/>
         </w:rPr>
-        <w:t>{%p if users | length == 1</w:t>
+        <w:t xml:space="preserve">{%p if </w:t>
+      </w:r>
+      <w:proofErr w:type="spellStart"/>
+      <w:r>
+        <w:rPr>
+          <w:bCs/>
+        </w:rPr>
+        <w:t>motion</w:t>
+      </w:r>
+      <w:r>
+        <w:rPr>
+          <w:bCs/>
+        </w:rPr>
+        <w:t>_</w:t>
+      </w:r>
+      <w:r>
+        <w:rPr>
+          <w:bCs/>
+        </w:rPr>
+        <w:t>users</w:t>
+      </w:r>
+      <w:proofErr w:type="spellEnd"/>
+      <w:r>
+        <w:rPr>
+          <w:bCs/>
+        </w:rPr>
+        <w:t xml:space="preserve"> | length == 1</w:t>
       </w:r>
       <w:r>
         <w:rPr>
@@ -500,32 +526,26 @@
         </w:rPr>
         <w:t xml:space="preserve">{{ </w:t>
       </w:r>
-      <w:r>
-        <w:rPr>
-          <w:bCs/>
-        </w:rPr>
-        <w:t>users[</w:t>
-      </w:r>
-      <w:proofErr w:type="spellStart"/>
-      <w:r>
-        <w:rPr>
-          <w:bCs/>
-        </w:rPr>
-        <w:t>i</w:t>
-      </w:r>
-      <w:proofErr w:type="spellEnd"/>
-      <w:r>
-        <w:rPr>
-          <w:bCs/>
-        </w:rPr>
-        <w:t>].</w:t>
-      </w:r>
-      <w:proofErr w:type="spellStart"/>
-      <w:r>
-        <w:rPr>
-          <w:bCs/>
-        </w:rPr>
-        <w:t>lastfirst</w:t>
+      <w:proofErr w:type="spellStart"/>
+      <w:r>
+        <w:rPr>
+          <w:bCs/>
+        </w:rPr>
+        <w:t>motion_users</w:t>
+      </w:r>
+      <w:proofErr w:type="spellEnd"/>
+      <w:r>
+        <w:rPr>
+          <w:bCs/>
+        </w:rPr>
+        <w:t>[0].</w:t>
+      </w:r>
+      <w:proofErr w:type="spellStart"/>
+      <w:r>
+        <w:rPr>
+          <w:bCs/>
+        </w:rPr>
+        <w:t>name.lastfirst</w:t>
       </w:r>
       <w:proofErr w:type="spellEnd"/>
       <w:r>
@@ -549,31 +569,33 @@
         </w:rPr>
         <w:t xml:space="preserve">{{ </w:t>
       </w:r>
-      <w:r>
-        <w:rPr>
-          <w:bCs/>
-        </w:rPr>
-        <w:t>users[</w:t>
-      </w:r>
-      <w:proofErr w:type="spellStart"/>
-      <w:r>
-        <w:rPr>
-          <w:bCs/>
-        </w:rPr>
-        <w:t>i</w:t>
-      </w:r>
-      <w:proofErr w:type="spellEnd"/>
-      <w:r>
-        <w:rPr>
-          <w:bCs/>
-        </w:rPr>
-        <w:t>].</w:t>
-      </w:r>
-      <w:r>
-        <w:rPr>
-          <w:bCs/>
-        </w:rPr>
-        <w:t xml:space="preserve">middle </w:t>
+      <w:proofErr w:type="spellStart"/>
+      <w:r>
+        <w:rPr>
+          <w:bCs/>
+        </w:rPr>
+        <w:t>motion_users</w:t>
+      </w:r>
+      <w:proofErr w:type="spellEnd"/>
+      <w:r>
+        <w:rPr>
+          <w:bCs/>
+        </w:rPr>
+        <w:t>[0].</w:t>
+      </w:r>
+      <w:proofErr w:type="spellStart"/>
+      <w:r>
+        <w:rPr>
+          <w:bCs/>
+        </w:rPr>
+        <w:t>name.middle</w:t>
+      </w:r>
+      <w:proofErr w:type="spellEnd"/>
+      <w:r>
+        <w:rPr>
+          <w:bCs/>
+        </w:rPr>
+        <w:t xml:space="preserve"> </w:t>
       </w:r>
       <w:r>
         <w:rPr>
@@ -610,20 +632,26 @@
         </w:rPr>
         <w:t xml:space="preserve">A# {{ </w:t>
       </w:r>
-      <w:r>
-        <w:rPr>
-          <w:bCs/>
-        </w:rPr>
-        <w:t>users[</w:t>
-      </w:r>
-      <w:proofErr w:type="spellStart"/>
-      <w:r>
-        <w:rPr>
-          <w:bCs/>
-        </w:rPr>
-        <w:t>i</w:t>
-      </w:r>
-      <w:proofErr w:type="spellEnd"/>
+      <w:proofErr w:type="spellStart"/>
+      <w:r>
+        <w:rPr>
+          <w:bCs/>
+        </w:rPr>
+        <w:t>motion_users</w:t>
+      </w:r>
+      <w:proofErr w:type="spellEnd"/>
+      <w:r>
+        <w:rPr>
+          <w:bCs/>
+        </w:rPr>
+        <w:t>[</w:t>
+      </w:r>
+      <w:r>
+        <w:rPr>
+          <w:bCs/>
+        </w:rPr>
+        <w:t>0</w:t>
+      </w:r>
       <w:r>
         <w:rPr>
           <w:bCs/>
@@ -803,13 +831,7 @@
         <w:rPr>
           <w:bCs/>
         </w:rPr>
-        <w:t>.name.</w:t>
-      </w:r>
-      <w:r>
-        <w:rPr>
-          <w:bCs/>
-        </w:rPr>
-        <w:t>middle</w:t>
+        <w:t>.name.middle</w:t>
       </w:r>
       <w:proofErr w:type="spellEnd"/>
       <w:r>
@@ -893,14 +915,14 @@
         <w:rPr>
           <w:bCs/>
         </w:rPr>
-        <w:t>{%p en</w:t>
-      </w:r>
-      <w:proofErr w:type="spellStart"/>
-      <w:r>
-        <w:rPr>
-          <w:bCs/>
-        </w:rPr>
-        <w:t>dfor</w:t>
+        <w:t xml:space="preserve">{%p </w:t>
+      </w:r>
+      <w:proofErr w:type="spellStart"/>
+      <w:r>
+        <w:rPr>
+          <w:bCs/>
+        </w:rPr>
+        <w:t>endfor</w:t>
       </w:r>
       <w:proofErr w:type="spellEnd"/>
       <w:r>
@@ -923,19 +945,7 @@
         <w:rPr>
           <w:bCs/>
         </w:rPr>
-        <w:t xml:space="preserve">{%p </w:t>
-      </w:r>
-      <w:r>
-        <w:rPr>
-          <w:bCs/>
-        </w:rPr>
-        <w:t>endif</w:t>
-      </w:r>
-      <w:r>
-        <w:rPr>
-          <w:bCs/>
-        </w:rPr>
-        <w:t xml:space="preserve"> %}</w:t>
+        <w:t>{%p endif %}</w:t>
       </w:r>
     </w:p>
     <w:p>
@@ -1240,7 +1250,6 @@
           <w:b/>
           <w:bCs/>
         </w:rPr>
-        <w:lastRenderedPageBreak/>
         <w:br w:type="page"/>
       </w:r>
     </w:p>
@@ -2976,7 +2985,33 @@
         <w:rPr>
           <w:bCs/>
         </w:rPr>
-        <w:t>{%p if users | length == 1 %}</w:t>
+        <w:t xml:space="preserve">{%p if </w:t>
+      </w:r>
+      <w:proofErr w:type="spellStart"/>
+      <w:r>
+        <w:rPr>
+          <w:bCs/>
+        </w:rPr>
+        <w:t>motion</w:t>
+      </w:r>
+      <w:r>
+        <w:rPr>
+          <w:bCs/>
+        </w:rPr>
+        <w:t>_users</w:t>
+      </w:r>
+      <w:proofErr w:type="spellEnd"/>
+      <w:r>
+        <w:rPr>
+          <w:bCs/>
+        </w:rPr>
+        <w:t xml:space="preserve"> </w:t>
+      </w:r>
+      <w:r>
+        <w:rPr>
+          <w:bCs/>
+        </w:rPr>
+        <w:t>| length == 1 %}</w:t>
       </w:r>
     </w:p>
     <w:p>
@@ -2994,32 +3029,26 @@
         </w:rPr>
         <w:t xml:space="preserve">{{ </w:t>
       </w:r>
-      <w:r>
-        <w:rPr>
-          <w:bCs/>
-        </w:rPr>
-        <w:t>users[</w:t>
-      </w:r>
-      <w:proofErr w:type="spellStart"/>
-      <w:r>
-        <w:rPr>
-          <w:bCs/>
-        </w:rPr>
-        <w:t>i</w:t>
-      </w:r>
-      <w:proofErr w:type="spellEnd"/>
-      <w:r>
-        <w:rPr>
-          <w:bCs/>
-        </w:rPr>
-        <w:t>].</w:t>
-      </w:r>
-      <w:proofErr w:type="spellStart"/>
-      <w:r>
-        <w:rPr>
-          <w:bCs/>
-        </w:rPr>
-        <w:t>lastfirst</w:t>
+      <w:proofErr w:type="spellStart"/>
+      <w:r>
+        <w:rPr>
+          <w:bCs/>
+        </w:rPr>
+        <w:t>motion_users</w:t>
+      </w:r>
+      <w:proofErr w:type="spellEnd"/>
+      <w:r>
+        <w:rPr>
+          <w:bCs/>
+        </w:rPr>
+        <w:t>[0].</w:t>
+      </w:r>
+      <w:proofErr w:type="spellStart"/>
+      <w:r>
+        <w:rPr>
+          <w:bCs/>
+        </w:rPr>
+        <w:t>name.lastfirst</w:t>
       </w:r>
       <w:proofErr w:type="spellEnd"/>
       <w:r>
@@ -3043,25 +3072,33 @@
         </w:rPr>
         <w:t xml:space="preserve">{{ </w:t>
       </w:r>
-      <w:r>
-        <w:rPr>
-          <w:bCs/>
-        </w:rPr>
-        <w:t>users[</w:t>
-      </w:r>
-      <w:proofErr w:type="spellStart"/>
-      <w:r>
-        <w:rPr>
-          <w:bCs/>
-        </w:rPr>
-        <w:t>i</w:t>
-      </w:r>
-      <w:proofErr w:type="spellEnd"/>
-      <w:r>
-        <w:rPr>
-          <w:bCs/>
-        </w:rPr>
-        <w:t xml:space="preserve">].middle </w:t>
+      <w:proofErr w:type="spellStart"/>
+      <w:r>
+        <w:rPr>
+          <w:bCs/>
+        </w:rPr>
+        <w:t>motion_users</w:t>
+      </w:r>
+      <w:proofErr w:type="spellEnd"/>
+      <w:r>
+        <w:rPr>
+          <w:bCs/>
+        </w:rPr>
+        <w:t>[0].</w:t>
+      </w:r>
+      <w:proofErr w:type="spellStart"/>
+      <w:r>
+        <w:rPr>
+          <w:bCs/>
+        </w:rPr>
+        <w:t>name.middle</w:t>
+      </w:r>
+      <w:proofErr w:type="spellEnd"/>
+      <w:r>
+        <w:rPr>
+          <w:bCs/>
+        </w:rPr>
+        <w:t xml:space="preserve"> </w:t>
       </w:r>
       <w:r>
         <w:rPr>
@@ -3095,20 +3132,26 @@
         </w:rPr>
         <w:t xml:space="preserve">A# {{ </w:t>
       </w:r>
-      <w:r>
-        <w:rPr>
-          <w:bCs/>
-        </w:rPr>
-        <w:t>users[</w:t>
-      </w:r>
-      <w:proofErr w:type="spellStart"/>
-      <w:r>
-        <w:rPr>
-          <w:bCs/>
-        </w:rPr>
-        <w:t>i</w:t>
-      </w:r>
-      <w:proofErr w:type="spellEnd"/>
+      <w:proofErr w:type="spellStart"/>
+      <w:r>
+        <w:rPr>
+          <w:bCs/>
+        </w:rPr>
+        <w:t>motion_users</w:t>
+      </w:r>
+      <w:proofErr w:type="spellEnd"/>
+      <w:r>
+        <w:rPr>
+          <w:bCs/>
+        </w:rPr>
+        <w:t>[</w:t>
+      </w:r>
+      <w:r>
+        <w:rPr>
+          <w:bCs/>
+        </w:rPr>
+        <w:t>0</w:t>
+      </w:r>
       <w:r>
         <w:rPr>
           <w:bCs/>
@@ -3963,6 +4006,7 @@
         <w:rPr>
           <w:rFonts w:eastAsia="Calibri"/>
         </w:rPr>
+        <w:lastRenderedPageBreak/>
         <w:t xml:space="preserve">Date </w:t>
       </w:r>
       <w:r>
@@ -4211,7 +4255,27 @@
         <w:rPr>
           <w:bCs/>
         </w:rPr>
-        <w:t>{%p if users | length == 1 %}</w:t>
+        <w:t xml:space="preserve">{%p if </w:t>
+      </w:r>
+      <w:proofErr w:type="spellStart"/>
+      <w:r>
+        <w:rPr>
+          <w:bCs/>
+        </w:rPr>
+        <w:t>motion_users</w:t>
+      </w:r>
+      <w:proofErr w:type="spellEnd"/>
+      <w:r>
+        <w:rPr>
+          <w:bCs/>
+        </w:rPr>
+        <w:t xml:space="preserve"> </w:t>
+      </w:r>
+      <w:r>
+        <w:rPr>
+          <w:bCs/>
+        </w:rPr>
+        <w:t>| length == 1 %}</w:t>
       </w:r>
     </w:p>
     <w:p>
@@ -4229,32 +4293,44 @@
         </w:rPr>
         <w:t xml:space="preserve">{{ </w:t>
       </w:r>
-      <w:r>
-        <w:rPr>
-          <w:bCs/>
-        </w:rPr>
-        <w:t>users[</w:t>
-      </w:r>
-      <w:proofErr w:type="spellStart"/>
-      <w:r>
-        <w:rPr>
-          <w:bCs/>
-        </w:rPr>
-        <w:t>i</w:t>
-      </w:r>
-      <w:proofErr w:type="spellEnd"/>
-      <w:r>
-        <w:rPr>
-          <w:bCs/>
-        </w:rPr>
-        <w:t>].</w:t>
-      </w:r>
-      <w:proofErr w:type="spellStart"/>
-      <w:r>
-        <w:rPr>
-          <w:bCs/>
-        </w:rPr>
-        <w:t>lastfirst</w:t>
+      <w:proofErr w:type="spellStart"/>
+      <w:r>
+        <w:rPr>
+          <w:bCs/>
+        </w:rPr>
+        <w:t>motion_users</w:t>
+      </w:r>
+      <w:proofErr w:type="spellEnd"/>
+      <w:r>
+        <w:rPr>
+          <w:bCs/>
+        </w:rPr>
+        <w:t>[0</w:t>
+      </w:r>
+      <w:r>
+        <w:rPr>
+          <w:bCs/>
+        </w:rPr>
+        <w:t>]</w:t>
+      </w:r>
+      <w:r>
+        <w:rPr>
+          <w:bCs/>
+        </w:rPr>
+        <w:t>.</w:t>
+      </w:r>
+      <w:proofErr w:type="spellStart"/>
+      <w:r>
+        <w:rPr>
+          <w:bCs/>
+        </w:rPr>
+        <w:t>name</w:t>
+      </w:r>
+      <w:r>
+        <w:rPr>
+          <w:bCs/>
+        </w:rPr>
+        <w:t>.lastfirst</w:t>
       </w:r>
       <w:proofErr w:type="spellEnd"/>
       <w:r>
@@ -4278,25 +4354,57 @@
         </w:rPr>
         <w:t xml:space="preserve">{{ </w:t>
       </w:r>
-      <w:r>
-        <w:rPr>
-          <w:bCs/>
-        </w:rPr>
-        <w:t>users[</w:t>
-      </w:r>
-      <w:proofErr w:type="spellStart"/>
-      <w:r>
-        <w:rPr>
-          <w:bCs/>
-        </w:rPr>
-        <w:t>i</w:t>
-      </w:r>
-      <w:proofErr w:type="spellEnd"/>
-      <w:r>
-        <w:rPr>
-          <w:bCs/>
-        </w:rPr>
-        <w:t xml:space="preserve">].middle </w:t>
+      <w:proofErr w:type="spellStart"/>
+      <w:r>
+        <w:rPr>
+          <w:bCs/>
+        </w:rPr>
+        <w:t>motion_users</w:t>
+      </w:r>
+      <w:proofErr w:type="spellEnd"/>
+      <w:r>
+        <w:rPr>
+          <w:bCs/>
+        </w:rPr>
+        <w:t>[</w:t>
+      </w:r>
+      <w:r>
+        <w:rPr>
+          <w:bCs/>
+        </w:rPr>
+        <w:t>0</w:t>
+      </w:r>
+      <w:r>
+        <w:rPr>
+          <w:bCs/>
+        </w:rPr>
+        <w:t>]</w:t>
+      </w:r>
+      <w:r>
+        <w:rPr>
+          <w:bCs/>
+        </w:rPr>
+        <w:t>.</w:t>
+      </w:r>
+      <w:proofErr w:type="spellStart"/>
+      <w:r>
+        <w:rPr>
+          <w:bCs/>
+        </w:rPr>
+        <w:t>name</w:t>
+      </w:r>
+      <w:r>
+        <w:rPr>
+          <w:bCs/>
+        </w:rPr>
+        <w:t>.middle</w:t>
+      </w:r>
+      <w:proofErr w:type="spellEnd"/>
+      <w:r>
+        <w:rPr>
+          <w:bCs/>
+        </w:rPr>
+        <w:t xml:space="preserve"> </w:t>
       </w:r>
       <w:r>
         <w:rPr>
@@ -4330,20 +4438,20 @@
         </w:rPr>
         <w:t xml:space="preserve">A# {{ </w:t>
       </w:r>
-      <w:r>
-        <w:rPr>
-          <w:bCs/>
-        </w:rPr>
-        <w:t>users[</w:t>
-      </w:r>
-      <w:proofErr w:type="spellStart"/>
-      <w:r>
-        <w:rPr>
-          <w:bCs/>
-        </w:rPr>
-        <w:t>i</w:t>
-      </w:r>
-      <w:proofErr w:type="spellEnd"/>
+      <w:proofErr w:type="spellStart"/>
+      <w:r>
+        <w:rPr>
+          <w:bCs/>
+        </w:rPr>
+        <w:t>motion_users</w:t>
+      </w:r>
+      <w:proofErr w:type="spellEnd"/>
+      <w:r>
+        <w:rPr>
+          <w:bCs/>
+        </w:rPr>
+        <w:t>[0</w:t>
+      </w:r>
       <w:r>
         <w:rPr>
           <w:bCs/>
@@ -6475,6 +6583,7 @@
   <w:style w:type="character" w:default="1" w:styleId="DefaultParagraphFont">
     <w:name w:val="Default Paragraph Font"/>
     <w:uiPriority w:val="1"/>
+    <w:semiHidden/>
     <w:unhideWhenUsed/>
   </w:style>
   <w:style w:type="table" w:default="1" w:styleId="TableNormal">
@@ -6943,27 +7052,6 @@
 </file>
 
 <file path=customXml/item1.xml><?xml version="1.0" encoding="utf-8"?>
-<?mso-contentType ?>
-<FormTemplates xmlns="http://schemas.microsoft.com/sharepoint/v3/contenttype/forms">
-  <Display>DocumentLibraryForm</Display>
-  <Edit>DocumentLibraryForm</Edit>
-  <New>DocumentLibraryForm</New>
-</FormTemplates>
-</file>
-
-<file path=customXml/item2.xml><?xml version="1.0" encoding="utf-8"?>
-<p:properties xmlns:p="http://schemas.microsoft.com/office/2006/metadata/properties" xmlns:xsi="http://www.w3.org/2001/XMLSchema-instance" xmlns:pc="http://schemas.microsoft.com/office/infopath/2007/PartnerControls">
-  <documentManagement>
-    <TaxCatchAll xmlns="fc2e0b91-73db-4711-986b-9e7114b1c780" xsi:nil="true"/>
-    <lcf76f155ced4ddcb4097134ff3c332f xmlns="aa22b7f0-1c77-4983-9187-bff8e7aaefd5">
-      <Terms xmlns="http://schemas.microsoft.com/office/infopath/2007/PartnerControls"/>
-    </lcf76f155ced4ddcb4097134ff3c332f>
-    <Note xmlns="aa22b7f0-1c77-4983-9187-bff8e7aaefd5" xsi:nil="true"/>
-  </documentManagement>
-</p:properties>
-</file>
-
-<file path=customXml/item3.xml><?xml version="1.0" encoding="utf-8"?>
 <ct:contentTypeSchema xmlns:ct="http://schemas.microsoft.com/office/2006/metadata/contentType" xmlns:ma="http://schemas.microsoft.com/office/2006/metadata/properties/metaAttributes" ct:_="" ma:_="" ma:contentTypeName="Document" ma:contentTypeID="0x01010041FCC52ECBA99C44897D8B99E45B6EB2" ma:contentTypeVersion="20" ma:contentTypeDescription="Create a new document." ma:contentTypeScope="" ma:versionID="98dd51a1eb8d717f429cfb72bbcdf291">
   <xsd:schema xmlns:xsd="http://www.w3.org/2001/XMLSchema" xmlns:xs="http://www.w3.org/2001/XMLSchema" xmlns:p="http://schemas.microsoft.com/office/2006/metadata/properties" xmlns:ns2="aa22b7f0-1c77-4983-9187-bff8e7aaefd5" xmlns:ns3="fc2e0b91-73db-4711-986b-9e7114b1c780" targetNamespace="http://schemas.microsoft.com/office/2006/metadata/properties" ma:root="true" ma:fieldsID="764fccced344541160bdf3d7a4f43fd4" ns2:_="" ns3:_="">
     <xsd:import namespace="aa22b7f0-1c77-4983-9187-bff8e7aaefd5"/>
@@ -7220,10 +7308,42 @@
 </ct:contentTypeSchema>
 </file>
 
+<file path=customXml/item2.xml><?xml version="1.0" encoding="utf-8"?>
+<p:properties xmlns:p="http://schemas.microsoft.com/office/2006/metadata/properties" xmlns:xsi="http://www.w3.org/2001/XMLSchema-instance" xmlns:pc="http://schemas.microsoft.com/office/infopath/2007/PartnerControls">
+  <documentManagement>
+    <TaxCatchAll xmlns="fc2e0b91-73db-4711-986b-9e7114b1c780" xsi:nil="true"/>
+    <lcf76f155ced4ddcb4097134ff3c332f xmlns="aa22b7f0-1c77-4983-9187-bff8e7aaefd5">
+      <Terms xmlns="http://schemas.microsoft.com/office/infopath/2007/PartnerControls"/>
+    </lcf76f155ced4ddcb4097134ff3c332f>
+    <Note xmlns="aa22b7f0-1c77-4983-9187-bff8e7aaefd5" xsi:nil="true"/>
+  </documentManagement>
+</p:properties>
+</file>
+
+<file path=customXml/item3.xml><?xml version="1.0" encoding="utf-8"?>
+<?mso-contentType ?>
+<FormTemplates xmlns="http://schemas.microsoft.com/sharepoint/v3/contenttype/forms">
+  <Display>DocumentLibraryForm</Display>
+  <Edit>DocumentLibraryForm</Edit>
+  <New>DocumentLibraryForm</New>
+</FormTemplates>
+</file>
+
 <file path=customXml/itemProps1.xml><?xml version="1.0" encoding="utf-8"?>
-<ds:datastoreItem xmlns:ds="http://schemas.openxmlformats.org/officeDocument/2006/customXml" ds:itemID="{61801A56-0FD2-4394-93D8-612F28940603}">
+<ds:datastoreItem xmlns:ds="http://schemas.openxmlformats.org/officeDocument/2006/customXml" ds:itemID="{82045B43-7134-4D42-9F91-65658FCA0A3C}">
   <ds:schemaRefs>
-    <ds:schemaRef ds:uri="http://schemas.microsoft.com/sharepoint/v3/contenttype/forms"/>
+    <ds:schemaRef ds:uri="http://schemas.microsoft.com/office/2006/metadata/contentType"/>
+    <ds:schemaRef ds:uri="http://schemas.microsoft.com/office/2006/metadata/properties/metaAttributes"/>
+    <ds:schemaRef ds:uri="http://www.w3.org/2001/XMLSchema"/>
+    <ds:schemaRef ds:uri="http://schemas.microsoft.com/office/2006/metadata/properties"/>
+    <ds:schemaRef ds:uri="aa22b7f0-1c77-4983-9187-bff8e7aaefd5"/>
+    <ds:schemaRef ds:uri="fc2e0b91-73db-4711-986b-9e7114b1c780"/>
+    <ds:schemaRef ds:uri="http://schemas.microsoft.com/office/2006/documentManagement/types"/>
+    <ds:schemaRef ds:uri="http://schemas.microsoft.com/office/infopath/2007/PartnerControls"/>
+    <ds:schemaRef ds:uri="http://schemas.openxmlformats.org/package/2006/metadata/core-properties"/>
+    <ds:schemaRef ds:uri="http://purl.org/dc/elements/1.1/"/>
+    <ds:schemaRef ds:uri="http://purl.org/dc/terms/"/>
+    <ds:schemaRef ds:uri="http://schemas.microsoft.com/internal/obd"/>
   </ds:schemaRefs>
 </ds:datastoreItem>
 </file>
@@ -7240,20 +7360,9 @@
 </file>
 
 <file path=customXml/itemProps3.xml><?xml version="1.0" encoding="utf-8"?>
-<ds:datastoreItem xmlns:ds="http://schemas.openxmlformats.org/officeDocument/2006/customXml" ds:itemID="{82045B43-7134-4D42-9F91-65658FCA0A3C}">
+<ds:datastoreItem xmlns:ds="http://schemas.openxmlformats.org/officeDocument/2006/customXml" ds:itemID="{61801A56-0FD2-4394-93D8-612F28940603}">
   <ds:schemaRefs>
-    <ds:schemaRef ds:uri="http://schemas.microsoft.com/office/2006/metadata/contentType"/>
-    <ds:schemaRef ds:uri="http://schemas.microsoft.com/office/2006/metadata/properties/metaAttributes"/>
-    <ds:schemaRef ds:uri="http://www.w3.org/2001/XMLSchema"/>
-    <ds:schemaRef ds:uri="http://schemas.microsoft.com/office/2006/metadata/properties"/>
-    <ds:schemaRef ds:uri="aa22b7f0-1c77-4983-9187-bff8e7aaefd5"/>
-    <ds:schemaRef ds:uri="fc2e0b91-73db-4711-986b-9e7114b1c780"/>
-    <ds:schemaRef ds:uri="http://schemas.microsoft.com/office/2006/documentManagement/types"/>
-    <ds:schemaRef ds:uri="http://schemas.microsoft.com/office/infopath/2007/PartnerControls"/>
-    <ds:schemaRef ds:uri="http://schemas.openxmlformats.org/package/2006/metadata/core-properties"/>
-    <ds:schemaRef ds:uri="http://purl.org/dc/elements/1.1/"/>
-    <ds:schemaRef ds:uri="http://purl.org/dc/terms/"/>
-    <ds:schemaRef ds:uri="http://schemas.microsoft.com/internal/obd"/>
+    <ds:schemaRef ds:uri="http://schemas.microsoft.com/sharepoint/v3/contenttype/forms"/>
   </ds:schemaRefs>
 </ds:datastoreItem>
 </file>
</xml_diff>

<commit_message>
Updates to the COV Motion handling to produce all documents in a group on first applicant. Reworking COA handling.
</commit_message>
<xml_diff>
--- a/docassemble/USCISApplications/data/templates/COV_motion.docx
+++ b/docassemble/USCISApplications/data/templates/COV_motion.docx
@@ -121,49 +121,29 @@
         <w:rPr>
           <w:b/>
         </w:rPr>
-        <w:t>{% if users[</w:t>
-      </w:r>
-      <w:proofErr w:type="spellStart"/>
-      <w:r>
-        <w:rPr>
-          <w:b/>
-        </w:rPr>
-        <w:t>i</w:t>
-      </w:r>
-      <w:proofErr w:type="spellEnd"/>
-      <w:r>
-        <w:rPr>
-          <w:b/>
-        </w:rPr>
-        <w:t>].</w:t>
-      </w:r>
-      <w:proofErr w:type="spellStart"/>
-      <w:r>
-        <w:rPr>
-          <w:b/>
-        </w:rPr>
-        <w:t>dhs.different_court_location</w:t>
-      </w:r>
-      <w:proofErr w:type="spellEnd"/>
-      <w:r>
-        <w:rPr>
-          <w:b/>
-        </w:rPr>
-        <w:t xml:space="preserve"> %}{{ users[</w:t>
-      </w:r>
-      <w:proofErr w:type="spellStart"/>
-      <w:r>
-        <w:rPr>
-          <w:b/>
-        </w:rPr>
-        <w:t>i</w:t>
-      </w:r>
-      <w:proofErr w:type="spellEnd"/>
-      <w:r>
-        <w:rPr>
-          <w:b/>
-        </w:rPr>
-        <w:t>].</w:t>
+        <w:t xml:space="preserve">{% if </w:t>
+      </w:r>
+      <w:proofErr w:type="spellStart"/>
+      <w:proofErr w:type="gramStart"/>
+      <w:r>
+        <w:rPr>
+          <w:b/>
+        </w:rPr>
+        <w:t>dhs.different</w:t>
+      </w:r>
+      <w:proofErr w:type="gramEnd"/>
+      <w:r>
+        <w:rPr>
+          <w:b/>
+        </w:rPr>
+        <w:t>_court_location</w:t>
+      </w:r>
+      <w:proofErr w:type="spellEnd"/>
+      <w:r>
+        <w:rPr>
+          <w:b/>
+        </w:rPr>
+        <w:t xml:space="preserve"> %}{{ </w:t>
       </w:r>
       <w:proofErr w:type="spellStart"/>
       <w:r>
@@ -199,26 +179,6 @@
         </w:rPr>
         <w:t>(</w:t>
       </w:r>
-      <w:r>
-        <w:rPr>
-          <w:b/>
-        </w:rPr>
-        <w:t>users[</w:t>
-      </w:r>
-      <w:proofErr w:type="spellStart"/>
-      <w:r>
-        <w:rPr>
-          <w:b/>
-        </w:rPr>
-        <w:t>i</w:t>
-      </w:r>
-      <w:proofErr w:type="spellEnd"/>
-      <w:r>
-        <w:rPr>
-          <w:b/>
-        </w:rPr>
-        <w:t>].</w:t>
-      </w:r>
       <w:proofErr w:type="spellStart"/>
       <w:r>
         <w:rPr>
@@ -243,21 +203,7 @@
         <w:rPr>
           <w:b/>
         </w:rPr>
-        <w:t>upper }}{% else %}{{ users[</w:t>
-      </w:r>
-      <w:proofErr w:type="spellStart"/>
-      <w:r>
-        <w:rPr>
-          <w:b/>
-        </w:rPr>
-        <w:t>i</w:t>
-      </w:r>
-      <w:proofErr w:type="spellEnd"/>
-      <w:r>
-        <w:rPr>
-          <w:b/>
-        </w:rPr>
-        <w:t>].</w:t>
+        <w:t xml:space="preserve">upper }}{% else %}{{ </w:t>
       </w:r>
       <w:proofErr w:type="spellStart"/>
       <w:r>
@@ -295,26 +241,6 @@
           <w:b/>
         </w:rPr>
         <w:t>(</w:t>
-      </w:r>
-      <w:r>
-        <w:rPr>
-          <w:b/>
-        </w:rPr>
-        <w:t>users[</w:t>
-      </w:r>
-      <w:proofErr w:type="spellStart"/>
-      <w:r>
-        <w:rPr>
-          <w:b/>
-        </w:rPr>
-        <w:t>i</w:t>
-      </w:r>
-      <w:proofErr w:type="spellEnd"/>
-      <w:r>
-        <w:rPr>
-          <w:b/>
-        </w:rPr>
-        <w:t>].</w:t>
       </w:r>
       <w:proofErr w:type="spellStart"/>
       <w:r>
@@ -406,6 +332,7 @@
         </w:rPr>
         <w:t xml:space="preserve"> of:</w:t>
       </w:r>
+      <w:proofErr w:type="gramStart"/>
       <w:r>
         <w:tab/>
       </w:r>
@@ -415,6 +342,7 @@
       <w:r>
         <w:t>)</w:t>
       </w:r>
+      <w:proofErr w:type="gramEnd"/>
       <w:r>
         <w:rPr>
           <w:bCs/>
@@ -520,6 +448,7 @@
           <w:bCs/>
         </w:rPr>
       </w:pPr>
+      <w:proofErr w:type="gramStart"/>
       <w:r>
         <w:rPr>
           <w:bCs/>
@@ -531,7 +460,14 @@
         <w:rPr>
           <w:bCs/>
         </w:rPr>
-        <w:t>motion_users</w:t>
+        <w:t>motion</w:t>
+      </w:r>
+      <w:proofErr w:type="gramEnd"/>
+      <w:r>
+        <w:rPr>
+          <w:bCs/>
+        </w:rPr>
+        <w:t>_users</w:t>
       </w:r>
       <w:proofErr w:type="spellEnd"/>
       <w:r>
@@ -644,13 +580,7 @@
         <w:rPr>
           <w:bCs/>
         </w:rPr>
-        <w:t>[</w:t>
-      </w:r>
-      <w:r>
-        <w:rPr>
-          <w:bCs/>
-        </w:rPr>
-        <w:t>0</w:t>
+        <w:t>[0</w:t>
       </w:r>
       <w:r>
         <w:rPr>
@@ -795,6 +725,7 @@
         </w:rPr>
         <w:t>x.</w:t>
       </w:r>
+      <w:proofErr w:type="gramStart"/>
       <w:r>
         <w:rPr>
           <w:bCs/>
@@ -802,6 +733,7 @@
         <w:t>name.lastfirst</w:t>
       </w:r>
       <w:proofErr w:type="spellEnd"/>
+      <w:proofErr w:type="gramEnd"/>
       <w:r>
         <w:rPr>
           <w:bCs/>
@@ -1016,44 +948,24 @@
           <w:tab w:val="left" w:pos="5220"/>
         </w:tabs>
       </w:pPr>
+      <w:proofErr w:type="gramStart"/>
       <w:r>
         <w:t>{</w:t>
       </w:r>
       <w:r>
         <w:t xml:space="preserve">{ </w:t>
       </w:r>
-      <w:r>
-        <w:t>users[</w:t>
-      </w:r>
-      <w:proofErr w:type="spellStart"/>
-      <w:r>
-        <w:t>i</w:t>
-      </w:r>
-      <w:proofErr w:type="spellEnd"/>
-      <w:r>
-        <w:t>].</w:t>
-      </w:r>
-      <w:proofErr w:type="spellStart"/>
-      <w:r>
-        <w:t>immigration_judge</w:t>
-      </w:r>
-      <w:proofErr w:type="spellEnd"/>
-      <w:r>
-        <w:t>.</w:t>
-      </w:r>
-      <w:r>
-        <w:rPr>
-          <w:bCs/>
-        </w:rPr>
-        <w:t xml:space="preserve"> </w:t>
-      </w:r>
-      <w:proofErr w:type="spellStart"/>
+      <w:proofErr w:type="spellStart"/>
+      <w:r>
+        <w:t>immigration_judge.</w:t>
+      </w:r>
       <w:r>
         <w:rPr>
           <w:bCs/>
         </w:rPr>
         <w:t>name</w:t>
       </w:r>
+      <w:proofErr w:type="gramEnd"/>
       <w:r>
         <w:rPr>
           <w:bCs/>
@@ -1099,17 +1011,6 @@
       </w:r>
       <w:r>
         <w:t xml:space="preserve">{ </w:t>
-      </w:r>
-      <w:r>
-        <w:t>users[</w:t>
-      </w:r>
-      <w:proofErr w:type="spellStart"/>
-      <w:r>
-        <w:t>i</w:t>
-      </w:r>
-      <w:proofErr w:type="spellEnd"/>
-      <w:r>
-        <w:t>].</w:t>
       </w:r>
       <w:proofErr w:type="spellStart"/>
       <w:r>
@@ -1313,49 +1214,29 @@
         <w:rPr>
           <w:b/>
         </w:rPr>
-        <w:t>{% if users[</w:t>
-      </w:r>
-      <w:proofErr w:type="spellStart"/>
-      <w:r>
-        <w:rPr>
-          <w:b/>
-        </w:rPr>
-        <w:t>i</w:t>
-      </w:r>
-      <w:proofErr w:type="spellEnd"/>
-      <w:r>
-        <w:rPr>
-          <w:b/>
-        </w:rPr>
-        <w:t>].</w:t>
-      </w:r>
-      <w:proofErr w:type="spellStart"/>
-      <w:r>
-        <w:rPr>
-          <w:b/>
-        </w:rPr>
-        <w:t>dhs.different_court_location</w:t>
-      </w:r>
-      <w:proofErr w:type="spellEnd"/>
-      <w:r>
-        <w:rPr>
-          <w:b/>
-        </w:rPr>
-        <w:t xml:space="preserve"> %}{{ users[</w:t>
-      </w:r>
-      <w:proofErr w:type="spellStart"/>
-      <w:r>
-        <w:rPr>
-          <w:b/>
-        </w:rPr>
-        <w:t>i</w:t>
-      </w:r>
-      <w:proofErr w:type="spellEnd"/>
-      <w:r>
-        <w:rPr>
-          <w:b/>
-        </w:rPr>
-        <w:t>].</w:t>
+        <w:t xml:space="preserve">{% if </w:t>
+      </w:r>
+      <w:proofErr w:type="spellStart"/>
+      <w:proofErr w:type="gramStart"/>
+      <w:r>
+        <w:rPr>
+          <w:b/>
+        </w:rPr>
+        <w:t>dhs.different</w:t>
+      </w:r>
+      <w:proofErr w:type="gramEnd"/>
+      <w:r>
+        <w:rPr>
+          <w:b/>
+        </w:rPr>
+        <w:t>_court_location</w:t>
+      </w:r>
+      <w:proofErr w:type="spellEnd"/>
+      <w:r>
+        <w:rPr>
+          <w:b/>
+        </w:rPr>
+        <w:t xml:space="preserve"> %}{{ </w:t>
       </w:r>
       <w:proofErr w:type="spellStart"/>
       <w:r>
@@ -1391,26 +1272,6 @@
         </w:rPr>
         <w:t>(</w:t>
       </w:r>
-      <w:r>
-        <w:rPr>
-          <w:b/>
-        </w:rPr>
-        <w:t>users[</w:t>
-      </w:r>
-      <w:proofErr w:type="spellStart"/>
-      <w:r>
-        <w:rPr>
-          <w:b/>
-        </w:rPr>
-        <w:t>i</w:t>
-      </w:r>
-      <w:proofErr w:type="spellEnd"/>
-      <w:r>
-        <w:rPr>
-          <w:b/>
-        </w:rPr>
-        <w:t>].</w:t>
-      </w:r>
       <w:proofErr w:type="spellStart"/>
       <w:r>
         <w:rPr>
@@ -1429,21 +1290,7 @@
         <w:rPr>
           <w:b/>
         </w:rPr>
-        <w:t>upper }}{% else %}{{ users[</w:t>
-      </w:r>
-      <w:proofErr w:type="spellStart"/>
-      <w:r>
-        <w:rPr>
-          <w:b/>
-        </w:rPr>
-        <w:t>i</w:t>
-      </w:r>
-      <w:proofErr w:type="spellEnd"/>
-      <w:r>
-        <w:rPr>
-          <w:b/>
-        </w:rPr>
-        <w:t>].</w:t>
+        <w:t xml:space="preserve">upper }}{% else %}{{ </w:t>
       </w:r>
       <w:proofErr w:type="spellStart"/>
       <w:r>
@@ -1481,26 +1328,6 @@
           <w:b/>
         </w:rPr>
         <w:t>(</w:t>
-      </w:r>
-      <w:r>
-        <w:rPr>
-          <w:b/>
-        </w:rPr>
-        <w:t>users[</w:t>
-      </w:r>
-      <w:proofErr w:type="spellStart"/>
-      <w:r>
-        <w:rPr>
-          <w:b/>
-        </w:rPr>
-        <w:t>i</w:t>
-      </w:r>
-      <w:proofErr w:type="spellEnd"/>
-      <w:r>
-        <w:rPr>
-          <w:b/>
-        </w:rPr>
-        <w:t>].</w:t>
       </w:r>
       <w:proofErr w:type="spellStart"/>
       <w:r>
@@ -1542,16 +1369,28 @@
         <w:rPr>
           <w:bCs/>
         </w:rPr>
-        <w:t>{{ users[</w:t>
-      </w:r>
-      <w:proofErr w:type="spellStart"/>
-      <w:r>
-        <w:rPr>
-          <w:bCs/>
-        </w:rPr>
-        <w:t>i</w:t>
-      </w:r>
-      <w:proofErr w:type="spellEnd"/>
+        <w:t xml:space="preserve">{{ </w:t>
+      </w:r>
+      <w:proofErr w:type="spellStart"/>
+      <w:r>
+        <w:rPr>
+          <w:bCs/>
+        </w:rPr>
+        <w:t>motion_users</w:t>
+      </w:r>
+      <w:proofErr w:type="spellEnd"/>
+      <w:r>
+        <w:rPr>
+          <w:bCs/>
+        </w:rPr>
+        <w:t>[</w:t>
+      </w:r>
+      <w:r>
+        <w:rPr>
+          <w:bCs/>
+        </w:rPr>
+        <w:t>0</w:t>
+      </w:r>
       <w:r>
         <w:rPr>
           <w:bCs/>
@@ -1615,21 +1454,7 @@
         <w:rPr>
           <w:bCs/>
         </w:rPr>
-        <w:t>{% if users[</w:t>
-      </w:r>
-      <w:proofErr w:type="spellStart"/>
-      <w:r>
-        <w:rPr>
-          <w:bCs/>
-        </w:rPr>
-        <w:t>i</w:t>
-      </w:r>
-      <w:proofErr w:type="spellEnd"/>
-      <w:r>
-        <w:rPr>
-          <w:bCs/>
-        </w:rPr>
-        <w:t>].</w:t>
+        <w:t xml:space="preserve">{% if </w:t>
       </w:r>
       <w:proofErr w:type="spellStart"/>
       <w:r>
@@ -1657,26 +1482,6 @@
         </w:rPr>
         <w:t xml:space="preserve"> </w:t>
       </w:r>
-      <w:r>
-        <w:rPr>
-          <w:bCs/>
-        </w:rPr>
-        <w:t>users[</w:t>
-      </w:r>
-      <w:proofErr w:type="spellStart"/>
-      <w:r>
-        <w:rPr>
-          <w:bCs/>
-        </w:rPr>
-        <w:t>i</w:t>
-      </w:r>
-      <w:proofErr w:type="spellEnd"/>
-      <w:r>
-        <w:rPr>
-          <w:bCs/>
-        </w:rPr>
-        <w:t>].</w:t>
-      </w:r>
       <w:proofErr w:type="spellStart"/>
       <w:r>
         <w:rPr>
@@ -1715,26 +1520,6 @@
         </w:rPr>
         <w:t xml:space="preserve">{{ </w:t>
       </w:r>
-      <w:r>
-        <w:rPr>
-          <w:bCs/>
-        </w:rPr>
-        <w:t>users[</w:t>
-      </w:r>
-      <w:proofErr w:type="spellStart"/>
-      <w:r>
-        <w:rPr>
-          <w:bCs/>
-        </w:rPr>
-        <w:t>i</w:t>
-      </w:r>
-      <w:proofErr w:type="spellEnd"/>
-      <w:r>
-        <w:rPr>
-          <w:bCs/>
-        </w:rPr>
-        <w:t>].</w:t>
-      </w:r>
       <w:proofErr w:type="spellStart"/>
       <w:r>
         <w:rPr>
@@ -1773,26 +1558,6 @@
         </w:rPr>
         <w:t xml:space="preserve"> </w:t>
       </w:r>
-      <w:r>
-        <w:rPr>
-          <w:bCs/>
-        </w:rPr>
-        <w:t>users[</w:t>
-      </w:r>
-      <w:proofErr w:type="spellStart"/>
-      <w:r>
-        <w:rPr>
-          <w:bCs/>
-        </w:rPr>
-        <w:t>i</w:t>
-      </w:r>
-      <w:proofErr w:type="spellEnd"/>
-      <w:r>
-        <w:rPr>
-          <w:bCs/>
-        </w:rPr>
-        <w:t>].</w:t>
-      </w:r>
       <w:proofErr w:type="spellStart"/>
       <w:r>
         <w:rPr>
@@ -1836,26 +1601,6 @@
           <w:bCs/>
         </w:rPr>
         <w:t xml:space="preserve">{{ </w:t>
-      </w:r>
-      <w:r>
-        <w:rPr>
-          <w:bCs/>
-        </w:rPr>
-        <w:t>users[</w:t>
-      </w:r>
-      <w:proofErr w:type="spellStart"/>
-      <w:r>
-        <w:rPr>
-          <w:bCs/>
-        </w:rPr>
-        <w:t>i</w:t>
-      </w:r>
-      <w:proofErr w:type="spellEnd"/>
-      <w:r>
-        <w:rPr>
-          <w:bCs/>
-        </w:rPr>
-        <w:t>].</w:t>
       </w:r>
       <w:proofErr w:type="spellStart"/>
       <w:r>
@@ -1922,20 +1667,40 @@
       <w:r>
         <w:t xml:space="preserve">I currently reside at </w:t>
       </w:r>
-      <w:r>
-        <w:rPr>
-          <w:bCs/>
-        </w:rPr>
-        <w:t>{{ users[</w:t>
-      </w:r>
-      <w:proofErr w:type="spellStart"/>
-      <w:r>
-        <w:rPr>
-          <w:bCs/>
-        </w:rPr>
-        <w:t>i</w:t>
-      </w:r>
-      <w:proofErr w:type="spellEnd"/>
+      <w:proofErr w:type="gramStart"/>
+      <w:r>
+        <w:rPr>
+          <w:bCs/>
+        </w:rPr>
+        <w:t xml:space="preserve">{{ </w:t>
+      </w:r>
+      <w:proofErr w:type="spellStart"/>
+      <w:r>
+        <w:rPr>
+          <w:bCs/>
+        </w:rPr>
+        <w:t>motion</w:t>
+      </w:r>
+      <w:proofErr w:type="gramEnd"/>
+      <w:r>
+        <w:rPr>
+          <w:bCs/>
+        </w:rPr>
+        <w:t>_users</w:t>
+      </w:r>
+      <w:proofErr w:type="spellEnd"/>
+      <w:r>
+        <w:rPr>
+          <w:bCs/>
+        </w:rPr>
+        <w:t>[</w:t>
+      </w:r>
+      <w:r>
+        <w:rPr>
+          <w:bCs/>
+        </w:rPr>
+        <w:t>0</w:t>
+      </w:r>
       <w:r>
         <w:rPr>
           <w:bCs/>
@@ -1965,14 +1730,34 @@
       <w:r>
         <w:t xml:space="preserve">. I have been in the United States since </w:t>
       </w:r>
-      <w:r>
-        <w:t>{{ users[</w:t>
-      </w:r>
-      <w:proofErr w:type="spellStart"/>
-      <w:r>
-        <w:t>i</w:t>
-      </w:r>
-      <w:proofErr w:type="spellEnd"/>
+      <w:proofErr w:type="gramStart"/>
+      <w:r>
+        <w:t xml:space="preserve">{{ </w:t>
+      </w:r>
+      <w:proofErr w:type="spellStart"/>
+      <w:r>
+        <w:rPr>
+          <w:bCs/>
+        </w:rPr>
+        <w:t>motion</w:t>
+      </w:r>
+      <w:proofErr w:type="gramEnd"/>
+      <w:r>
+        <w:rPr>
+          <w:bCs/>
+        </w:rPr>
+        <w:t>_users</w:t>
+      </w:r>
+      <w:proofErr w:type="spellEnd"/>
+      <w:r>
+        <w:t xml:space="preserve"> </w:t>
+      </w:r>
+      <w:r>
+        <w:t>[</w:t>
+      </w:r>
+      <w:r>
+        <w:t>0</w:t>
+      </w:r>
       <w:r>
         <w:t>].</w:t>
       </w:r>
@@ -2001,20 +1786,29 @@
       <w:r>
         <w:t xml:space="preserve">{{ </w:t>
       </w:r>
-      <w:r>
-        <w:t>users[</w:t>
-      </w:r>
-      <w:proofErr w:type="spellStart"/>
-      <w:r>
-        <w:t>i</w:t>
-      </w:r>
-      <w:proofErr w:type="spellEnd"/>
+      <w:proofErr w:type="spellStart"/>
+      <w:r>
+        <w:t>motion_users</w:t>
+      </w:r>
+      <w:proofErr w:type="spellEnd"/>
+      <w:r>
+        <w:t>[</w:t>
+      </w:r>
+      <w:r>
+        <w:t>0</w:t>
+      </w:r>
       <w:r>
         <w:t>].</w:t>
       </w:r>
       <w:proofErr w:type="spellStart"/>
       <w:r>
-        <w:t>previous.date</w:t>
+        <w:t>previous</w:t>
+      </w:r>
+      <w:r>
+        <w:t>_address</w:t>
+      </w:r>
+      <w:r>
+        <w:t>.date</w:t>
       </w:r>
       <w:r>
         <w:t>.format</w:t>
@@ -2051,23 +1845,10 @@
         <w:rPr>
           <w:bCs/>
         </w:rPr>
-        <w:t>{% if users[</w:t>
-      </w:r>
-      <w:proofErr w:type="spellStart"/>
-      <w:r>
-        <w:rPr>
-          <w:bCs/>
-        </w:rPr>
-        <w:t>i</w:t>
-      </w:r>
-      <w:proofErr w:type="spellEnd"/>
-      <w:r>
-        <w:rPr>
-          <w:bCs/>
-        </w:rPr>
-        <w:t>].</w:t>
-      </w:r>
-      <w:proofErr w:type="spellStart"/>
+        <w:t xml:space="preserve">{% if </w:t>
+      </w:r>
+      <w:proofErr w:type="spellStart"/>
+      <w:proofErr w:type="gramStart"/>
       <w:r>
         <w:rPr>
           <w:bCs/>
@@ -2078,7 +1859,14 @@
         <w:rPr>
           <w:bCs/>
         </w:rPr>
-        <w:t>different_court_location</w:t>
+        <w:t>different</w:t>
+      </w:r>
+      <w:proofErr w:type="gramEnd"/>
+      <w:r>
+        <w:rPr>
+          <w:bCs/>
+        </w:rPr>
+        <w:t>_court_location</w:t>
       </w:r>
       <w:proofErr w:type="spellEnd"/>
       <w:r>
@@ -2093,26 +1881,6 @@
         </w:rPr>
         <w:t xml:space="preserve"> </w:t>
       </w:r>
-      <w:r>
-        <w:rPr>
-          <w:bCs/>
-        </w:rPr>
-        <w:t>users[</w:t>
-      </w:r>
-      <w:proofErr w:type="spellStart"/>
-      <w:r>
-        <w:rPr>
-          <w:bCs/>
-        </w:rPr>
-        <w:t>i</w:t>
-      </w:r>
-      <w:proofErr w:type="spellEnd"/>
-      <w:r>
-        <w:rPr>
-          <w:bCs/>
-        </w:rPr>
-        <w:t>].</w:t>
-      </w:r>
       <w:proofErr w:type="spellStart"/>
       <w:r>
         <w:rPr>
@@ -2151,26 +1919,6 @@
         </w:rPr>
         <w:t xml:space="preserve">{{ </w:t>
       </w:r>
-      <w:r>
-        <w:rPr>
-          <w:bCs/>
-        </w:rPr>
-        <w:t>users[</w:t>
-      </w:r>
-      <w:proofErr w:type="spellStart"/>
-      <w:r>
-        <w:rPr>
-          <w:bCs/>
-        </w:rPr>
-        <w:t>i</w:t>
-      </w:r>
-      <w:proofErr w:type="spellEnd"/>
-      <w:r>
-        <w:rPr>
-          <w:bCs/>
-        </w:rPr>
-        <w:t>].</w:t>
-      </w:r>
       <w:proofErr w:type="spellStart"/>
       <w:r>
         <w:rPr>
@@ -2209,26 +1957,6 @@
         </w:rPr>
         <w:t xml:space="preserve"> </w:t>
       </w:r>
-      <w:r>
-        <w:rPr>
-          <w:bCs/>
-        </w:rPr>
-        <w:t>users[</w:t>
-      </w:r>
-      <w:proofErr w:type="spellStart"/>
-      <w:r>
-        <w:rPr>
-          <w:bCs/>
-        </w:rPr>
-        <w:t>i</w:t>
-      </w:r>
-      <w:proofErr w:type="spellEnd"/>
-      <w:r>
-        <w:rPr>
-          <w:bCs/>
-        </w:rPr>
-        <w:t>].</w:t>
-      </w:r>
       <w:proofErr w:type="spellStart"/>
       <w:r>
         <w:rPr>
@@ -2272,26 +2000,6 @@
           <w:bCs/>
         </w:rPr>
         <w:t xml:space="preserve">{{ </w:t>
-      </w:r>
-      <w:r>
-        <w:rPr>
-          <w:bCs/>
-        </w:rPr>
-        <w:t>users[</w:t>
-      </w:r>
-      <w:proofErr w:type="spellStart"/>
-      <w:r>
-        <w:rPr>
-          <w:bCs/>
-        </w:rPr>
-        <w:t>i</w:t>
-      </w:r>
-      <w:proofErr w:type="spellEnd"/>
-      <w:r>
-        <w:rPr>
-          <w:bCs/>
-        </w:rPr>
-        <w:t>].</w:t>
       </w:r>
       <w:proofErr w:type="spellStart"/>
       <w:r>
@@ -2361,11 +2069,16 @@
       <w:r>
         <w:t xml:space="preserve">As of today, </w:t>
       </w:r>
+      <w:proofErr w:type="gramStart"/>
       <w:r>
         <w:t>{{</w:t>
       </w:r>
       <w:r>
-        <w:t xml:space="preserve"> today()</w:t>
+        <w:t xml:space="preserve"> today</w:t>
+      </w:r>
+      <w:proofErr w:type="gramEnd"/>
+      <w:r>
+        <w:t>()</w:t>
       </w:r>
       <w:r>
         <w:t>.format('MM/dd/</w:t>
@@ -2408,20 +2121,37 @@
         </w:rPr>
         <w:t xml:space="preserve"> </w:t>
       </w:r>
+      <w:proofErr w:type="gramStart"/>
       <w:r>
         <w:t>{</w:t>
       </w:r>
       <w:r>
         <w:t xml:space="preserve">{ </w:t>
       </w:r>
-      <w:r>
-        <w:t>users[</w:t>
-      </w:r>
-      <w:proofErr w:type="spellStart"/>
-      <w:r>
-        <w:t>i</w:t>
-      </w:r>
-      <w:proofErr w:type="spellEnd"/>
+      <w:proofErr w:type="spellStart"/>
+      <w:r>
+        <w:rPr>
+          <w:bCs/>
+        </w:rPr>
+        <w:t>motion</w:t>
+      </w:r>
+      <w:proofErr w:type="gramEnd"/>
+      <w:r>
+        <w:rPr>
+          <w:bCs/>
+        </w:rPr>
+        <w:t>_users</w:t>
+      </w:r>
+      <w:proofErr w:type="spellEnd"/>
+      <w:r>
+        <w:t xml:space="preserve"> </w:t>
+      </w:r>
+      <w:r>
+        <w:t>[</w:t>
+      </w:r>
+      <w:r>
+        <w:t>0</w:t>
+      </w:r>
       <w:r>
         <w:t>].</w:t>
       </w:r>
@@ -2520,26 +2250,40 @@
       <w:r>
         <w:t xml:space="preserve"> </w:t>
       </w:r>
+      <w:proofErr w:type="gramStart"/>
       <w:r>
         <w:rPr>
           <w:bCs/>
         </w:rPr>
         <w:t xml:space="preserve">{{ </w:t>
       </w:r>
-      <w:r>
-        <w:rPr>
-          <w:bCs/>
-        </w:rPr>
-        <w:t>users[</w:t>
-      </w:r>
-      <w:proofErr w:type="spellStart"/>
-      <w:r>
-        <w:rPr>
-          <w:bCs/>
-        </w:rPr>
-        <w:t>i</w:t>
-      </w:r>
-      <w:proofErr w:type="spellEnd"/>
+      <w:proofErr w:type="spellStart"/>
+      <w:r>
+        <w:rPr>
+          <w:bCs/>
+        </w:rPr>
+        <w:t>motion</w:t>
+      </w:r>
+      <w:proofErr w:type="gramEnd"/>
+      <w:r>
+        <w:rPr>
+          <w:bCs/>
+        </w:rPr>
+        <w:t>_users</w:t>
+      </w:r>
+      <w:proofErr w:type="spellEnd"/>
+      <w:r>
+        <w:rPr>
+          <w:bCs/>
+        </w:rPr>
+        <w:t>[</w:t>
+      </w:r>
+      <w:r>
+        <w:rPr>
+          <w:bCs/>
+        </w:rPr>
+        <w:t>0</w:t>
+      </w:r>
       <w:r>
         <w:rPr>
           <w:bCs/>
@@ -2583,7 +2327,6 @@
     </w:p>
     <w:p>
       <w:r>
-        <w:lastRenderedPageBreak/>
         <w:t>Respectfully submitted,</w:t>
       </w:r>
       <w:r>
@@ -2720,49 +2463,29 @@
         <w:rPr>
           <w:b/>
         </w:rPr>
-        <w:t>{% if users[</w:t>
-      </w:r>
-      <w:proofErr w:type="spellStart"/>
-      <w:r>
-        <w:rPr>
-          <w:b/>
-        </w:rPr>
-        <w:t>i</w:t>
-      </w:r>
-      <w:proofErr w:type="spellEnd"/>
-      <w:r>
-        <w:rPr>
-          <w:b/>
-        </w:rPr>
-        <w:t>].</w:t>
-      </w:r>
-      <w:proofErr w:type="spellStart"/>
-      <w:r>
-        <w:rPr>
-          <w:b/>
-        </w:rPr>
-        <w:t>dhs.different_court_location</w:t>
-      </w:r>
-      <w:proofErr w:type="spellEnd"/>
-      <w:r>
-        <w:rPr>
-          <w:b/>
-        </w:rPr>
-        <w:t xml:space="preserve"> %}{{ users[</w:t>
-      </w:r>
-      <w:proofErr w:type="spellStart"/>
-      <w:r>
-        <w:rPr>
-          <w:b/>
-        </w:rPr>
-        <w:t>i</w:t>
-      </w:r>
-      <w:proofErr w:type="spellEnd"/>
-      <w:r>
-        <w:rPr>
-          <w:b/>
-        </w:rPr>
-        <w:t>].</w:t>
+        <w:t xml:space="preserve">{% if </w:t>
+      </w:r>
+      <w:proofErr w:type="spellStart"/>
+      <w:proofErr w:type="gramStart"/>
+      <w:r>
+        <w:rPr>
+          <w:b/>
+        </w:rPr>
+        <w:t>dhs.different</w:t>
+      </w:r>
+      <w:proofErr w:type="gramEnd"/>
+      <w:r>
+        <w:rPr>
+          <w:b/>
+        </w:rPr>
+        <w:t>_court_location</w:t>
+      </w:r>
+      <w:proofErr w:type="spellEnd"/>
+      <w:r>
+        <w:rPr>
+          <w:b/>
+        </w:rPr>
+        <w:t xml:space="preserve"> %}{{ </w:t>
       </w:r>
       <w:proofErr w:type="spellStart"/>
       <w:r>
@@ -2798,26 +2521,6 @@
         </w:rPr>
         <w:t>(</w:t>
       </w:r>
-      <w:r>
-        <w:rPr>
-          <w:b/>
-        </w:rPr>
-        <w:t>users[</w:t>
-      </w:r>
-      <w:proofErr w:type="spellStart"/>
-      <w:r>
-        <w:rPr>
-          <w:b/>
-        </w:rPr>
-        <w:t>i</w:t>
-      </w:r>
-      <w:proofErr w:type="spellEnd"/>
-      <w:r>
-        <w:rPr>
-          <w:b/>
-        </w:rPr>
-        <w:t>].</w:t>
-      </w:r>
       <w:proofErr w:type="spellStart"/>
       <w:r>
         <w:rPr>
@@ -2836,21 +2539,7 @@
         <w:rPr>
           <w:b/>
         </w:rPr>
-        <w:t>upper }}{% else %}{{ users[</w:t>
-      </w:r>
-      <w:proofErr w:type="spellStart"/>
-      <w:r>
-        <w:rPr>
-          <w:b/>
-        </w:rPr>
-        <w:t>i</w:t>
-      </w:r>
-      <w:proofErr w:type="spellEnd"/>
-      <w:r>
-        <w:rPr>
-          <w:b/>
-        </w:rPr>
-        <w:t>].</w:t>
+        <w:t xml:space="preserve">upper }}{% else %}{{ </w:t>
       </w:r>
       <w:proofErr w:type="spellStart"/>
       <w:r>
@@ -2888,26 +2577,6 @@
           <w:b/>
         </w:rPr>
         <w:t>(</w:t>
-      </w:r>
-      <w:r>
-        <w:rPr>
-          <w:b/>
-        </w:rPr>
-        <w:t>users[</w:t>
-      </w:r>
-      <w:proofErr w:type="spellStart"/>
-      <w:r>
-        <w:rPr>
-          <w:b/>
-        </w:rPr>
-        <w:t>i</w:t>
-      </w:r>
-      <w:proofErr w:type="spellEnd"/>
-      <w:r>
-        <w:rPr>
-          <w:b/>
-        </w:rPr>
-        <w:t>].</w:t>
       </w:r>
       <w:proofErr w:type="spellStart"/>
       <w:r>
@@ -3023,6 +2692,7 @@
           <w:bCs/>
         </w:rPr>
       </w:pPr>
+      <w:proofErr w:type="gramStart"/>
       <w:r>
         <w:rPr>
           <w:bCs/>
@@ -3034,7 +2704,14 @@
         <w:rPr>
           <w:bCs/>
         </w:rPr>
-        <w:t>motion_users</w:t>
+        <w:t>motion</w:t>
+      </w:r>
+      <w:proofErr w:type="gramEnd"/>
+      <w:r>
+        <w:rPr>
+          <w:bCs/>
+        </w:rPr>
+        <w:t>_users</w:t>
       </w:r>
       <w:proofErr w:type="spellEnd"/>
       <w:r>
@@ -3272,9 +2949,17 @@
         <w:rPr>
           <w:bCs/>
         </w:rPr>
-        <w:t>x.name.lastfirst</w:t>
-      </w:r>
-      <w:proofErr w:type="spellEnd"/>
+        <w:t>x.</w:t>
+      </w:r>
+      <w:proofErr w:type="gramStart"/>
+      <w:r>
+        <w:rPr>
+          <w:bCs/>
+        </w:rPr>
+        <w:t>name.lastfirst</w:t>
+      </w:r>
+      <w:proofErr w:type="spellEnd"/>
+      <w:proofErr w:type="gramEnd"/>
       <w:r>
         <w:rPr>
           <w:bCs/>
@@ -3541,12 +3226,17 @@
         </w:rPr>
         <w:t xml:space="preserve"> </w:t>
       </w:r>
+      <w:proofErr w:type="gramStart"/>
       <w:r>
         <w:t xml:space="preserve">{{ </w:t>
       </w:r>
       <w:proofErr w:type="spellStart"/>
       <w:r>
-        <w:t>output_checkbox</w:t>
+        <w:t>output</w:t>
+      </w:r>
+      <w:proofErr w:type="gramEnd"/>
+      <w:r>
+        <w:t>_checkbox</w:t>
       </w:r>
       <w:proofErr w:type="spellEnd"/>
       <w:r>
@@ -3630,12 +3320,17 @@
           <w:rFonts w:eastAsia="Calibri"/>
         </w:rPr>
       </w:pPr>
+      <w:proofErr w:type="gramStart"/>
       <w:r>
         <w:t xml:space="preserve">{{ </w:t>
       </w:r>
       <w:proofErr w:type="spellStart"/>
       <w:r>
-        <w:t>output_checkbox</w:t>
+        <w:t>output</w:t>
+      </w:r>
+      <w:proofErr w:type="gramEnd"/>
+      <w:r>
+        <w:t>_checkbox</w:t>
       </w:r>
       <w:proofErr w:type="spellEnd"/>
       <w:r>
@@ -3661,12 +3356,17 @@
           <w:rFonts w:eastAsia="Calibri"/>
         </w:rPr>
       </w:pPr>
+      <w:proofErr w:type="gramStart"/>
       <w:r>
         <w:t xml:space="preserve">{{ </w:t>
       </w:r>
       <w:proofErr w:type="spellStart"/>
       <w:r>
-        <w:t>output_checkbox</w:t>
+        <w:t>output</w:t>
+      </w:r>
+      <w:proofErr w:type="gramEnd"/>
+      <w:r>
+        <w:t>_checkbox</w:t>
       </w:r>
       <w:proofErr w:type="spellEnd"/>
       <w:r>
@@ -3692,12 +3392,17 @@
           <w:rFonts w:eastAsia="Calibri"/>
         </w:rPr>
       </w:pPr>
+      <w:proofErr w:type="gramStart"/>
       <w:r>
         <w:t xml:space="preserve">{{ </w:t>
       </w:r>
       <w:proofErr w:type="spellStart"/>
       <w:r>
-        <w:t>output_checkbox</w:t>
+        <w:t>output</w:t>
+      </w:r>
+      <w:proofErr w:type="gramEnd"/>
+      <w:r>
+        <w:t>_checkbox</w:t>
       </w:r>
       <w:proofErr w:type="spellEnd"/>
       <w:r>
@@ -3723,12 +3428,17 @@
           <w:rFonts w:eastAsia="Calibri"/>
         </w:rPr>
       </w:pPr>
+      <w:proofErr w:type="gramStart"/>
       <w:r>
         <w:t xml:space="preserve">{{ </w:t>
       </w:r>
       <w:proofErr w:type="spellStart"/>
       <w:r>
-        <w:t>output_checkbox</w:t>
+        <w:t>output</w:t>
+      </w:r>
+      <w:proofErr w:type="gramEnd"/>
+      <w:r>
+        <w:t>_checkbox</w:t>
       </w:r>
       <w:proofErr w:type="spellEnd"/>
       <w:r>
@@ -3754,12 +3464,17 @@
           <w:rFonts w:eastAsia="Calibri"/>
         </w:rPr>
       </w:pPr>
+      <w:proofErr w:type="gramStart"/>
       <w:r>
         <w:t xml:space="preserve">{{ </w:t>
       </w:r>
       <w:proofErr w:type="spellStart"/>
       <w:r>
-        <w:t>output_checkbox</w:t>
+        <w:t>output</w:t>
+      </w:r>
+      <w:proofErr w:type="gramEnd"/>
+      <w:r>
+        <w:t>_checkbox</w:t>
       </w:r>
       <w:proofErr w:type="spellEnd"/>
       <w:r>
@@ -3785,12 +3500,17 @@
           <w:rFonts w:eastAsia="Calibri"/>
         </w:rPr>
       </w:pPr>
+      <w:proofErr w:type="gramStart"/>
       <w:r>
         <w:t xml:space="preserve">{{ </w:t>
       </w:r>
       <w:proofErr w:type="spellStart"/>
       <w:r>
-        <w:t>output_checkbox</w:t>
+        <w:t>output</w:t>
+      </w:r>
+      <w:proofErr w:type="gramEnd"/>
+      <w:r>
+        <w:t>_checkbox</w:t>
       </w:r>
       <w:proofErr w:type="spellEnd"/>
       <w:r>
@@ -3816,12 +3536,17 @@
           <w:rFonts w:eastAsia="Calibri"/>
         </w:rPr>
       </w:pPr>
+      <w:proofErr w:type="gramStart"/>
       <w:r>
         <w:t xml:space="preserve">{{ </w:t>
       </w:r>
       <w:proofErr w:type="spellStart"/>
       <w:r>
-        <w:t>output_checkbox</w:t>
+        <w:t>output</w:t>
+      </w:r>
+      <w:proofErr w:type="gramEnd"/>
+      <w:r>
+        <w:t>_checkbox</w:t>
       </w:r>
       <w:proofErr w:type="spellEnd"/>
       <w:r>
@@ -3884,12 +3609,17 @@
           <w:rFonts w:eastAsia="Calibri"/>
         </w:rPr>
       </w:pPr>
+      <w:proofErr w:type="gramStart"/>
       <w:r>
         <w:t xml:space="preserve">{{ </w:t>
       </w:r>
       <w:proofErr w:type="spellStart"/>
       <w:r>
-        <w:t>output_checkbox</w:t>
+        <w:t>output</w:t>
+      </w:r>
+      <w:proofErr w:type="gramEnd"/>
+      <w:r>
+        <w:t>_checkbox</w:t>
       </w:r>
       <w:proofErr w:type="spellEnd"/>
       <w:r>
@@ -3915,12 +3645,17 @@
           <w:rFonts w:eastAsia="Calibri"/>
         </w:rPr>
       </w:pPr>
+      <w:proofErr w:type="gramStart"/>
       <w:r>
         <w:t xml:space="preserve">{{ </w:t>
       </w:r>
       <w:proofErr w:type="spellStart"/>
       <w:r>
-        <w:t>output_checkbox</w:t>
+        <w:t>output</w:t>
+      </w:r>
+      <w:proofErr w:type="gramEnd"/>
+      <w:r>
+        <w:t>_checkbox</w:t>
       </w:r>
       <w:proofErr w:type="spellEnd"/>
       <w:r>
@@ -4152,7 +3887,21 @@
         <w:rPr>
           <w:rFonts w:eastAsia="Calibri"/>
         </w:rPr>
-        <w:t xml:space="preserve">MAIL (     )   PERSONAL SERVICE (     )   ELECTRONIC SERVICE (     ) </w:t>
+        <w:t xml:space="preserve">MAIL </w:t>
+      </w:r>
+      <w:proofErr w:type="gramStart"/>
+      <w:r>
+        <w:rPr>
+          <w:rFonts w:eastAsia="Calibri"/>
+        </w:rPr>
+        <w:t xml:space="preserve">(  </w:t>
+      </w:r>
+      <w:proofErr w:type="gramEnd"/>
+      <w:r>
+        <w:rPr>
+          <w:rFonts w:eastAsia="Calibri"/>
+        </w:rPr>
+        <w:t xml:space="preserve">   )   PERSONAL SERVICE (     )   ELECTRONIC SERVICE (     ) </w:t>
       </w:r>
     </w:p>
     <w:p>
@@ -4169,7 +3918,21 @@
         <w:rPr>
           <w:rFonts w:eastAsia="Calibri"/>
         </w:rPr>
-        <w:t xml:space="preserve">TO: RESPONDENT (     )    RESPONDENT’S C/O CUSTODIAL OFFICER (     )   RESPONDENT’S ATTY/REP (     )    DHS (     ) </w:t>
+        <w:t xml:space="preserve">TO: RESPONDENT </w:t>
+      </w:r>
+      <w:proofErr w:type="gramStart"/>
+      <w:r>
+        <w:rPr>
+          <w:rFonts w:eastAsia="Calibri"/>
+        </w:rPr>
+        <w:t xml:space="preserve">(  </w:t>
+      </w:r>
+      <w:proofErr w:type="gramEnd"/>
+      <w:r>
+        <w:rPr>
+          <w:rFonts w:eastAsia="Calibri"/>
+        </w:rPr>
+        <w:t xml:space="preserve">   )    RESPONDENT’S C/O CUSTODIAL OFFICER (     )   RESPONDENT’S ATTY/REP (     )    DHS (     ) </w:t>
       </w:r>
     </w:p>
     <w:p>
@@ -4182,11 +3945,19 @@
           <w:rFonts w:eastAsia="Calibri"/>
         </w:rPr>
       </w:pPr>
-      <w:r>
-        <w:rPr>
-          <w:rFonts w:eastAsia="Calibri"/>
-        </w:rPr>
-        <w:t>DATE:____________________   BY: COURT STAFF_________________________________</w:t>
+      <w:proofErr w:type="gramStart"/>
+      <w:r>
+        <w:rPr>
+          <w:rFonts w:eastAsia="Calibri"/>
+        </w:rPr>
+        <w:t>DATE:_</w:t>
+      </w:r>
+      <w:proofErr w:type="gramEnd"/>
+      <w:r>
+        <w:rPr>
+          <w:rFonts w:eastAsia="Calibri"/>
+        </w:rPr>
+        <w:t>___________________   BY: COURT STAFF_________________________________</w:t>
       </w:r>
     </w:p>
     <w:p>
@@ -4203,7 +3974,21 @@
         <w:rPr>
           <w:rFonts w:eastAsia="Calibri"/>
         </w:rPr>
-        <w:t>ATTACHMENTS: EOIR-33 (     )   EOIR-28 (    )   LEGAL SERVICES LIST (   )    OTHER</w:t>
+        <w:t xml:space="preserve">ATTACHMENTS: EOIR-33 </w:t>
+      </w:r>
+      <w:proofErr w:type="gramStart"/>
+      <w:r>
+        <w:rPr>
+          <w:rFonts w:eastAsia="Calibri"/>
+        </w:rPr>
+        <w:t xml:space="preserve">(  </w:t>
+      </w:r>
+      <w:proofErr w:type="gramEnd"/>
+      <w:r>
+        <w:rPr>
+          <w:rFonts w:eastAsia="Calibri"/>
+        </w:rPr>
+        <w:t xml:space="preserve">   )   EOIR-28 (    )   LEGAL SERVICES LIST (   )    OTHER</w:t>
       </w:r>
     </w:p>
     <w:p>
@@ -4287,6 +4072,7 @@
           <w:bCs/>
         </w:rPr>
       </w:pPr>
+      <w:proofErr w:type="gramStart"/>
       <w:r>
         <w:rPr>
           <w:bCs/>
@@ -4298,6 +4084,74 @@
         <w:rPr>
           <w:bCs/>
         </w:rPr>
+        <w:t>motion</w:t>
+      </w:r>
+      <w:proofErr w:type="gramEnd"/>
+      <w:r>
+        <w:rPr>
+          <w:bCs/>
+        </w:rPr>
+        <w:t>_users</w:t>
+      </w:r>
+      <w:proofErr w:type="spellEnd"/>
+      <w:r>
+        <w:rPr>
+          <w:bCs/>
+        </w:rPr>
+        <w:t>[0</w:t>
+      </w:r>
+      <w:r>
+        <w:rPr>
+          <w:bCs/>
+        </w:rPr>
+        <w:t>]</w:t>
+      </w:r>
+      <w:r>
+        <w:rPr>
+          <w:bCs/>
+        </w:rPr>
+        <w:t>.</w:t>
+      </w:r>
+      <w:proofErr w:type="spellStart"/>
+      <w:r>
+        <w:rPr>
+          <w:bCs/>
+        </w:rPr>
+        <w:t>name</w:t>
+      </w:r>
+      <w:r>
+        <w:rPr>
+          <w:bCs/>
+        </w:rPr>
+        <w:t>.lastfirst</w:t>
+      </w:r>
+      <w:proofErr w:type="spellEnd"/>
+      <w:r>
+        <w:rPr>
+          <w:bCs/>
+        </w:rPr>
+        <w:t>()</w:t>
+      </w:r>
+      <w:r>
+        <w:rPr>
+          <w:bCs/>
+        </w:rPr>
+        <w:t>}}</w:t>
+      </w:r>
+      <w:r>
+        <w:t xml:space="preserve"> </w:t>
+      </w:r>
+      <w:r>
+        <w:rPr>
+          <w:bCs/>
+        </w:rPr>
+        <w:t xml:space="preserve">{{ </w:t>
+      </w:r>
+      <w:proofErr w:type="spellStart"/>
+      <w:r>
+        <w:rPr>
+          <w:bCs/>
+        </w:rPr>
         <w:t>motion_users</w:t>
       </w:r>
       <w:proofErr w:type="spellEnd"/>
@@ -4306,73 +4160,6 @@
           <w:bCs/>
         </w:rPr>
         <w:t>[0</w:t>
-      </w:r>
-      <w:r>
-        <w:rPr>
-          <w:bCs/>
-        </w:rPr>
-        <w:t>]</w:t>
-      </w:r>
-      <w:r>
-        <w:rPr>
-          <w:bCs/>
-        </w:rPr>
-        <w:t>.</w:t>
-      </w:r>
-      <w:proofErr w:type="spellStart"/>
-      <w:r>
-        <w:rPr>
-          <w:bCs/>
-        </w:rPr>
-        <w:t>name</w:t>
-      </w:r>
-      <w:r>
-        <w:rPr>
-          <w:bCs/>
-        </w:rPr>
-        <w:t>.lastfirst</w:t>
-      </w:r>
-      <w:proofErr w:type="spellEnd"/>
-      <w:r>
-        <w:rPr>
-          <w:bCs/>
-        </w:rPr>
-        <w:t>()</w:t>
-      </w:r>
-      <w:r>
-        <w:rPr>
-          <w:bCs/>
-        </w:rPr>
-        <w:t>}}</w:t>
-      </w:r>
-      <w:r>
-        <w:t xml:space="preserve"> </w:t>
-      </w:r>
-      <w:r>
-        <w:rPr>
-          <w:bCs/>
-        </w:rPr>
-        <w:t xml:space="preserve">{{ </w:t>
-      </w:r>
-      <w:proofErr w:type="spellStart"/>
-      <w:r>
-        <w:rPr>
-          <w:bCs/>
-        </w:rPr>
-        <w:t>motion_users</w:t>
-      </w:r>
-      <w:proofErr w:type="spellEnd"/>
-      <w:r>
-        <w:rPr>
-          <w:bCs/>
-        </w:rPr>
-        <w:t>[</w:t>
-      </w:r>
-      <w:r>
-        <w:rPr>
-          <w:bCs/>
-        </w:rPr>
-        <w:t>0</w:t>
       </w:r>
       <w:r>
         <w:rPr>
@@ -4572,9 +4359,17 @@
         <w:rPr>
           <w:bCs/>
         </w:rPr>
-        <w:t>x.name.lastfirst</w:t>
-      </w:r>
-      <w:proofErr w:type="spellEnd"/>
+        <w:t>x.</w:t>
+      </w:r>
+      <w:proofErr w:type="gramStart"/>
+      <w:r>
+        <w:rPr>
+          <w:bCs/>
+        </w:rPr>
+        <w:t>name.lastfirst</w:t>
+      </w:r>
+      <w:proofErr w:type="spellEnd"/>
+      <w:proofErr w:type="gramEnd"/>
       <w:r>
         <w:rPr>
           <w:bCs/>
@@ -4780,26 +4575,6 @@
         </w:rPr>
         <w:t xml:space="preserve">{% if </w:t>
       </w:r>
-      <w:r>
-        <w:rPr>
-          <w:bCs/>
-        </w:rPr>
-        <w:t>users[</w:t>
-      </w:r>
-      <w:proofErr w:type="spellStart"/>
-      <w:r>
-        <w:rPr>
-          <w:bCs/>
-        </w:rPr>
-        <w:t>i</w:t>
-      </w:r>
-      <w:proofErr w:type="spellEnd"/>
-      <w:r>
-        <w:rPr>
-          <w:bCs/>
-        </w:rPr>
-        <w:t>].</w:t>
-      </w:r>
       <w:proofErr w:type="spellStart"/>
       <w:r>
         <w:rPr>
@@ -4847,21 +4622,27 @@
         <w:rPr>
           <w:bCs/>
         </w:rPr>
-        <w:t>{{ users[</w:t>
-      </w:r>
-      <w:proofErr w:type="spellStart"/>
-      <w:r>
-        <w:rPr>
-          <w:bCs/>
-        </w:rPr>
-        <w:t>i</w:t>
-      </w:r>
-      <w:proofErr w:type="spellEnd"/>
-      <w:r>
-        <w:rPr>
-          <w:bCs/>
-        </w:rPr>
-        <w:t>].</w:t>
+        <w:t xml:space="preserve">{{ </w:t>
+      </w:r>
+      <w:proofErr w:type="spellStart"/>
+      <w:r>
+        <w:rPr>
+          <w:bCs/>
+        </w:rPr>
+        <w:t>motion_users</w:t>
+      </w:r>
+      <w:proofErr w:type="spellEnd"/>
+      <w:r>
+        <w:rPr>
+          <w:bCs/>
+        </w:rPr>
+        <w:t>[0]</w:t>
+      </w:r>
+      <w:r>
+        <w:rPr>
+          <w:bCs/>
+        </w:rPr>
+        <w:t>.</w:t>
       </w:r>
       <w:proofErr w:type="spellStart"/>
       <w:r>
@@ -4953,26 +4734,6 @@
         </w:rPr>
         <w:t xml:space="preserve">{{ </w:t>
       </w:r>
-      <w:r>
-        <w:rPr>
-          <w:bCs/>
-        </w:rPr>
-        <w:t>users[</w:t>
-      </w:r>
-      <w:proofErr w:type="spellStart"/>
-      <w:r>
-        <w:rPr>
-          <w:bCs/>
-        </w:rPr>
-        <w:t>i</w:t>
-      </w:r>
-      <w:proofErr w:type="spellEnd"/>
-      <w:r>
-        <w:rPr>
-          <w:bCs/>
-        </w:rPr>
-        <w:t>].</w:t>
-      </w:r>
       <w:proofErr w:type="spellStart"/>
       <w:r>
         <w:rPr>
@@ -5016,26 +4777,6 @@
           <w:bCs/>
         </w:rPr>
         <w:t xml:space="preserve">{{ </w:t>
-      </w:r>
-      <w:r>
-        <w:rPr>
-          <w:bCs/>
-        </w:rPr>
-        <w:t>users[</w:t>
-      </w:r>
-      <w:proofErr w:type="spellStart"/>
-      <w:r>
-        <w:rPr>
-          <w:bCs/>
-        </w:rPr>
-        <w:t>i</w:t>
-      </w:r>
-      <w:proofErr w:type="spellEnd"/>
-      <w:r>
-        <w:rPr>
-          <w:bCs/>
-        </w:rPr>
-        <w:t>].</w:t>
       </w:r>
       <w:proofErr w:type="spellStart"/>
       <w:r>
@@ -5094,26 +4835,6 @@
       </w:r>
       <w:r>
         <w:t xml:space="preserve">{ </w:t>
-      </w:r>
-      <w:r>
-        <w:rPr>
-          <w:bCs/>
-        </w:rPr>
-        <w:t>users[</w:t>
-      </w:r>
-      <w:proofErr w:type="spellStart"/>
-      <w:r>
-        <w:rPr>
-          <w:bCs/>
-        </w:rPr>
-        <w:t>i</w:t>
-      </w:r>
-      <w:proofErr w:type="spellEnd"/>
-      <w:r>
-        <w:rPr>
-          <w:bCs/>
-        </w:rPr>
-        <w:t>].</w:t>
       </w:r>
       <w:proofErr w:type="spellStart"/>
       <w:r>
@@ -7052,6 +6773,27 @@
 </file>
 
 <file path=customXml/item1.xml><?xml version="1.0" encoding="utf-8"?>
+<?mso-contentType ?>
+<FormTemplates xmlns="http://schemas.microsoft.com/sharepoint/v3/contenttype/forms">
+  <Display>DocumentLibraryForm</Display>
+  <Edit>DocumentLibraryForm</Edit>
+  <New>DocumentLibraryForm</New>
+</FormTemplates>
+</file>
+
+<file path=customXml/item2.xml><?xml version="1.0" encoding="utf-8"?>
+<p:properties xmlns:p="http://schemas.microsoft.com/office/2006/metadata/properties" xmlns:xsi="http://www.w3.org/2001/XMLSchema-instance" xmlns:pc="http://schemas.microsoft.com/office/infopath/2007/PartnerControls">
+  <documentManagement>
+    <TaxCatchAll xmlns="fc2e0b91-73db-4711-986b-9e7114b1c780" xsi:nil="true"/>
+    <lcf76f155ced4ddcb4097134ff3c332f xmlns="aa22b7f0-1c77-4983-9187-bff8e7aaefd5">
+      <Terms xmlns="http://schemas.microsoft.com/office/infopath/2007/PartnerControls"/>
+    </lcf76f155ced4ddcb4097134ff3c332f>
+    <Note xmlns="aa22b7f0-1c77-4983-9187-bff8e7aaefd5" xsi:nil="true"/>
+  </documentManagement>
+</p:properties>
+</file>
+
+<file path=customXml/item3.xml><?xml version="1.0" encoding="utf-8"?>
 <ct:contentTypeSchema xmlns:ct="http://schemas.microsoft.com/office/2006/metadata/contentType" xmlns:ma="http://schemas.microsoft.com/office/2006/metadata/properties/metaAttributes" ct:_="" ma:_="" ma:contentTypeName="Document" ma:contentTypeID="0x01010041FCC52ECBA99C44897D8B99E45B6EB2" ma:contentTypeVersion="20" ma:contentTypeDescription="Create a new document." ma:contentTypeScope="" ma:versionID="98dd51a1eb8d717f429cfb72bbcdf291">
   <xsd:schema xmlns:xsd="http://www.w3.org/2001/XMLSchema" xmlns:xs="http://www.w3.org/2001/XMLSchema" xmlns:p="http://schemas.microsoft.com/office/2006/metadata/properties" xmlns:ns2="aa22b7f0-1c77-4983-9187-bff8e7aaefd5" xmlns:ns3="fc2e0b91-73db-4711-986b-9e7114b1c780" targetNamespace="http://schemas.microsoft.com/office/2006/metadata/properties" ma:root="true" ma:fieldsID="764fccced344541160bdf3d7a4f43fd4" ns2:_="" ns3:_="">
     <xsd:import namespace="aa22b7f0-1c77-4983-9187-bff8e7aaefd5"/>
@@ -7308,28 +7050,26 @@
 </ct:contentTypeSchema>
 </file>
 
-<file path=customXml/item2.xml><?xml version="1.0" encoding="utf-8"?>
-<p:properties xmlns:p="http://schemas.microsoft.com/office/2006/metadata/properties" xmlns:xsi="http://www.w3.org/2001/XMLSchema-instance" xmlns:pc="http://schemas.microsoft.com/office/infopath/2007/PartnerControls">
-  <documentManagement>
-    <TaxCatchAll xmlns="fc2e0b91-73db-4711-986b-9e7114b1c780" xsi:nil="true"/>
-    <lcf76f155ced4ddcb4097134ff3c332f xmlns="aa22b7f0-1c77-4983-9187-bff8e7aaefd5">
-      <Terms xmlns="http://schemas.microsoft.com/office/infopath/2007/PartnerControls"/>
-    </lcf76f155ced4ddcb4097134ff3c332f>
-    <Note xmlns="aa22b7f0-1c77-4983-9187-bff8e7aaefd5" xsi:nil="true"/>
-  </documentManagement>
-</p:properties>
+<file path=customXml/itemProps1.xml><?xml version="1.0" encoding="utf-8"?>
+<ds:datastoreItem xmlns:ds="http://schemas.openxmlformats.org/officeDocument/2006/customXml" ds:itemID="{61801A56-0FD2-4394-93D8-612F28940603}">
+  <ds:schemaRefs>
+    <ds:schemaRef ds:uri="http://schemas.microsoft.com/sharepoint/v3/contenttype/forms"/>
+  </ds:schemaRefs>
+</ds:datastoreItem>
 </file>
 
-<file path=customXml/item3.xml><?xml version="1.0" encoding="utf-8"?>
-<?mso-contentType ?>
-<FormTemplates xmlns="http://schemas.microsoft.com/sharepoint/v3/contenttype/forms">
-  <Display>DocumentLibraryForm</Display>
-  <Edit>DocumentLibraryForm</Edit>
-  <New>DocumentLibraryForm</New>
-</FormTemplates>
+<file path=customXml/itemProps2.xml><?xml version="1.0" encoding="utf-8"?>
+<ds:datastoreItem xmlns:ds="http://schemas.openxmlformats.org/officeDocument/2006/customXml" ds:itemID="{20C66F9F-F7B4-4B87-8910-A2DDB634D5E0}">
+  <ds:schemaRefs>
+    <ds:schemaRef ds:uri="http://schemas.microsoft.com/office/2006/metadata/properties"/>
+    <ds:schemaRef ds:uri="http://schemas.microsoft.com/office/infopath/2007/PartnerControls"/>
+    <ds:schemaRef ds:uri="fc2e0b91-73db-4711-986b-9e7114b1c780"/>
+    <ds:schemaRef ds:uri="aa22b7f0-1c77-4983-9187-bff8e7aaefd5"/>
+  </ds:schemaRefs>
+</ds:datastoreItem>
 </file>
 
-<file path=customXml/itemProps1.xml><?xml version="1.0" encoding="utf-8"?>
+<file path=customXml/itemProps3.xml><?xml version="1.0" encoding="utf-8"?>
 <ds:datastoreItem xmlns:ds="http://schemas.openxmlformats.org/officeDocument/2006/customXml" ds:itemID="{82045B43-7134-4D42-9F91-65658FCA0A3C}">
   <ds:schemaRefs>
     <ds:schemaRef ds:uri="http://schemas.microsoft.com/office/2006/metadata/contentType"/>
@@ -7346,23 +7086,4 @@
     <ds:schemaRef ds:uri="http://schemas.microsoft.com/internal/obd"/>
   </ds:schemaRefs>
 </ds:datastoreItem>
-</file>
-
-<file path=customXml/itemProps2.xml><?xml version="1.0" encoding="utf-8"?>
-<ds:datastoreItem xmlns:ds="http://schemas.openxmlformats.org/officeDocument/2006/customXml" ds:itemID="{20C66F9F-F7B4-4B87-8910-A2DDB634D5E0}">
-  <ds:schemaRefs>
-    <ds:schemaRef ds:uri="http://schemas.microsoft.com/office/2006/metadata/properties"/>
-    <ds:schemaRef ds:uri="http://schemas.microsoft.com/office/infopath/2007/PartnerControls"/>
-    <ds:schemaRef ds:uri="fc2e0b91-73db-4711-986b-9e7114b1c780"/>
-    <ds:schemaRef ds:uri="aa22b7f0-1c77-4983-9187-bff8e7aaefd5"/>
-  </ds:schemaRefs>
-</ds:datastoreItem>
-</file>
-
-<file path=customXml/itemProps3.xml><?xml version="1.0" encoding="utf-8"?>
-<ds:datastoreItem xmlns:ds="http://schemas.openxmlformats.org/officeDocument/2006/customXml" ds:itemID="{61801A56-0FD2-4394-93D8-612F28940603}">
-  <ds:schemaRefs>
-    <ds:schemaRef ds:uri="http://schemas.microsoft.com/sharepoint/v3/contenttype/forms"/>
-  </ds:schemaRefs>
-</ds:datastoreItem>
 </file>
</xml_diff>

<commit_message>
Updated the Motion DOCX handling dates and relief.
</commit_message>
<xml_diff>
--- a/docassemble/USCISApplications/data/templates/COV_motion.docx
+++ b/docassemble/USCISApplications/data/templates/COV_motion.docx
@@ -1732,83 +1732,52 @@
       </w:r>
       <w:proofErr w:type="gramStart"/>
       <w:r>
+        <w:t>{{</w:t>
+      </w:r>
+      <w:r>
+        <w:rPr>
+          <w:rFonts w:ascii="Consolas" w:hAnsi="Consolas"/>
+          <w:color w:val="CCCCCC"/>
+          <w:sz w:val="21"/>
+          <w:szCs w:val="21"/>
+        </w:rPr>
+        <w:t xml:space="preserve"> </w:t>
+      </w:r>
+      <w:proofErr w:type="spellStart"/>
+      <w:r>
+        <w:t>entry</w:t>
+      </w:r>
+      <w:proofErr w:type="gramEnd"/>
+      <w:r>
+        <w:t>_to_us_date</w:t>
+      </w:r>
+      <w:r>
+        <w:t>.format</w:t>
+      </w:r>
+      <w:proofErr w:type="spellEnd"/>
+      <w:r>
+        <w:t>("MM/dd/</w:t>
+      </w:r>
+      <w:proofErr w:type="spellStart"/>
+      <w:r>
+        <w:t>yyyy</w:t>
+      </w:r>
+      <w:proofErr w:type="spellEnd"/>
+      <w:r>
+        <w:t>") }}</w:t>
+      </w:r>
+      <w:r>
+        <w:t xml:space="preserve"> </w:t>
+      </w:r>
+      <w:r>
+        <w:t xml:space="preserve">and have been living in Illinois since </w:t>
+      </w:r>
+      <w:r>
         <w:t xml:space="preserve">{{ </w:t>
       </w:r>
       <w:proofErr w:type="spellStart"/>
       <w:r>
-        <w:rPr>
-          <w:bCs/>
-        </w:rPr>
-        <w:t>motion</w:t>
-      </w:r>
-      <w:proofErr w:type="gramEnd"/>
-      <w:r>
-        <w:rPr>
-          <w:bCs/>
-        </w:rPr>
-        <w:t>_users</w:t>
-      </w:r>
-      <w:proofErr w:type="spellEnd"/>
-      <w:r>
-        <w:t xml:space="preserve"> </w:t>
-      </w:r>
-      <w:r>
-        <w:t>[</w:t>
-      </w:r>
-      <w:r>
-        <w:t>0</w:t>
-      </w:r>
-      <w:r>
-        <w:t>].</w:t>
-      </w:r>
-      <w:proofErr w:type="spellStart"/>
-      <w:r>
-        <w:t>date_started_us_residence.format</w:t>
-      </w:r>
-      <w:proofErr w:type="spellEnd"/>
-      <w:r>
-        <w:t>("MM/dd/</w:t>
-      </w:r>
-      <w:proofErr w:type="spellStart"/>
-      <w:r>
-        <w:t>yyyy</w:t>
-      </w:r>
-      <w:proofErr w:type="spellEnd"/>
-      <w:r>
-        <w:t>") }}</w:t>
-      </w:r>
-      <w:r>
-        <w:t xml:space="preserve"> </w:t>
-      </w:r>
-      <w:r>
-        <w:t xml:space="preserve">and have been living in Illinois since </w:t>
-      </w:r>
-      <w:r>
-        <w:t xml:space="preserve">{{ </w:t>
-      </w:r>
-      <w:proofErr w:type="spellStart"/>
-      <w:r>
-        <w:t>motion_users</w:t>
-      </w:r>
-      <w:proofErr w:type="spellEnd"/>
-      <w:r>
-        <w:t>[</w:t>
-      </w:r>
-      <w:r>
-        <w:t>0</w:t>
-      </w:r>
-      <w:r>
-        <w:t>].</w:t>
-      </w:r>
-      <w:proofErr w:type="spellStart"/>
-      <w:r>
-        <w:t>previous</w:t>
-      </w:r>
-      <w:r>
-        <w:t>_address</w:t>
-      </w:r>
-      <w:r>
-        <w:t>.date</w:t>
+        <w:t>illinois_move_date</w:t>
       </w:r>
       <w:r>
         <w:t>.format</w:t>
@@ -2255,47 +2224,27 @@
         <w:rPr>
           <w:bCs/>
         </w:rPr>
-        <w:t xml:space="preserve">{{ </w:t>
-      </w:r>
-      <w:proofErr w:type="spellStart"/>
-      <w:r>
-        <w:rPr>
-          <w:bCs/>
-        </w:rPr>
-        <w:t>motion</w:t>
+        <w:t>{{</w:t>
+      </w:r>
+      <w:r>
+        <w:rPr>
+          <w:bCs/>
+        </w:rPr>
+        <w:t xml:space="preserve"> </w:t>
+      </w:r>
+      <w:proofErr w:type="spellStart"/>
+      <w:r>
+        <w:rPr>
+          <w:bCs/>
+        </w:rPr>
+        <w:t>type</w:t>
       </w:r>
       <w:proofErr w:type="gramEnd"/>
       <w:r>
         <w:rPr>
           <w:bCs/>
         </w:rPr>
-        <w:t>_users</w:t>
-      </w:r>
-      <w:proofErr w:type="spellEnd"/>
-      <w:r>
-        <w:rPr>
-          <w:bCs/>
-        </w:rPr>
-        <w:t>[</w:t>
-      </w:r>
-      <w:r>
-        <w:rPr>
-          <w:bCs/>
-        </w:rPr>
-        <w:t>0</w:t>
-      </w:r>
-      <w:r>
-        <w:rPr>
-          <w:bCs/>
-        </w:rPr>
-        <w:t>].</w:t>
-      </w:r>
-      <w:proofErr w:type="spellStart"/>
-      <w:r>
-        <w:rPr>
-          <w:bCs/>
-        </w:rPr>
-        <w:t>type_of_relief</w:t>
+        <w:t>_of_relief</w:t>
       </w:r>
       <w:proofErr w:type="spellEnd"/>
       <w:r>
@@ -6304,7 +6253,6 @@
   <w:style w:type="character" w:default="1" w:styleId="DefaultParagraphFont">
     <w:name w:val="Default Paragraph Font"/>
     <w:uiPriority w:val="1"/>
-    <w:semiHidden/>
     <w:unhideWhenUsed/>
   </w:style>
   <w:style w:type="table" w:default="1" w:styleId="TableNormal">
@@ -6773,27 +6721,6 @@
 </file>
 
 <file path=customXml/item1.xml><?xml version="1.0" encoding="utf-8"?>
-<?mso-contentType ?>
-<FormTemplates xmlns="http://schemas.microsoft.com/sharepoint/v3/contenttype/forms">
-  <Display>DocumentLibraryForm</Display>
-  <Edit>DocumentLibraryForm</Edit>
-  <New>DocumentLibraryForm</New>
-</FormTemplates>
-</file>
-
-<file path=customXml/item2.xml><?xml version="1.0" encoding="utf-8"?>
-<p:properties xmlns:p="http://schemas.microsoft.com/office/2006/metadata/properties" xmlns:xsi="http://www.w3.org/2001/XMLSchema-instance" xmlns:pc="http://schemas.microsoft.com/office/infopath/2007/PartnerControls">
-  <documentManagement>
-    <TaxCatchAll xmlns="fc2e0b91-73db-4711-986b-9e7114b1c780" xsi:nil="true"/>
-    <lcf76f155ced4ddcb4097134ff3c332f xmlns="aa22b7f0-1c77-4983-9187-bff8e7aaefd5">
-      <Terms xmlns="http://schemas.microsoft.com/office/infopath/2007/PartnerControls"/>
-    </lcf76f155ced4ddcb4097134ff3c332f>
-    <Note xmlns="aa22b7f0-1c77-4983-9187-bff8e7aaefd5" xsi:nil="true"/>
-  </documentManagement>
-</p:properties>
-</file>
-
-<file path=customXml/item3.xml><?xml version="1.0" encoding="utf-8"?>
 <ct:contentTypeSchema xmlns:ct="http://schemas.microsoft.com/office/2006/metadata/contentType" xmlns:ma="http://schemas.microsoft.com/office/2006/metadata/properties/metaAttributes" ct:_="" ma:_="" ma:contentTypeName="Document" ma:contentTypeID="0x01010041FCC52ECBA99C44897D8B99E45B6EB2" ma:contentTypeVersion="20" ma:contentTypeDescription="Create a new document." ma:contentTypeScope="" ma:versionID="98dd51a1eb8d717f429cfb72bbcdf291">
   <xsd:schema xmlns:xsd="http://www.w3.org/2001/XMLSchema" xmlns:xs="http://www.w3.org/2001/XMLSchema" xmlns:p="http://schemas.microsoft.com/office/2006/metadata/properties" xmlns:ns2="aa22b7f0-1c77-4983-9187-bff8e7aaefd5" xmlns:ns3="fc2e0b91-73db-4711-986b-9e7114b1c780" targetNamespace="http://schemas.microsoft.com/office/2006/metadata/properties" ma:root="true" ma:fieldsID="764fccced344541160bdf3d7a4f43fd4" ns2:_="" ns3:_="">
     <xsd:import namespace="aa22b7f0-1c77-4983-9187-bff8e7aaefd5"/>
@@ -7050,10 +6977,42 @@
 </ct:contentTypeSchema>
 </file>
 
+<file path=customXml/item2.xml><?xml version="1.0" encoding="utf-8"?>
+<p:properties xmlns:p="http://schemas.microsoft.com/office/2006/metadata/properties" xmlns:xsi="http://www.w3.org/2001/XMLSchema-instance" xmlns:pc="http://schemas.microsoft.com/office/infopath/2007/PartnerControls">
+  <documentManagement>
+    <TaxCatchAll xmlns="fc2e0b91-73db-4711-986b-9e7114b1c780" xsi:nil="true"/>
+    <lcf76f155ced4ddcb4097134ff3c332f xmlns="aa22b7f0-1c77-4983-9187-bff8e7aaefd5">
+      <Terms xmlns="http://schemas.microsoft.com/office/infopath/2007/PartnerControls"/>
+    </lcf76f155ced4ddcb4097134ff3c332f>
+    <Note xmlns="aa22b7f0-1c77-4983-9187-bff8e7aaefd5" xsi:nil="true"/>
+  </documentManagement>
+</p:properties>
+</file>
+
+<file path=customXml/item3.xml><?xml version="1.0" encoding="utf-8"?>
+<?mso-contentType ?>
+<FormTemplates xmlns="http://schemas.microsoft.com/sharepoint/v3/contenttype/forms">
+  <Display>DocumentLibraryForm</Display>
+  <Edit>DocumentLibraryForm</Edit>
+  <New>DocumentLibraryForm</New>
+</FormTemplates>
+</file>
+
 <file path=customXml/itemProps1.xml><?xml version="1.0" encoding="utf-8"?>
-<ds:datastoreItem xmlns:ds="http://schemas.openxmlformats.org/officeDocument/2006/customXml" ds:itemID="{61801A56-0FD2-4394-93D8-612F28940603}">
+<ds:datastoreItem xmlns:ds="http://schemas.openxmlformats.org/officeDocument/2006/customXml" ds:itemID="{82045B43-7134-4D42-9F91-65658FCA0A3C}">
   <ds:schemaRefs>
-    <ds:schemaRef ds:uri="http://schemas.microsoft.com/sharepoint/v3/contenttype/forms"/>
+    <ds:schemaRef ds:uri="http://schemas.microsoft.com/office/2006/metadata/contentType"/>
+    <ds:schemaRef ds:uri="http://schemas.microsoft.com/office/2006/metadata/properties/metaAttributes"/>
+    <ds:schemaRef ds:uri="http://www.w3.org/2001/XMLSchema"/>
+    <ds:schemaRef ds:uri="http://schemas.microsoft.com/office/2006/metadata/properties"/>
+    <ds:schemaRef ds:uri="aa22b7f0-1c77-4983-9187-bff8e7aaefd5"/>
+    <ds:schemaRef ds:uri="fc2e0b91-73db-4711-986b-9e7114b1c780"/>
+    <ds:schemaRef ds:uri="http://schemas.microsoft.com/office/2006/documentManagement/types"/>
+    <ds:schemaRef ds:uri="http://schemas.microsoft.com/office/infopath/2007/PartnerControls"/>
+    <ds:schemaRef ds:uri="http://schemas.openxmlformats.org/package/2006/metadata/core-properties"/>
+    <ds:schemaRef ds:uri="http://purl.org/dc/elements/1.1/"/>
+    <ds:schemaRef ds:uri="http://purl.org/dc/terms/"/>
+    <ds:schemaRef ds:uri="http://schemas.microsoft.com/internal/obd"/>
   </ds:schemaRefs>
 </ds:datastoreItem>
 </file>
@@ -7070,20 +7029,9 @@
 </file>
 
 <file path=customXml/itemProps3.xml><?xml version="1.0" encoding="utf-8"?>
-<ds:datastoreItem xmlns:ds="http://schemas.openxmlformats.org/officeDocument/2006/customXml" ds:itemID="{82045B43-7134-4D42-9F91-65658FCA0A3C}">
+<ds:datastoreItem xmlns:ds="http://schemas.openxmlformats.org/officeDocument/2006/customXml" ds:itemID="{61801A56-0FD2-4394-93D8-612F28940603}">
   <ds:schemaRefs>
-    <ds:schemaRef ds:uri="http://schemas.microsoft.com/office/2006/metadata/contentType"/>
-    <ds:schemaRef ds:uri="http://schemas.microsoft.com/office/2006/metadata/properties/metaAttributes"/>
-    <ds:schemaRef ds:uri="http://www.w3.org/2001/XMLSchema"/>
-    <ds:schemaRef ds:uri="http://schemas.microsoft.com/office/2006/metadata/properties"/>
-    <ds:schemaRef ds:uri="aa22b7f0-1c77-4983-9187-bff8e7aaefd5"/>
-    <ds:schemaRef ds:uri="fc2e0b91-73db-4711-986b-9e7114b1c780"/>
-    <ds:schemaRef ds:uri="http://schemas.microsoft.com/office/2006/documentManagement/types"/>
-    <ds:schemaRef ds:uri="http://schemas.microsoft.com/office/infopath/2007/PartnerControls"/>
-    <ds:schemaRef ds:uri="http://schemas.openxmlformats.org/package/2006/metadata/core-properties"/>
-    <ds:schemaRef ds:uri="http://purl.org/dc/elements/1.1/"/>
-    <ds:schemaRef ds:uri="http://purl.org/dc/terms/"/>
-    <ds:schemaRef ds:uri="http://schemas.microsoft.com/internal/obd"/>
+    <ds:schemaRef ds:uri="http://schemas.microsoft.com/sharepoint/v3/contenttype/forms"/>
   </ds:schemaRefs>
 </ds:datastoreItem>
 </file>
</xml_diff>

<commit_message>
Update to Motion date formatting for readability.
</commit_message>
<xml_diff>
--- a/docassemble/USCISApplications/data/templates/COV_motion.docx
+++ b/docassemble/USCISApplications/data/templates/COV_motion.docx
@@ -49,7 +49,6 @@
         </w:rPr>
         <w:tab/>
       </w:r>
-      <w:proofErr w:type="spellStart"/>
       <w:r>
         <w:rPr>
           <w:b/>
@@ -57,7 +56,6 @@
         </w:rPr>
         <w:t>NonDetained</w:t>
       </w:r>
-      <w:proofErr w:type="spellEnd"/>
     </w:p>
     <w:p/>
     <w:p/>
@@ -121,38 +119,8 @@
         <w:rPr>
           <w:b/>
         </w:rPr>
-        <w:t xml:space="preserve">{% if </w:t>
-      </w:r>
-      <w:proofErr w:type="spellStart"/>
-      <w:proofErr w:type="gramStart"/>
-      <w:r>
-        <w:rPr>
-          <w:b/>
-        </w:rPr>
-        <w:t>dhs.different</w:t>
-      </w:r>
-      <w:proofErr w:type="gramEnd"/>
-      <w:r>
-        <w:rPr>
-          <w:b/>
-        </w:rPr>
-        <w:t>_court_location</w:t>
-      </w:r>
-      <w:proofErr w:type="spellEnd"/>
-      <w:r>
-        <w:rPr>
-          <w:b/>
-        </w:rPr>
-        <w:t xml:space="preserve"> %}{{ </w:t>
-      </w:r>
-      <w:proofErr w:type="spellStart"/>
-      <w:r>
-        <w:rPr>
-          <w:b/>
-        </w:rPr>
-        <w:t>dhs.court_city</w:t>
-      </w:r>
-      <w:proofErr w:type="spellEnd"/>
+        <w:t>{% if dhs.different_court_location %}{{ dhs.court_city</w:t>
+      </w:r>
       <w:r>
         <w:rPr>
           <w:b/>
@@ -165,28 +133,18 @@
         </w:rPr>
         <w:t xml:space="preserve">upper }}, {{ </w:t>
       </w:r>
-      <w:proofErr w:type="spellStart"/>
-      <w:r>
-        <w:rPr>
-          <w:b/>
-        </w:rPr>
-        <w:t>state_name</w:t>
-      </w:r>
-      <w:proofErr w:type="spellEnd"/>
-      <w:r>
-        <w:rPr>
-          <w:b/>
-        </w:rPr>
-        <w:t>(</w:t>
-      </w:r>
-      <w:proofErr w:type="spellStart"/>
+      <w:r>
+        <w:rPr>
+          <w:b/>
+        </w:rPr>
+        <w:t>state_name(</w:t>
+      </w:r>
       <w:r>
         <w:rPr>
           <w:b/>
         </w:rPr>
         <w:t>dhs.court_state</w:t>
       </w:r>
-      <w:proofErr w:type="spellEnd"/>
       <w:r>
         <w:rPr>
           <w:b/>
@@ -203,16 +161,8 @@
         <w:rPr>
           <w:b/>
         </w:rPr>
-        <w:t xml:space="preserve">upper }}{% else %}{{ </w:t>
-      </w:r>
-      <w:proofErr w:type="spellStart"/>
-      <w:r>
-        <w:rPr>
-          <w:b/>
-        </w:rPr>
-        <w:t>dhs.address.city</w:t>
-      </w:r>
-      <w:proofErr w:type="spellEnd"/>
+        <w:t>upper }}{% else %}{{ dhs.address.city</w:t>
+      </w:r>
       <w:r>
         <w:rPr>
           <w:b/>
@@ -228,21 +178,12 @@
         </w:rPr>
         <w:t xml:space="preserve">upper }}, {{ </w:t>
       </w:r>
-      <w:proofErr w:type="spellStart"/>
-      <w:r>
-        <w:rPr>
-          <w:b/>
-        </w:rPr>
-        <w:t>state_name</w:t>
-      </w:r>
-      <w:proofErr w:type="spellEnd"/>
-      <w:r>
-        <w:rPr>
-          <w:b/>
-        </w:rPr>
-        <w:t>(</w:t>
-      </w:r>
-      <w:proofErr w:type="spellStart"/>
+      <w:r>
+        <w:rPr>
+          <w:b/>
+        </w:rPr>
+        <w:t>state_name(</w:t>
+      </w:r>
       <w:r>
         <w:rPr>
           <w:b/>
@@ -255,7 +196,6 @@
         </w:rPr>
         <w:t>state</w:t>
       </w:r>
-      <w:proofErr w:type="spellEnd"/>
       <w:r>
         <w:rPr>
           <w:b/>
@@ -332,7 +272,6 @@
         </w:rPr>
         <w:t xml:space="preserve"> of:</w:t>
       </w:r>
-      <w:proofErr w:type="gramStart"/>
       <w:r>
         <w:tab/>
       </w:r>
@@ -342,7 +281,6 @@
       <w:r>
         <w:t>)</w:t>
       </w:r>
-      <w:proofErr w:type="gramEnd"/>
       <w:r>
         <w:rPr>
           <w:bCs/>
@@ -400,7 +338,6 @@
         </w:rPr>
         <w:t xml:space="preserve">{%p if </w:t>
       </w:r>
-      <w:proofErr w:type="spellStart"/>
       <w:r>
         <w:rPr>
           <w:bCs/>
@@ -417,14 +354,7 @@
         <w:rPr>
           <w:bCs/>
         </w:rPr>
-        <w:t>users</w:t>
-      </w:r>
-      <w:proofErr w:type="spellEnd"/>
-      <w:r>
-        <w:rPr>
-          <w:bCs/>
-        </w:rPr>
-        <w:t xml:space="preserve"> | length == 1</w:t>
+        <w:t>users | length == 1</w:t>
       </w:r>
       <w:r>
         <w:rPr>
@@ -448,47 +378,23 @@
           <w:bCs/>
         </w:rPr>
       </w:pPr>
-      <w:proofErr w:type="gramStart"/>
       <w:r>
         <w:rPr>
           <w:bCs/>
         </w:rPr>
         <w:t xml:space="preserve">{{ </w:t>
       </w:r>
-      <w:proofErr w:type="spellStart"/>
-      <w:r>
-        <w:rPr>
-          <w:bCs/>
-        </w:rPr>
-        <w:t>motion</w:t>
-      </w:r>
-      <w:proofErr w:type="gramEnd"/>
-      <w:r>
-        <w:rPr>
-          <w:bCs/>
-        </w:rPr>
-        <w:t>_users</w:t>
-      </w:r>
-      <w:proofErr w:type="spellEnd"/>
-      <w:r>
-        <w:rPr>
-          <w:bCs/>
-        </w:rPr>
-        <w:t>[0].</w:t>
-      </w:r>
-      <w:proofErr w:type="spellStart"/>
-      <w:r>
-        <w:rPr>
-          <w:bCs/>
-        </w:rPr>
-        <w:t>name.lastfirst</w:t>
-      </w:r>
-      <w:proofErr w:type="spellEnd"/>
-      <w:r>
-        <w:rPr>
-          <w:bCs/>
-        </w:rPr>
-        <w:t>()</w:t>
+      <w:r>
+        <w:rPr>
+          <w:bCs/>
+        </w:rPr>
+        <w:t>motion_users</w:t>
+      </w:r>
+      <w:r>
+        <w:rPr>
+          <w:bCs/>
+        </w:rPr>
+        <w:t>[0].name.lastfirst()</w:t>
       </w:r>
       <w:r>
         <w:rPr>
@@ -505,33 +411,17 @@
         </w:rPr>
         <w:t xml:space="preserve">{{ </w:t>
       </w:r>
-      <w:proofErr w:type="spellStart"/>
       <w:r>
         <w:rPr>
           <w:bCs/>
         </w:rPr>
         <w:t>motion_users</w:t>
       </w:r>
-      <w:proofErr w:type="spellEnd"/>
-      <w:r>
-        <w:rPr>
-          <w:bCs/>
-        </w:rPr>
-        <w:t>[0].</w:t>
-      </w:r>
-      <w:proofErr w:type="spellStart"/>
-      <w:r>
-        <w:rPr>
-          <w:bCs/>
-        </w:rPr>
-        <w:t>name.middle</w:t>
-      </w:r>
-      <w:proofErr w:type="spellEnd"/>
-      <w:r>
-        <w:rPr>
-          <w:bCs/>
-        </w:rPr>
-        <w:t xml:space="preserve"> </w:t>
+      <w:r>
+        <w:rPr>
+          <w:bCs/>
+        </w:rPr>
+        <w:t xml:space="preserve">[0].name.middle </w:t>
       </w:r>
       <w:r>
         <w:rPr>
@@ -568,14 +458,12 @@
         </w:rPr>
         <w:t xml:space="preserve">A# {{ </w:t>
       </w:r>
-      <w:proofErr w:type="spellStart"/>
       <w:r>
         <w:rPr>
           <w:bCs/>
         </w:rPr>
         <w:t>motion_users</w:t>
       </w:r>
-      <w:proofErr w:type="spellEnd"/>
       <w:r>
         <w:rPr>
           <w:bCs/>
@@ -588,19 +476,11 @@
         </w:rPr>
         <w:t>].</w:t>
       </w:r>
-      <w:proofErr w:type="spellStart"/>
-      <w:r>
-        <w:rPr>
-          <w:bCs/>
-        </w:rPr>
-        <w:t>a_number</w:t>
-      </w:r>
-      <w:proofErr w:type="spellEnd"/>
-      <w:r>
-        <w:rPr>
-          <w:bCs/>
-        </w:rPr>
-        <w:t xml:space="preserve"> }}</w:t>
+      <w:r>
+        <w:rPr>
+          <w:bCs/>
+        </w:rPr>
+        <w:t>a_number }}</w:t>
       </w:r>
     </w:p>
     <w:p>
@@ -688,14 +568,12 @@
         </w:rPr>
         <w:t xml:space="preserve">{%p for x in </w:t>
       </w:r>
-      <w:proofErr w:type="spellStart"/>
       <w:r>
         <w:rPr>
           <w:bCs/>
         </w:rPr>
         <w:t>motion_users</w:t>
       </w:r>
-      <w:proofErr w:type="spellEnd"/>
       <w:r>
         <w:rPr>
           <w:bCs/>
@@ -718,22 +596,18 @@
         </w:rPr>
         <w:t>{{</w:t>
       </w:r>
-      <w:proofErr w:type="spellStart"/>
       <w:r>
         <w:rPr>
           <w:bCs/>
         </w:rPr>
         <w:t>x.</w:t>
       </w:r>
-      <w:proofErr w:type="gramStart"/>
       <w:r>
         <w:rPr>
           <w:bCs/>
         </w:rPr>
         <w:t>name.lastfirst</w:t>
       </w:r>
-      <w:proofErr w:type="spellEnd"/>
-      <w:proofErr w:type="gramEnd"/>
       <w:r>
         <w:rPr>
           <w:bCs/>
@@ -752,7 +626,6 @@
         </w:rPr>
         <w:t>}} {{</w:t>
       </w:r>
-      <w:proofErr w:type="spellStart"/>
       <w:r>
         <w:rPr>
           <w:bCs/>
@@ -765,7 +638,6 @@
         </w:rPr>
         <w:t>.name.middle</w:t>
       </w:r>
-      <w:proofErr w:type="spellEnd"/>
       <w:r>
         <w:rPr>
           <w:bCs/>
@@ -805,14 +677,7 @@
         <w:rPr>
           <w:bCs/>
         </w:rPr>
-        <w:t xml:space="preserve"> </w:t>
-      </w:r>
-      <w:proofErr w:type="spellStart"/>
-      <w:r>
-        <w:rPr>
-          <w:bCs/>
-        </w:rPr>
-        <w:t>x</w:t>
+        <w:t xml:space="preserve"> x</w:t>
       </w:r>
       <w:r>
         <w:rPr>
@@ -824,14 +689,7 @@
         <w:rPr>
           <w:bCs/>
         </w:rPr>
-        <w:t>a_number</w:t>
-      </w:r>
-      <w:proofErr w:type="spellEnd"/>
-      <w:r>
-        <w:rPr>
-          <w:bCs/>
-        </w:rPr>
-        <w:t xml:space="preserve"> }}</w:t>
+        <w:t>a_number }}</w:t>
       </w:r>
     </w:p>
     <w:p>
@@ -847,21 +705,7 @@
         <w:rPr>
           <w:bCs/>
         </w:rPr>
-        <w:t xml:space="preserve">{%p </w:t>
-      </w:r>
-      <w:proofErr w:type="spellStart"/>
-      <w:r>
-        <w:rPr>
-          <w:bCs/>
-        </w:rPr>
-        <w:t>endfor</w:t>
-      </w:r>
-      <w:proofErr w:type="spellEnd"/>
-      <w:r>
-        <w:rPr>
-          <w:bCs/>
-        </w:rPr>
-        <w:t xml:space="preserve"> %}</w:t>
+        <w:t>{%p endfor %}</w:t>
       </w:r>
     </w:p>
     <w:p>
@@ -948,14 +792,12 @@
           <w:tab w:val="left" w:pos="5220"/>
         </w:tabs>
       </w:pPr>
-      <w:proofErr w:type="gramStart"/>
       <w:r>
         <w:t>{</w:t>
       </w:r>
       <w:r>
         <w:t xml:space="preserve">{ </w:t>
       </w:r>
-      <w:proofErr w:type="spellStart"/>
       <w:r>
         <w:t>immigration_judge.</w:t>
       </w:r>
@@ -965,7 +807,6 @@
         </w:rPr>
         <w:t>name</w:t>
       </w:r>
-      <w:proofErr w:type="gramEnd"/>
       <w:r>
         <w:rPr>
           <w:bCs/>
@@ -978,7 +819,6 @@
         </w:rPr>
         <w:t>full</w:t>
       </w:r>
-      <w:proofErr w:type="spellEnd"/>
       <w:r>
         <w:rPr>
           <w:bCs/>
@@ -1012,24 +852,11 @@
       <w:r>
         <w:t xml:space="preserve">{ </w:t>
       </w:r>
-      <w:proofErr w:type="spellStart"/>
       <w:r>
         <w:t>hearing_datetime</w:t>
       </w:r>
       <w:r>
-        <w:t>.format</w:t>
-      </w:r>
-      <w:proofErr w:type="spellEnd"/>
-      <w:r>
-        <w:t>(“MM/dd/</w:t>
-      </w:r>
-      <w:proofErr w:type="spellStart"/>
-      <w:r>
-        <w:t>yyyy</w:t>
-      </w:r>
-      <w:proofErr w:type="spellEnd"/>
-      <w:r>
-        <w:t>”)</w:t>
+        <w:t>.format(“MM/dd/yyyy”)</w:t>
       </w:r>
       <w:r>
         <w:t xml:space="preserve"> </w:t>
@@ -1214,38 +1041,8 @@
         <w:rPr>
           <w:b/>
         </w:rPr>
-        <w:t xml:space="preserve">{% if </w:t>
-      </w:r>
-      <w:proofErr w:type="spellStart"/>
-      <w:proofErr w:type="gramStart"/>
-      <w:r>
-        <w:rPr>
-          <w:b/>
-        </w:rPr>
-        <w:t>dhs.different</w:t>
-      </w:r>
-      <w:proofErr w:type="gramEnd"/>
-      <w:r>
-        <w:rPr>
-          <w:b/>
-        </w:rPr>
-        <w:t>_court_location</w:t>
-      </w:r>
-      <w:proofErr w:type="spellEnd"/>
-      <w:r>
-        <w:rPr>
-          <w:b/>
-        </w:rPr>
-        <w:t xml:space="preserve"> %}{{ </w:t>
-      </w:r>
-      <w:proofErr w:type="spellStart"/>
-      <w:r>
-        <w:rPr>
-          <w:b/>
-        </w:rPr>
-        <w:t>dhs.court_city</w:t>
-      </w:r>
-      <w:proofErr w:type="spellEnd"/>
+        <w:t>{% if dhs.different_court_location %}{{ dhs.court_city</w:t>
+      </w:r>
       <w:r>
         <w:rPr>
           <w:b/>
@@ -1258,28 +1055,18 @@
         </w:rPr>
         <w:t xml:space="preserve">upper }}, {{ </w:t>
       </w:r>
-      <w:proofErr w:type="spellStart"/>
-      <w:r>
-        <w:rPr>
-          <w:b/>
-        </w:rPr>
-        <w:t>state_name</w:t>
-      </w:r>
-      <w:proofErr w:type="spellEnd"/>
-      <w:r>
-        <w:rPr>
-          <w:b/>
-        </w:rPr>
-        <w:t>(</w:t>
-      </w:r>
-      <w:proofErr w:type="spellStart"/>
+      <w:r>
+        <w:rPr>
+          <w:b/>
+        </w:rPr>
+        <w:t>state_name(</w:t>
+      </w:r>
       <w:r>
         <w:rPr>
           <w:b/>
         </w:rPr>
         <w:t>dhs.court_state</w:t>
       </w:r>
-      <w:proofErr w:type="spellEnd"/>
       <w:r>
         <w:rPr>
           <w:b/>
@@ -1290,16 +1077,8 @@
         <w:rPr>
           <w:b/>
         </w:rPr>
-        <w:t xml:space="preserve">upper }}{% else %}{{ </w:t>
-      </w:r>
-      <w:proofErr w:type="spellStart"/>
-      <w:r>
-        <w:rPr>
-          <w:b/>
-        </w:rPr>
-        <w:t>dhs.address.city</w:t>
-      </w:r>
-      <w:proofErr w:type="spellEnd"/>
+        <w:t>upper }}{% else %}{{ dhs.address.city</w:t>
+      </w:r>
       <w:r>
         <w:rPr>
           <w:b/>
@@ -1315,21 +1094,12 @@
         </w:rPr>
         <w:t xml:space="preserve">upper }}, {{ </w:t>
       </w:r>
-      <w:proofErr w:type="spellStart"/>
-      <w:r>
-        <w:rPr>
-          <w:b/>
-        </w:rPr>
-        <w:t>state_name</w:t>
-      </w:r>
-      <w:proofErr w:type="spellEnd"/>
-      <w:r>
-        <w:rPr>
-          <w:b/>
-        </w:rPr>
-        <w:t>(</w:t>
-      </w:r>
-      <w:proofErr w:type="spellStart"/>
+      <w:r>
+        <w:rPr>
+          <w:b/>
+        </w:rPr>
+        <w:t>state_name(</w:t>
+      </w:r>
       <w:r>
         <w:rPr>
           <w:b/>
@@ -1340,14 +1110,7 @@
         <w:rPr>
           <w:b/>
         </w:rPr>
-        <w:t>state</w:t>
-      </w:r>
-      <w:proofErr w:type="spellEnd"/>
-      <w:r>
-        <w:rPr>
-          <w:b/>
-        </w:rPr>
-        <w:t xml:space="preserve">) | </w:t>
+        <w:t xml:space="preserve">state) | </w:t>
       </w:r>
       <w:r>
         <w:rPr>
@@ -1371,14 +1134,12 @@
         </w:rPr>
         <w:t xml:space="preserve">{{ </w:t>
       </w:r>
-      <w:proofErr w:type="spellStart"/>
       <w:r>
         <w:rPr>
           <w:bCs/>
         </w:rPr>
         <w:t>motion_users</w:t>
       </w:r>
-      <w:proofErr w:type="spellEnd"/>
       <w:r>
         <w:rPr>
           <w:bCs/>
@@ -1397,7 +1158,6 @@
         </w:rPr>
         <w:t>].</w:t>
       </w:r>
-      <w:proofErr w:type="spellStart"/>
       <w:r>
         <w:rPr>
           <w:bCs/>
@@ -1416,7 +1176,6 @@
         </w:rPr>
         <w:t>full</w:t>
       </w:r>
-      <w:proofErr w:type="spellEnd"/>
       <w:r>
         <w:rPr>
           <w:bCs/>
@@ -1454,14 +1213,7 @@
         <w:rPr>
           <w:bCs/>
         </w:rPr>
-        <w:t xml:space="preserve">{% if </w:t>
-      </w:r>
-      <w:proofErr w:type="spellStart"/>
-      <w:r>
-        <w:rPr>
-          <w:bCs/>
-        </w:rPr>
-        <w:t>dhs.</w:t>
+        <w:t>{% if dhs.</w:t>
       </w:r>
       <w:r>
         <w:rPr>
@@ -1469,7 +1221,6 @@
         </w:rPr>
         <w:t>different_court_location</w:t>
       </w:r>
-      <w:proofErr w:type="spellEnd"/>
       <w:r>
         <w:rPr>
           <w:bCs/>
@@ -1482,7 +1233,6 @@
         </w:rPr>
         <w:t xml:space="preserve"> </w:t>
       </w:r>
-      <w:proofErr w:type="spellStart"/>
       <w:r>
         <w:rPr>
           <w:bCs/>
@@ -1501,7 +1251,6 @@
         </w:rPr>
         <w:t>court_city</w:t>
       </w:r>
-      <w:proofErr w:type="spellEnd"/>
       <w:r>
         <w:rPr>
           <w:bCs/>
@@ -1520,7 +1269,6 @@
         </w:rPr>
         <w:t xml:space="preserve">{{ </w:t>
       </w:r>
-      <w:proofErr w:type="spellStart"/>
       <w:r>
         <w:rPr>
           <w:bCs/>
@@ -1539,7 +1287,6 @@
         </w:rPr>
         <w:t>court_state</w:t>
       </w:r>
-      <w:proofErr w:type="spellEnd"/>
       <w:r>
         <w:rPr>
           <w:bCs/>
@@ -1558,7 +1305,6 @@
         </w:rPr>
         <w:t xml:space="preserve"> </w:t>
       </w:r>
-      <w:proofErr w:type="spellStart"/>
       <w:r>
         <w:rPr>
           <w:bCs/>
@@ -1581,14 +1327,7 @@
         <w:rPr>
           <w:bCs/>
         </w:rPr>
-        <w:t>city</w:t>
-      </w:r>
-      <w:proofErr w:type="spellEnd"/>
-      <w:r>
-        <w:rPr>
-          <w:bCs/>
-        </w:rPr>
-        <w:t xml:space="preserve"> }},</w:t>
+        <w:t>city }},</w:t>
       </w:r>
       <w:r>
         <w:rPr>
@@ -1602,7 +1341,6 @@
         </w:rPr>
         <w:t xml:space="preserve">{{ </w:t>
       </w:r>
-      <w:proofErr w:type="spellStart"/>
       <w:r>
         <w:rPr>
           <w:bCs/>
@@ -1625,14 +1363,7 @@
         <w:rPr>
           <w:bCs/>
         </w:rPr>
-        <w:t>state</w:t>
-      </w:r>
-      <w:proofErr w:type="spellEnd"/>
-      <w:r>
-        <w:rPr>
-          <w:bCs/>
-        </w:rPr>
-        <w:t xml:space="preserve"> }}</w:t>
+        <w:t>state }}</w:t>
       </w:r>
       <w:r>
         <w:t xml:space="preserve">{% endif %} to the immigration court in Chicago, IL. </w:t>
@@ -1667,28 +1398,18 @@
       <w:r>
         <w:t xml:space="preserve">I currently reside at </w:t>
       </w:r>
-      <w:proofErr w:type="gramStart"/>
       <w:r>
         <w:rPr>
           <w:bCs/>
         </w:rPr>
         <w:t xml:space="preserve">{{ </w:t>
       </w:r>
-      <w:proofErr w:type="spellStart"/>
-      <w:r>
-        <w:rPr>
-          <w:bCs/>
-        </w:rPr>
-        <w:t>motion</w:t>
-      </w:r>
-      <w:proofErr w:type="gramEnd"/>
-      <w:r>
-        <w:rPr>
-          <w:bCs/>
-        </w:rPr>
-        <w:t>_users</w:t>
-      </w:r>
-      <w:proofErr w:type="spellEnd"/>
+      <w:r>
+        <w:rPr>
+          <w:bCs/>
+        </w:rPr>
+        <w:t>motion_users</w:t>
+      </w:r>
       <w:r>
         <w:rPr>
           <w:bCs/>
@@ -1707,19 +1428,11 @@
         </w:rPr>
         <w:t>].</w:t>
       </w:r>
-      <w:proofErr w:type="spellStart"/>
-      <w:r>
-        <w:rPr>
-          <w:bCs/>
-        </w:rPr>
-        <w:t>address.on_one_line</w:t>
-      </w:r>
-      <w:proofErr w:type="spellEnd"/>
-      <w:r>
-        <w:rPr>
-          <w:bCs/>
-        </w:rPr>
-        <w:t xml:space="preserve">(bare=True) </w:t>
+      <w:r>
+        <w:rPr>
+          <w:bCs/>
+        </w:rPr>
+        <w:t xml:space="preserve">address.on_one_line(bare=True) </w:t>
       </w:r>
       <w:r>
         <w:rPr>
@@ -1730,7 +1443,6 @@
       <w:r>
         <w:t xml:space="preserve">. I have been in the United States since </w:t>
       </w:r>
-      <w:proofErr w:type="gramStart"/>
       <w:r>
         <w:t>{{</w:t>
       </w:r>
@@ -1743,28 +1455,29 @@
         </w:rPr>
         <w:t xml:space="preserve"> </w:t>
       </w:r>
-      <w:proofErr w:type="spellStart"/>
-      <w:r>
-        <w:t>entry</w:t>
-      </w:r>
-      <w:proofErr w:type="gramEnd"/>
-      <w:r>
-        <w:t>_to_us_date</w:t>
-      </w:r>
-      <w:r>
-        <w:t>.format</w:t>
-      </w:r>
-      <w:proofErr w:type="spellEnd"/>
-      <w:r>
-        <w:t>("MM/dd/</w:t>
-      </w:r>
-      <w:proofErr w:type="spellStart"/>
-      <w:r>
-        <w:t>yyyy</w:t>
-      </w:r>
-      <w:proofErr w:type="spellEnd"/>
-      <w:r>
-        <w:t>") }}</w:t>
+      <w:r>
+        <w:t>entry_to_us_date</w:t>
+      </w:r>
+      <w:r>
+        <w:t>.format("M</w:t>
+      </w:r>
+      <w:r>
+        <w:t>MM</w:t>
+      </w:r>
+      <w:r>
+        <w:t>M</w:t>
+      </w:r>
+      <w:r>
+        <w:t xml:space="preserve"> </w:t>
+      </w:r>
+      <w:r>
+        <w:t>d</w:t>
+      </w:r>
+      <w:r>
+        <w:t xml:space="preserve">, </w:t>
+      </w:r>
+      <w:r>
+        <w:t>yyyy") }}</w:t>
       </w:r>
       <w:r>
         <w:t xml:space="preserve"> </w:t>
@@ -1775,24 +1488,23 @@
       <w:r>
         <w:t xml:space="preserve">{{ </w:t>
       </w:r>
-      <w:proofErr w:type="spellStart"/>
       <w:r>
         <w:t>illinois_move_date</w:t>
       </w:r>
       <w:r>
-        <w:t>.format</w:t>
-      </w:r>
-      <w:proofErr w:type="spellEnd"/>
-      <w:r>
-        <w:t>('MM/dd/</w:t>
-      </w:r>
-      <w:proofErr w:type="spellStart"/>
-      <w:r>
-        <w:t>yyyy</w:t>
-      </w:r>
-      <w:proofErr w:type="spellEnd"/>
-      <w:r>
-        <w:t>') }}</w:t>
+        <w:t>.format('MM</w:t>
+      </w:r>
+      <w:r>
+        <w:t xml:space="preserve">MM </w:t>
+      </w:r>
+      <w:r>
+        <w:t>d</w:t>
+      </w:r>
+      <w:r>
+        <w:t xml:space="preserve">, </w:t>
+      </w:r>
+      <w:r>
+        <w:t>yyyy') }}</w:t>
       </w:r>
       <w:r>
         <w:t>.</w:t>
@@ -1814,30 +1526,14 @@
         <w:rPr>
           <w:bCs/>
         </w:rPr>
-        <w:t xml:space="preserve">{% if </w:t>
-      </w:r>
-      <w:proofErr w:type="spellStart"/>
-      <w:proofErr w:type="gramStart"/>
-      <w:r>
-        <w:rPr>
-          <w:bCs/>
-        </w:rPr>
-        <w:t>dhs.</w:t>
-      </w:r>
-      <w:r>
-        <w:rPr>
-          <w:bCs/>
-        </w:rPr>
-        <w:t>different</w:t>
-      </w:r>
-      <w:proofErr w:type="gramEnd"/>
-      <w:r>
-        <w:rPr>
-          <w:bCs/>
-        </w:rPr>
-        <w:t>_court_location</w:t>
-      </w:r>
-      <w:proofErr w:type="spellEnd"/>
+        <w:t>{% if dhs.</w:t>
+      </w:r>
+      <w:r>
+        <w:rPr>
+          <w:bCs/>
+        </w:rPr>
+        <w:t>different_court_location</w:t>
+      </w:r>
       <w:r>
         <w:rPr>
           <w:bCs/>
@@ -1850,7 +1546,6 @@
         </w:rPr>
         <w:t xml:space="preserve"> </w:t>
       </w:r>
-      <w:proofErr w:type="spellStart"/>
       <w:r>
         <w:rPr>
           <w:bCs/>
@@ -1869,7 +1564,6 @@
         </w:rPr>
         <w:t>court_city</w:t>
       </w:r>
-      <w:proofErr w:type="spellEnd"/>
       <w:r>
         <w:rPr>
           <w:bCs/>
@@ -1888,7 +1582,6 @@
         </w:rPr>
         <w:t xml:space="preserve">{{ </w:t>
       </w:r>
-      <w:proofErr w:type="spellStart"/>
       <w:r>
         <w:rPr>
           <w:bCs/>
@@ -1907,7 +1600,6 @@
         </w:rPr>
         <w:t>court_state</w:t>
       </w:r>
-      <w:proofErr w:type="spellEnd"/>
       <w:r>
         <w:rPr>
           <w:bCs/>
@@ -1926,7 +1618,6 @@
         </w:rPr>
         <w:t xml:space="preserve"> </w:t>
       </w:r>
-      <w:proofErr w:type="spellStart"/>
       <w:r>
         <w:rPr>
           <w:bCs/>
@@ -1949,14 +1640,7 @@
         <w:rPr>
           <w:bCs/>
         </w:rPr>
-        <w:t>city</w:t>
-      </w:r>
-      <w:proofErr w:type="spellEnd"/>
-      <w:r>
-        <w:rPr>
-          <w:bCs/>
-        </w:rPr>
-        <w:t xml:space="preserve"> }},</w:t>
+        <w:t>city }},</w:t>
       </w:r>
       <w:r>
         <w:rPr>
@@ -1970,7 +1654,6 @@
         </w:rPr>
         <w:t xml:space="preserve">{{ </w:t>
       </w:r>
-      <w:proofErr w:type="spellStart"/>
       <w:r>
         <w:rPr>
           <w:bCs/>
@@ -1993,14 +1676,7 @@
         <w:rPr>
           <w:bCs/>
         </w:rPr>
-        <w:t>state</w:t>
-      </w:r>
-      <w:proofErr w:type="spellEnd"/>
-      <w:r>
-        <w:rPr>
-          <w:bCs/>
-        </w:rPr>
-        <w:t xml:space="preserve"> }}</w:t>
+        <w:t>state }}</w:t>
       </w:r>
       <w:r>
         <w:t>{% endif %}</w:t>
@@ -2038,27 +1714,26 @@
       <w:r>
         <w:t xml:space="preserve">As of today, </w:t>
       </w:r>
-      <w:proofErr w:type="gramStart"/>
       <w:r>
         <w:t>{{</w:t>
       </w:r>
       <w:r>
-        <w:t xml:space="preserve"> today</w:t>
-      </w:r>
-      <w:proofErr w:type="gramEnd"/>
-      <w:r>
-        <w:t>()</w:t>
-      </w:r>
-      <w:r>
-        <w:t>.format('MM/dd/</w:t>
-      </w:r>
-      <w:proofErr w:type="spellStart"/>
-      <w:r>
-        <w:t>yyyy</w:t>
-      </w:r>
-      <w:proofErr w:type="spellEnd"/>
-      <w:r>
-        <w:t>') }}</w:t>
+        <w:t xml:space="preserve"> today()</w:t>
+      </w:r>
+      <w:r>
+        <w:t>.format('MM</w:t>
+      </w:r>
+      <w:r>
+        <w:t xml:space="preserve">MM </w:t>
+      </w:r>
+      <w:r>
+        <w:t>d</w:t>
+      </w:r>
+      <w:r>
+        <w:t xml:space="preserve">, </w:t>
+      </w:r>
+      <w:r>
+        <w:t>yyyy') }}</w:t>
       </w:r>
       <w:r>
         <w:t xml:space="preserve">, I have not appeared before an immigration judge and I have not submitted pleadings for my Notice to Appear. </w:t>
@@ -2090,58 +1765,35 @@
         </w:rPr>
         <w:t xml:space="preserve"> </w:t>
       </w:r>
-      <w:proofErr w:type="gramStart"/>
       <w:r>
         <w:t>{</w:t>
       </w:r>
       <w:r>
         <w:t xml:space="preserve">{ </w:t>
       </w:r>
-      <w:proofErr w:type="spellStart"/>
-      <w:r>
-        <w:rPr>
-          <w:bCs/>
-        </w:rPr>
-        <w:t>motion</w:t>
-      </w:r>
-      <w:proofErr w:type="gramEnd"/>
-      <w:r>
-        <w:rPr>
-          <w:bCs/>
-        </w:rPr>
-        <w:t>_users</w:t>
-      </w:r>
-      <w:proofErr w:type="spellEnd"/>
-      <w:r>
-        <w:t xml:space="preserve"> </w:t>
-      </w:r>
-      <w:r>
-        <w:t>[</w:t>
-      </w:r>
-      <w:r>
-        <w:t>0</w:t>
-      </w:r>
-      <w:r>
-        <w:t>].</w:t>
-      </w:r>
-      <w:proofErr w:type="spellStart"/>
       <w:r>
         <w:t>notice_appear_date</w:t>
       </w:r>
       <w:r>
-        <w:t>.format</w:t>
-      </w:r>
-      <w:proofErr w:type="spellEnd"/>
-      <w:r>
-        <w:t>(“MM/dd/</w:t>
-      </w:r>
-      <w:proofErr w:type="spellStart"/>
-      <w:r>
-        <w:t>yyyy</w:t>
-      </w:r>
-      <w:proofErr w:type="spellEnd"/>
-      <w:r>
-        <w:t>”)</w:t>
+        <w:t>.format(“M</w:t>
+      </w:r>
+      <w:r>
+        <w:t>MM</w:t>
+      </w:r>
+      <w:r>
+        <w:t>M</w:t>
+      </w:r>
+      <w:r>
+        <w:t xml:space="preserve"> </w:t>
+      </w:r>
+      <w:r>
+        <w:t>d</w:t>
+      </w:r>
+      <w:r>
+        <w:t xml:space="preserve">, </w:t>
+      </w:r>
+      <w:r>
+        <w:t>yyyy”)</w:t>
       </w:r>
       <w:r>
         <w:t xml:space="preserve"> </w:t>
@@ -2219,7 +1871,6 @@
       <w:r>
         <w:t xml:space="preserve"> </w:t>
       </w:r>
-      <w:proofErr w:type="gramStart"/>
       <w:r>
         <w:rPr>
           <w:bCs/>
@@ -2232,21 +1883,12 @@
         </w:rPr>
         <w:t xml:space="preserve"> </w:t>
       </w:r>
-      <w:proofErr w:type="spellStart"/>
-      <w:r>
-        <w:rPr>
-          <w:bCs/>
-        </w:rPr>
-        <w:t>type</w:t>
-      </w:r>
-      <w:proofErr w:type="gramEnd"/>
-      <w:r>
-        <w:rPr>
-          <w:bCs/>
-        </w:rPr>
-        <w:t>_of_relief</w:t>
-      </w:r>
-      <w:proofErr w:type="spellEnd"/>
+      <w:r>
+        <w:rPr>
+          <w:bCs/>
+        </w:rPr>
+        <w:t>type_of_relief</w:t>
+      </w:r>
       <w:r>
         <w:rPr>
           <w:bCs/>
@@ -2412,38 +2054,8 @@
         <w:rPr>
           <w:b/>
         </w:rPr>
-        <w:t xml:space="preserve">{% if </w:t>
-      </w:r>
-      <w:proofErr w:type="spellStart"/>
-      <w:proofErr w:type="gramStart"/>
-      <w:r>
-        <w:rPr>
-          <w:b/>
-        </w:rPr>
-        <w:t>dhs.different</w:t>
-      </w:r>
-      <w:proofErr w:type="gramEnd"/>
-      <w:r>
-        <w:rPr>
-          <w:b/>
-        </w:rPr>
-        <w:t>_court_location</w:t>
-      </w:r>
-      <w:proofErr w:type="spellEnd"/>
-      <w:r>
-        <w:rPr>
-          <w:b/>
-        </w:rPr>
-        <w:t xml:space="preserve"> %}{{ </w:t>
-      </w:r>
-      <w:proofErr w:type="spellStart"/>
-      <w:r>
-        <w:rPr>
-          <w:b/>
-        </w:rPr>
-        <w:t>dhs.court_city</w:t>
-      </w:r>
-      <w:proofErr w:type="spellEnd"/>
+        <w:t>{% if dhs.different_court_location %}{{ dhs.court_city</w:t>
+      </w:r>
       <w:r>
         <w:rPr>
           <w:b/>
@@ -2456,28 +2068,18 @@
         </w:rPr>
         <w:t xml:space="preserve">upper }}, {{ </w:t>
       </w:r>
-      <w:proofErr w:type="spellStart"/>
-      <w:r>
-        <w:rPr>
-          <w:b/>
-        </w:rPr>
-        <w:t>state_name</w:t>
-      </w:r>
-      <w:proofErr w:type="spellEnd"/>
-      <w:r>
-        <w:rPr>
-          <w:b/>
-        </w:rPr>
-        <w:t>(</w:t>
-      </w:r>
-      <w:proofErr w:type="spellStart"/>
+      <w:r>
+        <w:rPr>
+          <w:b/>
+        </w:rPr>
+        <w:t>state_name(</w:t>
+      </w:r>
       <w:r>
         <w:rPr>
           <w:b/>
         </w:rPr>
         <w:t>dhs.court_state</w:t>
       </w:r>
-      <w:proofErr w:type="spellEnd"/>
       <w:r>
         <w:rPr>
           <w:b/>
@@ -2488,16 +2090,8 @@
         <w:rPr>
           <w:b/>
         </w:rPr>
-        <w:t xml:space="preserve">upper }}{% else %}{{ </w:t>
-      </w:r>
-      <w:proofErr w:type="spellStart"/>
-      <w:r>
-        <w:rPr>
-          <w:b/>
-        </w:rPr>
-        <w:t>dhs.address.city</w:t>
-      </w:r>
-      <w:proofErr w:type="spellEnd"/>
+        <w:t>upper }}{% else %}{{ dhs.address.city</w:t>
+      </w:r>
       <w:r>
         <w:rPr>
           <w:b/>
@@ -2513,21 +2107,12 @@
         </w:rPr>
         <w:t xml:space="preserve">upper }}, {{ </w:t>
       </w:r>
-      <w:proofErr w:type="spellStart"/>
-      <w:r>
-        <w:rPr>
-          <w:b/>
-        </w:rPr>
-        <w:t>state_name</w:t>
-      </w:r>
-      <w:proofErr w:type="spellEnd"/>
-      <w:r>
-        <w:rPr>
-          <w:b/>
-        </w:rPr>
-        <w:t>(</w:t>
-      </w:r>
-      <w:proofErr w:type="spellStart"/>
+      <w:r>
+        <w:rPr>
+          <w:b/>
+        </w:rPr>
+        <w:t>state_name(</w:t>
+      </w:r>
       <w:r>
         <w:rPr>
           <w:b/>
@@ -2538,14 +2123,7 @@
         <w:rPr>
           <w:b/>
         </w:rPr>
-        <w:t>state</w:t>
-      </w:r>
-      <w:proofErr w:type="spellEnd"/>
-      <w:r>
-        <w:rPr>
-          <w:b/>
-        </w:rPr>
-        <w:t xml:space="preserve">) | </w:t>
+        <w:t xml:space="preserve">state) | </w:t>
       </w:r>
       <w:r>
         <w:rPr>
@@ -2605,7 +2183,6 @@
         </w:rPr>
         <w:t xml:space="preserve">{%p if </w:t>
       </w:r>
-      <w:proofErr w:type="spellStart"/>
       <w:r>
         <w:rPr>
           <w:bCs/>
@@ -2616,14 +2193,7 @@
         <w:rPr>
           <w:bCs/>
         </w:rPr>
-        <w:t>_users</w:t>
-      </w:r>
-      <w:proofErr w:type="spellEnd"/>
-      <w:r>
-        <w:rPr>
-          <w:bCs/>
-        </w:rPr>
-        <w:t xml:space="preserve"> </w:t>
+        <w:t xml:space="preserve">_users </w:t>
       </w:r>
       <w:r>
         <w:rPr>
@@ -2641,47 +2211,23 @@
           <w:bCs/>
         </w:rPr>
       </w:pPr>
-      <w:proofErr w:type="gramStart"/>
       <w:r>
         <w:rPr>
           <w:bCs/>
         </w:rPr>
         <w:t xml:space="preserve">{{ </w:t>
       </w:r>
-      <w:proofErr w:type="spellStart"/>
-      <w:r>
-        <w:rPr>
-          <w:bCs/>
-        </w:rPr>
-        <w:t>motion</w:t>
-      </w:r>
-      <w:proofErr w:type="gramEnd"/>
-      <w:r>
-        <w:rPr>
-          <w:bCs/>
-        </w:rPr>
-        <w:t>_users</w:t>
-      </w:r>
-      <w:proofErr w:type="spellEnd"/>
-      <w:r>
-        <w:rPr>
-          <w:bCs/>
-        </w:rPr>
-        <w:t>[0].</w:t>
-      </w:r>
-      <w:proofErr w:type="spellStart"/>
-      <w:r>
-        <w:rPr>
-          <w:bCs/>
-        </w:rPr>
-        <w:t>name.lastfirst</w:t>
-      </w:r>
-      <w:proofErr w:type="spellEnd"/>
-      <w:r>
-        <w:rPr>
-          <w:bCs/>
-        </w:rPr>
-        <w:t>()</w:t>
+      <w:r>
+        <w:rPr>
+          <w:bCs/>
+        </w:rPr>
+        <w:t>motion_users</w:t>
+      </w:r>
+      <w:r>
+        <w:rPr>
+          <w:bCs/>
+        </w:rPr>
+        <w:t>[0].name.lastfirst()</w:t>
       </w:r>
       <w:r>
         <w:rPr>
@@ -2698,33 +2244,17 @@
         </w:rPr>
         <w:t xml:space="preserve">{{ </w:t>
       </w:r>
-      <w:proofErr w:type="spellStart"/>
       <w:r>
         <w:rPr>
           <w:bCs/>
         </w:rPr>
         <w:t>motion_users</w:t>
       </w:r>
-      <w:proofErr w:type="spellEnd"/>
-      <w:r>
-        <w:rPr>
-          <w:bCs/>
-        </w:rPr>
-        <w:t>[0].</w:t>
-      </w:r>
-      <w:proofErr w:type="spellStart"/>
-      <w:r>
-        <w:rPr>
-          <w:bCs/>
-        </w:rPr>
-        <w:t>name.middle</w:t>
-      </w:r>
-      <w:proofErr w:type="spellEnd"/>
-      <w:r>
-        <w:rPr>
-          <w:bCs/>
-        </w:rPr>
-        <w:t xml:space="preserve"> </w:t>
+      <w:r>
+        <w:rPr>
+          <w:bCs/>
+        </w:rPr>
+        <w:t xml:space="preserve">[0].name.middle </w:t>
       </w:r>
       <w:r>
         <w:rPr>
@@ -2758,14 +2288,12 @@
         </w:rPr>
         <w:t xml:space="preserve">A# {{ </w:t>
       </w:r>
-      <w:proofErr w:type="spellStart"/>
       <w:r>
         <w:rPr>
           <w:bCs/>
         </w:rPr>
         <w:t>motion_users</w:t>
       </w:r>
-      <w:proofErr w:type="spellEnd"/>
       <w:r>
         <w:rPr>
           <w:bCs/>
@@ -2784,19 +2312,11 @@
         </w:rPr>
         <w:t>].</w:t>
       </w:r>
-      <w:proofErr w:type="spellStart"/>
-      <w:r>
-        <w:rPr>
-          <w:bCs/>
-        </w:rPr>
-        <w:t>a_number</w:t>
-      </w:r>
-      <w:proofErr w:type="spellEnd"/>
-      <w:r>
-        <w:rPr>
-          <w:bCs/>
-        </w:rPr>
-        <w:t xml:space="preserve"> }}</w:t>
+      <w:r>
+        <w:rPr>
+          <w:bCs/>
+        </w:rPr>
+        <w:t>a_number }}</w:t>
       </w:r>
     </w:p>
     <w:p>
@@ -2863,14 +2383,12 @@
         </w:rPr>
         <w:t xml:space="preserve">{%p for x in </w:t>
       </w:r>
-      <w:proofErr w:type="spellStart"/>
       <w:r>
         <w:rPr>
           <w:bCs/>
         </w:rPr>
         <w:t>motion_users</w:t>
       </w:r>
-      <w:proofErr w:type="spellEnd"/>
       <w:r>
         <w:rPr>
           <w:bCs/>
@@ -2893,27 +2411,11 @@
         </w:rPr>
         <w:t>{{</w:t>
       </w:r>
-      <w:proofErr w:type="spellStart"/>
-      <w:r>
-        <w:rPr>
-          <w:bCs/>
-        </w:rPr>
-        <w:t>x.</w:t>
-      </w:r>
-      <w:proofErr w:type="gramStart"/>
-      <w:r>
-        <w:rPr>
-          <w:bCs/>
-        </w:rPr>
-        <w:t>name.lastfirst</w:t>
-      </w:r>
-      <w:proofErr w:type="spellEnd"/>
-      <w:proofErr w:type="gramEnd"/>
-      <w:r>
-        <w:rPr>
-          <w:bCs/>
-        </w:rPr>
-        <w:t>(</w:t>
+      <w:r>
+        <w:rPr>
+          <w:bCs/>
+        </w:rPr>
+        <w:t>x.name.lastfirst(</w:t>
       </w:r>
       <w:r>
         <w:rPr>
@@ -2925,16 +2427,8 @@
         <w:rPr>
           <w:bCs/>
         </w:rPr>
-        <w:t>}} {{</w:t>
-      </w:r>
-      <w:proofErr w:type="spellStart"/>
-      <w:r>
-        <w:rPr>
-          <w:bCs/>
-        </w:rPr>
-        <w:t>x.name.middle</w:t>
-      </w:r>
-      <w:proofErr w:type="spellEnd"/>
+        <w:t>}} {{x.name.middle</w:t>
+      </w:r>
       <w:r>
         <w:rPr>
           <w:bCs/>
@@ -2971,27 +2465,13 @@
         <w:rPr>
           <w:bCs/>
         </w:rPr>
-        <w:t xml:space="preserve"> </w:t>
-      </w:r>
-      <w:proofErr w:type="spellStart"/>
-      <w:r>
-        <w:rPr>
-          <w:bCs/>
-        </w:rPr>
-        <w:t>x.</w:t>
-      </w:r>
-      <w:r>
-        <w:rPr>
-          <w:bCs/>
-        </w:rPr>
-        <w:t>a_number</w:t>
-      </w:r>
-      <w:proofErr w:type="spellEnd"/>
-      <w:r>
-        <w:rPr>
-          <w:bCs/>
-        </w:rPr>
-        <w:t xml:space="preserve"> }}</w:t>
+        <w:t xml:space="preserve"> x.</w:t>
+      </w:r>
+      <w:r>
+        <w:rPr>
+          <w:bCs/>
+        </w:rPr>
+        <w:t>a_number }}</w:t>
       </w:r>
     </w:p>
     <w:p>
@@ -3007,21 +2487,7 @@
         <w:rPr>
           <w:bCs/>
         </w:rPr>
-        <w:t xml:space="preserve">{%p </w:t>
-      </w:r>
-      <w:proofErr w:type="spellStart"/>
-      <w:r>
-        <w:rPr>
-          <w:bCs/>
-        </w:rPr>
-        <w:t>endfor</w:t>
-      </w:r>
-      <w:proofErr w:type="spellEnd"/>
-      <w:r>
-        <w:rPr>
-          <w:bCs/>
-        </w:rPr>
-        <w:t xml:space="preserve"> %}</w:t>
+        <w:t>{%p endfor %}</w:t>
       </w:r>
     </w:p>
     <w:p>
@@ -3175,21 +2641,8 @@
         </w:rPr>
         <w:t xml:space="preserve"> </w:t>
       </w:r>
-      <w:proofErr w:type="gramStart"/>
-      <w:r>
-        <w:t xml:space="preserve">{{ </w:t>
-      </w:r>
-      <w:proofErr w:type="spellStart"/>
-      <w:r>
-        <w:t>output</w:t>
-      </w:r>
-      <w:proofErr w:type="gramEnd"/>
-      <w:r>
-        <w:t>_checkbox</w:t>
-      </w:r>
-      <w:proofErr w:type="spellEnd"/>
-      <w:r>
-        <w:t>(False) }}</w:t>
+      <w:r>
+        <w:t>{{ output_checkbox(False) }}</w:t>
       </w:r>
       <w:r>
         <w:rPr>
@@ -3212,15 +2665,7 @@
         <w:t xml:space="preserve">GRANTED </w:t>
       </w:r>
       <w:r>
-        <w:t xml:space="preserve">{{ </w:t>
-      </w:r>
-      <w:proofErr w:type="spellStart"/>
-      <w:r>
-        <w:t>output_checkbox</w:t>
-      </w:r>
-      <w:proofErr w:type="spellEnd"/>
-      <w:r>
-        <w:t>(False) }}</w:t>
+        <w:t>{{ output_checkbox(False) }}</w:t>
       </w:r>
       <w:r>
         <w:rPr>
@@ -3269,21 +2714,8 @@
           <w:rFonts w:eastAsia="Calibri"/>
         </w:rPr>
       </w:pPr>
-      <w:proofErr w:type="gramStart"/>
-      <w:r>
-        <w:t xml:space="preserve">{{ </w:t>
-      </w:r>
-      <w:proofErr w:type="spellStart"/>
-      <w:r>
-        <w:t>output</w:t>
-      </w:r>
-      <w:proofErr w:type="gramEnd"/>
-      <w:r>
-        <w:t>_checkbox</w:t>
-      </w:r>
-      <w:proofErr w:type="spellEnd"/>
-      <w:r>
-        <w:t>(False) }}</w:t>
+      <w:r>
+        <w:t>{{ output_checkbox(False) }}</w:t>
       </w:r>
       <w:r>
         <w:t xml:space="preserve">  </w:t>
@@ -3305,21 +2737,8 @@
           <w:rFonts w:eastAsia="Calibri"/>
         </w:rPr>
       </w:pPr>
-      <w:proofErr w:type="gramStart"/>
-      <w:r>
-        <w:t xml:space="preserve">{{ </w:t>
-      </w:r>
-      <w:proofErr w:type="spellStart"/>
-      <w:r>
-        <w:t>output</w:t>
-      </w:r>
-      <w:proofErr w:type="gramEnd"/>
-      <w:r>
-        <w:t>_checkbox</w:t>
-      </w:r>
-      <w:proofErr w:type="spellEnd"/>
-      <w:r>
-        <w:t>(False) }}</w:t>
+      <w:r>
+        <w:t>{{ output_checkbox(False) }}</w:t>
       </w:r>
       <w:r>
         <w:t xml:space="preserve">  </w:t>
@@ -3341,21 +2760,8 @@
           <w:rFonts w:eastAsia="Calibri"/>
         </w:rPr>
       </w:pPr>
-      <w:proofErr w:type="gramStart"/>
-      <w:r>
-        <w:t xml:space="preserve">{{ </w:t>
-      </w:r>
-      <w:proofErr w:type="spellStart"/>
-      <w:r>
-        <w:t>output</w:t>
-      </w:r>
-      <w:proofErr w:type="gramEnd"/>
-      <w:r>
-        <w:t>_checkbox</w:t>
-      </w:r>
-      <w:proofErr w:type="spellEnd"/>
-      <w:r>
-        <w:t>(False) }}</w:t>
+      <w:r>
+        <w:t>{{ output_checkbox(False) }}</w:t>
       </w:r>
       <w:r>
         <w:t xml:space="preserve">  </w:t>
@@ -3377,21 +2783,8 @@
           <w:rFonts w:eastAsia="Calibri"/>
         </w:rPr>
       </w:pPr>
-      <w:proofErr w:type="gramStart"/>
-      <w:r>
-        <w:t xml:space="preserve">{{ </w:t>
-      </w:r>
-      <w:proofErr w:type="spellStart"/>
-      <w:r>
-        <w:t>output</w:t>
-      </w:r>
-      <w:proofErr w:type="gramEnd"/>
-      <w:r>
-        <w:t>_checkbox</w:t>
-      </w:r>
-      <w:proofErr w:type="spellEnd"/>
-      <w:r>
-        <w:t>(False) }}</w:t>
+      <w:r>
+        <w:t>{{ output_checkbox(False) }}</w:t>
       </w:r>
       <w:r>
         <w:t xml:space="preserve">  </w:t>
@@ -3413,21 +2806,8 @@
           <w:rFonts w:eastAsia="Calibri"/>
         </w:rPr>
       </w:pPr>
-      <w:proofErr w:type="gramStart"/>
-      <w:r>
-        <w:t xml:space="preserve">{{ </w:t>
-      </w:r>
-      <w:proofErr w:type="spellStart"/>
-      <w:r>
-        <w:t>output</w:t>
-      </w:r>
-      <w:proofErr w:type="gramEnd"/>
-      <w:r>
-        <w:t>_checkbox</w:t>
-      </w:r>
-      <w:proofErr w:type="spellEnd"/>
-      <w:r>
-        <w:t>(False) }}</w:t>
+      <w:r>
+        <w:t>{{ output_checkbox(False) }}</w:t>
       </w:r>
       <w:r>
         <w:t xml:space="preserve">  </w:t>
@@ -3449,21 +2829,8 @@
           <w:rFonts w:eastAsia="Calibri"/>
         </w:rPr>
       </w:pPr>
-      <w:proofErr w:type="gramStart"/>
-      <w:r>
-        <w:t xml:space="preserve">{{ </w:t>
-      </w:r>
-      <w:proofErr w:type="spellStart"/>
-      <w:r>
-        <w:t>output</w:t>
-      </w:r>
-      <w:proofErr w:type="gramEnd"/>
-      <w:r>
-        <w:t>_checkbox</w:t>
-      </w:r>
-      <w:proofErr w:type="spellEnd"/>
-      <w:r>
-        <w:t>(False) }}</w:t>
+      <w:r>
+        <w:t>{{ output_checkbox(False) }}</w:t>
       </w:r>
       <w:r>
         <w:t xml:space="preserve">  </w:t>
@@ -3485,21 +2852,8 @@
           <w:rFonts w:eastAsia="Calibri"/>
         </w:rPr>
       </w:pPr>
-      <w:proofErr w:type="gramStart"/>
-      <w:r>
-        <w:t xml:space="preserve">{{ </w:t>
-      </w:r>
-      <w:proofErr w:type="spellStart"/>
-      <w:r>
-        <w:t>output</w:t>
-      </w:r>
-      <w:proofErr w:type="gramEnd"/>
-      <w:r>
-        <w:t>_checkbox</w:t>
-      </w:r>
-      <w:proofErr w:type="spellEnd"/>
-      <w:r>
-        <w:t>(False) }}</w:t>
+      <w:r>
+        <w:t>{{ output_checkbox(False) }}</w:t>
       </w:r>
       <w:r>
         <w:t xml:space="preserve">  </w:t>
@@ -3558,21 +2912,8 @@
           <w:rFonts w:eastAsia="Calibri"/>
         </w:rPr>
       </w:pPr>
-      <w:proofErr w:type="gramStart"/>
-      <w:r>
-        <w:t xml:space="preserve">{{ </w:t>
-      </w:r>
-      <w:proofErr w:type="spellStart"/>
-      <w:r>
-        <w:t>output</w:t>
-      </w:r>
-      <w:proofErr w:type="gramEnd"/>
-      <w:r>
-        <w:t>_checkbox</w:t>
-      </w:r>
-      <w:proofErr w:type="spellEnd"/>
-      <w:r>
-        <w:t>(False) }}</w:t>
+      <w:r>
+        <w:t>{{ output_checkbox(False) }}</w:t>
       </w:r>
       <w:r>
         <w:t xml:space="preserve">  </w:t>
@@ -3594,21 +2935,8 @@
           <w:rFonts w:eastAsia="Calibri"/>
         </w:rPr>
       </w:pPr>
-      <w:proofErr w:type="gramStart"/>
-      <w:r>
-        <w:t xml:space="preserve">{{ </w:t>
-      </w:r>
-      <w:proofErr w:type="spellStart"/>
-      <w:r>
-        <w:t>output</w:t>
-      </w:r>
-      <w:proofErr w:type="gramEnd"/>
-      <w:r>
-        <w:t>_checkbox</w:t>
-      </w:r>
-      <w:proofErr w:type="spellEnd"/>
-      <w:r>
-        <w:t>(False) }}</w:t>
+      <w:r>
+        <w:t>{{ output_checkbox(False) }}</w:t>
       </w:r>
       <w:r>
         <w:t xml:space="preserve">  </w:t>
@@ -3836,21 +3164,7 @@
         <w:rPr>
           <w:rFonts w:eastAsia="Calibri"/>
         </w:rPr>
-        <w:t xml:space="preserve">MAIL </w:t>
-      </w:r>
-      <w:proofErr w:type="gramStart"/>
-      <w:r>
-        <w:rPr>
-          <w:rFonts w:eastAsia="Calibri"/>
-        </w:rPr>
-        <w:t xml:space="preserve">(  </w:t>
-      </w:r>
-      <w:proofErr w:type="gramEnd"/>
-      <w:r>
-        <w:rPr>
-          <w:rFonts w:eastAsia="Calibri"/>
-        </w:rPr>
-        <w:t xml:space="preserve">   )   PERSONAL SERVICE (     )   ELECTRONIC SERVICE (     ) </w:t>
+        <w:t xml:space="preserve">MAIL (     )   PERSONAL SERVICE (     )   ELECTRONIC SERVICE (     ) </w:t>
       </w:r>
     </w:p>
     <w:p>
@@ -3867,21 +3181,7 @@
         <w:rPr>
           <w:rFonts w:eastAsia="Calibri"/>
         </w:rPr>
-        <w:t xml:space="preserve">TO: RESPONDENT </w:t>
-      </w:r>
-      <w:proofErr w:type="gramStart"/>
-      <w:r>
-        <w:rPr>
-          <w:rFonts w:eastAsia="Calibri"/>
-        </w:rPr>
-        <w:t xml:space="preserve">(  </w:t>
-      </w:r>
-      <w:proofErr w:type="gramEnd"/>
-      <w:r>
-        <w:rPr>
-          <w:rFonts w:eastAsia="Calibri"/>
-        </w:rPr>
-        <w:t xml:space="preserve">   )    RESPONDENT’S C/O CUSTODIAL OFFICER (     )   RESPONDENT’S ATTY/REP (     )    DHS (     ) </w:t>
+        <w:t xml:space="preserve">TO: RESPONDENT (     )    RESPONDENT’S C/O CUSTODIAL OFFICER (     )   RESPONDENT’S ATTY/REP (     )    DHS (     ) </w:t>
       </w:r>
     </w:p>
     <w:p>
@@ -3894,19 +3194,11 @@
           <w:rFonts w:eastAsia="Calibri"/>
         </w:rPr>
       </w:pPr>
-      <w:proofErr w:type="gramStart"/>
-      <w:r>
-        <w:rPr>
-          <w:rFonts w:eastAsia="Calibri"/>
-        </w:rPr>
-        <w:t>DATE:_</w:t>
-      </w:r>
-      <w:proofErr w:type="gramEnd"/>
-      <w:r>
-        <w:rPr>
-          <w:rFonts w:eastAsia="Calibri"/>
-        </w:rPr>
-        <w:t>___________________   BY: COURT STAFF_________________________________</w:t>
+      <w:r>
+        <w:rPr>
+          <w:rFonts w:eastAsia="Calibri"/>
+        </w:rPr>
+        <w:t>DATE:____________________   BY: COURT STAFF_________________________________</w:t>
       </w:r>
     </w:p>
     <w:p>
@@ -3923,21 +3215,7 @@
         <w:rPr>
           <w:rFonts w:eastAsia="Calibri"/>
         </w:rPr>
-        <w:t xml:space="preserve">ATTACHMENTS: EOIR-33 </w:t>
-      </w:r>
-      <w:proofErr w:type="gramStart"/>
-      <w:r>
-        <w:rPr>
-          <w:rFonts w:eastAsia="Calibri"/>
-        </w:rPr>
-        <w:t xml:space="preserve">(  </w:t>
-      </w:r>
-      <w:proofErr w:type="gramEnd"/>
-      <w:r>
-        <w:rPr>
-          <w:rFonts w:eastAsia="Calibri"/>
-        </w:rPr>
-        <w:t xml:space="preserve">   )   EOIR-28 (    )   LEGAL SERVICES LIST (   )    OTHER</w:t>
+        <w:t>ATTACHMENTS: EOIR-33 (     )   EOIR-28 (    )   LEGAL SERVICES LIST (   )    OTHER</w:t>
       </w:r>
     </w:p>
     <w:p>
@@ -3991,14 +3269,12 @@
         </w:rPr>
         <w:t xml:space="preserve">{%p if </w:t>
       </w:r>
-      <w:proofErr w:type="spellStart"/>
       <w:r>
         <w:rPr>
           <w:bCs/>
         </w:rPr>
         <w:t>motion_users</w:t>
       </w:r>
-      <w:proofErr w:type="spellEnd"/>
       <w:r>
         <w:rPr>
           <w:bCs/>
@@ -4021,28 +3297,18 @@
           <w:bCs/>
         </w:rPr>
       </w:pPr>
-      <w:proofErr w:type="gramStart"/>
       <w:r>
         <w:rPr>
           <w:bCs/>
         </w:rPr>
         <w:t xml:space="preserve">{{ </w:t>
       </w:r>
-      <w:proofErr w:type="spellStart"/>
-      <w:r>
-        <w:rPr>
-          <w:bCs/>
-        </w:rPr>
-        <w:t>motion</w:t>
-      </w:r>
-      <w:proofErr w:type="gramEnd"/>
-      <w:r>
-        <w:rPr>
-          <w:bCs/>
-        </w:rPr>
-        <w:t>_users</w:t>
-      </w:r>
-      <w:proofErr w:type="spellEnd"/>
+      <w:r>
+        <w:rPr>
+          <w:bCs/>
+        </w:rPr>
+        <w:t>motion_users</w:t>
+      </w:r>
       <w:r>
         <w:rPr>
           <w:bCs/>
@@ -4059,27 +3325,13 @@
         <w:rPr>
           <w:bCs/>
         </w:rPr>
-        <w:t>.</w:t>
-      </w:r>
-      <w:proofErr w:type="spellStart"/>
-      <w:r>
-        <w:rPr>
-          <w:bCs/>
-        </w:rPr>
-        <w:t>name</w:t>
-      </w:r>
-      <w:r>
-        <w:rPr>
-          <w:bCs/>
-        </w:rPr>
-        <w:t>.lastfirst</w:t>
-      </w:r>
-      <w:proofErr w:type="spellEnd"/>
-      <w:r>
-        <w:rPr>
-          <w:bCs/>
-        </w:rPr>
-        <w:t>()</w:t>
+        <w:t>.name</w:t>
+      </w:r>
+      <w:r>
+        <w:rPr>
+          <w:bCs/>
+        </w:rPr>
+        <w:t>.lastfirst()</w:t>
       </w:r>
       <w:r>
         <w:rPr>
@@ -4096,14 +3348,12 @@
         </w:rPr>
         <w:t xml:space="preserve">{{ </w:t>
       </w:r>
-      <w:proofErr w:type="spellStart"/>
       <w:r>
         <w:rPr>
           <w:bCs/>
         </w:rPr>
         <w:t>motion_users</w:t>
       </w:r>
-      <w:proofErr w:type="spellEnd"/>
       <w:r>
         <w:rPr>
           <w:bCs/>
@@ -4120,27 +3370,13 @@
         <w:rPr>
           <w:bCs/>
         </w:rPr>
-        <w:t>.</w:t>
-      </w:r>
-      <w:proofErr w:type="spellStart"/>
-      <w:r>
-        <w:rPr>
-          <w:bCs/>
-        </w:rPr>
-        <w:t>name</w:t>
-      </w:r>
-      <w:r>
-        <w:rPr>
-          <w:bCs/>
-        </w:rPr>
-        <w:t>.middle</w:t>
-      </w:r>
-      <w:proofErr w:type="spellEnd"/>
-      <w:r>
-        <w:rPr>
-          <w:bCs/>
-        </w:rPr>
-        <w:t xml:space="preserve"> </w:t>
+        <w:t>.name</w:t>
+      </w:r>
+      <w:r>
+        <w:rPr>
+          <w:bCs/>
+        </w:rPr>
+        <w:t xml:space="preserve">.middle </w:t>
       </w:r>
       <w:r>
         <w:rPr>
@@ -4174,14 +3410,12 @@
         </w:rPr>
         <w:t xml:space="preserve">A# {{ </w:t>
       </w:r>
-      <w:proofErr w:type="spellStart"/>
       <w:r>
         <w:rPr>
           <w:bCs/>
         </w:rPr>
         <w:t>motion_users</w:t>
       </w:r>
-      <w:proofErr w:type="spellEnd"/>
       <w:r>
         <w:rPr>
           <w:bCs/>
@@ -4194,19 +3428,11 @@
         </w:rPr>
         <w:t>].</w:t>
       </w:r>
-      <w:proofErr w:type="spellStart"/>
-      <w:r>
-        <w:rPr>
-          <w:bCs/>
-        </w:rPr>
-        <w:t>a_number</w:t>
-      </w:r>
-      <w:proofErr w:type="spellEnd"/>
-      <w:r>
-        <w:rPr>
-          <w:bCs/>
-        </w:rPr>
-        <w:t xml:space="preserve"> }}</w:t>
+      <w:r>
+        <w:rPr>
+          <w:bCs/>
+        </w:rPr>
+        <w:t>a_number }}</w:t>
       </w:r>
     </w:p>
     <w:p>
@@ -4273,14 +3499,12 @@
         </w:rPr>
         <w:t xml:space="preserve">{%p for x in </w:t>
       </w:r>
-      <w:proofErr w:type="spellStart"/>
       <w:r>
         <w:rPr>
           <w:bCs/>
         </w:rPr>
         <w:t>motion_users</w:t>
       </w:r>
-      <w:proofErr w:type="spellEnd"/>
       <w:r>
         <w:rPr>
           <w:bCs/>
@@ -4303,27 +3527,11 @@
         </w:rPr>
         <w:t>{{</w:t>
       </w:r>
-      <w:proofErr w:type="spellStart"/>
-      <w:r>
-        <w:rPr>
-          <w:bCs/>
-        </w:rPr>
-        <w:t>x.</w:t>
-      </w:r>
-      <w:proofErr w:type="gramStart"/>
-      <w:r>
-        <w:rPr>
-          <w:bCs/>
-        </w:rPr>
-        <w:t>name.lastfirst</w:t>
-      </w:r>
-      <w:proofErr w:type="spellEnd"/>
-      <w:proofErr w:type="gramEnd"/>
-      <w:r>
-        <w:rPr>
-          <w:bCs/>
-        </w:rPr>
-        <w:t>(</w:t>
+      <w:r>
+        <w:rPr>
+          <w:bCs/>
+        </w:rPr>
+        <w:t>x.name.lastfirst(</w:t>
       </w:r>
       <w:r>
         <w:rPr>
@@ -4335,16 +3543,8 @@
         <w:rPr>
           <w:bCs/>
         </w:rPr>
-        <w:t>}} {{</w:t>
-      </w:r>
-      <w:proofErr w:type="spellStart"/>
-      <w:r>
-        <w:rPr>
-          <w:bCs/>
-        </w:rPr>
-        <w:t>x.name.middle</w:t>
-      </w:r>
-      <w:proofErr w:type="spellEnd"/>
+        <w:t>}} {{x.name.middle</w:t>
+      </w:r>
       <w:r>
         <w:rPr>
           <w:bCs/>
@@ -4381,27 +3581,13 @@
         <w:rPr>
           <w:bCs/>
         </w:rPr>
-        <w:t xml:space="preserve"> </w:t>
-      </w:r>
-      <w:proofErr w:type="spellStart"/>
-      <w:r>
-        <w:rPr>
-          <w:bCs/>
-        </w:rPr>
-        <w:t>x.</w:t>
-      </w:r>
-      <w:r>
-        <w:rPr>
-          <w:bCs/>
-        </w:rPr>
-        <w:t>a_number</w:t>
-      </w:r>
-      <w:proofErr w:type="spellEnd"/>
-      <w:r>
-        <w:rPr>
-          <w:bCs/>
-        </w:rPr>
-        <w:t xml:space="preserve"> }}</w:t>
+        <w:t xml:space="preserve"> x.</w:t>
+      </w:r>
+      <w:r>
+        <w:rPr>
+          <w:bCs/>
+        </w:rPr>
+        <w:t>a_number }}</w:t>
       </w:r>
     </w:p>
     <w:p>
@@ -4417,21 +3603,7 @@
         <w:rPr>
           <w:bCs/>
         </w:rPr>
-        <w:t xml:space="preserve">{%p </w:t>
-      </w:r>
-      <w:proofErr w:type="spellStart"/>
-      <w:r>
-        <w:rPr>
-          <w:bCs/>
-        </w:rPr>
-        <w:t>endfor</w:t>
-      </w:r>
-      <w:proofErr w:type="spellEnd"/>
-      <w:r>
-        <w:rPr>
-          <w:bCs/>
-        </w:rPr>
-        <w:t xml:space="preserve"> %}</w:t>
+        <w:t>{%p endfor %}</w:t>
       </w:r>
     </w:p>
     <w:p>
@@ -4524,14 +3696,12 @@
         </w:rPr>
         <w:t xml:space="preserve">{% if </w:t>
       </w:r>
-      <w:proofErr w:type="spellStart"/>
       <w:r>
         <w:rPr>
           <w:bCs/>
         </w:rPr>
         <w:t>cert_of_service</w:t>
       </w:r>
-      <w:proofErr w:type="spellEnd"/>
       <w:r>
         <w:rPr>
           <w:bCs/>
@@ -4545,15 +3715,7 @@
         <w:t>%}</w:t>
       </w:r>
       <w:r>
-        <w:t>{{ today().format("MM/dd/</w:t>
-      </w:r>
-      <w:proofErr w:type="spellStart"/>
-      <w:r>
-        <w:t>yyyy</w:t>
-      </w:r>
-      <w:proofErr w:type="spellEnd"/>
-      <w:r>
-        <w:t>"</w:t>
+        <w:t>{{ today().format("MM/dd/yyyy"</w:t>
       </w:r>
       <w:r>
         <w:t xml:space="preserve">) </w:t>
@@ -4573,19 +3735,11 @@
         </w:rPr>
         <w:t xml:space="preserve">{{ </w:t>
       </w:r>
-      <w:proofErr w:type="spellStart"/>
-      <w:r>
-        <w:rPr>
-          <w:bCs/>
-        </w:rPr>
-        <w:t>motion_users</w:t>
-      </w:r>
-      <w:proofErr w:type="spellEnd"/>
-      <w:r>
-        <w:rPr>
-          <w:bCs/>
-        </w:rPr>
-        <w:t>[0]</w:t>
+      <w:r>
+        <w:rPr>
+          <w:bCs/>
+        </w:rPr>
+        <w:t>motion_users[0]</w:t>
       </w:r>
       <w:r>
         <w:rPr>
@@ -4593,7 +3747,6 @@
         </w:rPr>
         <w:t>.</w:t>
       </w:r>
-      <w:proofErr w:type="spellStart"/>
       <w:r>
         <w:rPr>
           <w:bCs/>
@@ -4612,7 +3765,6 @@
         </w:rPr>
         <w:t>full</w:t>
       </w:r>
-      <w:proofErr w:type="spellEnd"/>
       <w:r>
         <w:rPr>
           <w:bCs/>
@@ -4683,7 +3835,6 @@
         </w:rPr>
         <w:t xml:space="preserve">{{ </w:t>
       </w:r>
-      <w:proofErr w:type="spellStart"/>
       <w:r>
         <w:rPr>
           <w:bCs/>
@@ -4706,14 +3857,7 @@
         <w:rPr>
           <w:bCs/>
         </w:rPr>
-        <w:t>city</w:t>
-      </w:r>
-      <w:proofErr w:type="spellEnd"/>
-      <w:r>
-        <w:rPr>
-          <w:bCs/>
-        </w:rPr>
-        <w:t xml:space="preserve"> }},</w:t>
+        <w:t>city }},</w:t>
       </w:r>
       <w:r>
         <w:rPr>
@@ -4727,7 +3871,6 @@
         </w:rPr>
         <w:t xml:space="preserve">{{ </w:t>
       </w:r>
-      <w:proofErr w:type="spellStart"/>
       <w:r>
         <w:rPr>
           <w:bCs/>
@@ -4750,14 +3893,7 @@
         <w:rPr>
           <w:bCs/>
         </w:rPr>
-        <w:t>state</w:t>
-      </w:r>
-      <w:proofErr w:type="spellEnd"/>
-      <w:r>
-        <w:rPr>
-          <w:bCs/>
-        </w:rPr>
-        <w:t xml:space="preserve"> }}</w:t>
+        <w:t>state }}</w:t>
       </w:r>
       <w:r>
         <w:rPr>
@@ -4785,7 +3921,6 @@
       <w:r>
         <w:t xml:space="preserve">{ </w:t>
       </w:r>
-      <w:proofErr w:type="spellStart"/>
       <w:r>
         <w:rPr>
           <w:bCs/>
@@ -4799,11 +3934,7 @@
         <w:t>.address</w:t>
       </w:r>
       <w:r>
-        <w:t>.on_one_line</w:t>
-      </w:r>
-      <w:proofErr w:type="spellEnd"/>
-      <w:r>
-        <w:t>(</w:t>
+        <w:t>.on_one_line(</w:t>
       </w:r>
       <w:r>
         <w:t>bare=True</w:t>
@@ -6253,6 +5384,7 @@
   <w:style w:type="character" w:default="1" w:styleId="DefaultParagraphFont">
     <w:name w:val="Default Paragraph Font"/>
     <w:uiPriority w:val="1"/>
+    <w:semiHidden/>
     <w:unhideWhenUsed/>
   </w:style>
   <w:style w:type="table" w:default="1" w:styleId="TableNormal">
@@ -6721,6 +5853,27 @@
 </file>
 
 <file path=customXml/item1.xml><?xml version="1.0" encoding="utf-8"?>
+<?mso-contentType ?>
+<FormTemplates xmlns="http://schemas.microsoft.com/sharepoint/v3/contenttype/forms">
+  <Display>DocumentLibraryForm</Display>
+  <Edit>DocumentLibraryForm</Edit>
+  <New>DocumentLibraryForm</New>
+</FormTemplates>
+</file>
+
+<file path=customXml/item2.xml><?xml version="1.0" encoding="utf-8"?>
+<p:properties xmlns:p="http://schemas.microsoft.com/office/2006/metadata/properties" xmlns:xsi="http://www.w3.org/2001/XMLSchema-instance" xmlns:pc="http://schemas.microsoft.com/office/infopath/2007/PartnerControls">
+  <documentManagement>
+    <TaxCatchAll xmlns="fc2e0b91-73db-4711-986b-9e7114b1c780" xsi:nil="true"/>
+    <lcf76f155ced4ddcb4097134ff3c332f xmlns="aa22b7f0-1c77-4983-9187-bff8e7aaefd5">
+      <Terms xmlns="http://schemas.microsoft.com/office/infopath/2007/PartnerControls"/>
+    </lcf76f155ced4ddcb4097134ff3c332f>
+    <Note xmlns="aa22b7f0-1c77-4983-9187-bff8e7aaefd5" xsi:nil="true"/>
+  </documentManagement>
+</p:properties>
+</file>
+
+<file path=customXml/item3.xml><?xml version="1.0" encoding="utf-8"?>
 <ct:contentTypeSchema xmlns:ct="http://schemas.microsoft.com/office/2006/metadata/contentType" xmlns:ma="http://schemas.microsoft.com/office/2006/metadata/properties/metaAttributes" ct:_="" ma:_="" ma:contentTypeName="Document" ma:contentTypeID="0x01010041FCC52ECBA99C44897D8B99E45B6EB2" ma:contentTypeVersion="20" ma:contentTypeDescription="Create a new document." ma:contentTypeScope="" ma:versionID="98dd51a1eb8d717f429cfb72bbcdf291">
   <xsd:schema xmlns:xsd="http://www.w3.org/2001/XMLSchema" xmlns:xs="http://www.w3.org/2001/XMLSchema" xmlns:p="http://schemas.microsoft.com/office/2006/metadata/properties" xmlns:ns2="aa22b7f0-1c77-4983-9187-bff8e7aaefd5" xmlns:ns3="fc2e0b91-73db-4711-986b-9e7114b1c780" targetNamespace="http://schemas.microsoft.com/office/2006/metadata/properties" ma:root="true" ma:fieldsID="764fccced344541160bdf3d7a4f43fd4" ns2:_="" ns3:_="">
     <xsd:import namespace="aa22b7f0-1c77-4983-9187-bff8e7aaefd5"/>
@@ -6977,28 +6130,26 @@
 </ct:contentTypeSchema>
 </file>
 
-<file path=customXml/item2.xml><?xml version="1.0" encoding="utf-8"?>
-<p:properties xmlns:p="http://schemas.microsoft.com/office/2006/metadata/properties" xmlns:xsi="http://www.w3.org/2001/XMLSchema-instance" xmlns:pc="http://schemas.microsoft.com/office/infopath/2007/PartnerControls">
-  <documentManagement>
-    <TaxCatchAll xmlns="fc2e0b91-73db-4711-986b-9e7114b1c780" xsi:nil="true"/>
-    <lcf76f155ced4ddcb4097134ff3c332f xmlns="aa22b7f0-1c77-4983-9187-bff8e7aaefd5">
-      <Terms xmlns="http://schemas.microsoft.com/office/infopath/2007/PartnerControls"/>
-    </lcf76f155ced4ddcb4097134ff3c332f>
-    <Note xmlns="aa22b7f0-1c77-4983-9187-bff8e7aaefd5" xsi:nil="true"/>
-  </documentManagement>
-</p:properties>
+<file path=customXml/itemProps1.xml><?xml version="1.0" encoding="utf-8"?>
+<ds:datastoreItem xmlns:ds="http://schemas.openxmlformats.org/officeDocument/2006/customXml" ds:itemID="{61801A56-0FD2-4394-93D8-612F28940603}">
+  <ds:schemaRefs>
+    <ds:schemaRef ds:uri="http://schemas.microsoft.com/sharepoint/v3/contenttype/forms"/>
+  </ds:schemaRefs>
+</ds:datastoreItem>
 </file>
 
-<file path=customXml/item3.xml><?xml version="1.0" encoding="utf-8"?>
-<?mso-contentType ?>
-<FormTemplates xmlns="http://schemas.microsoft.com/sharepoint/v3/contenttype/forms">
-  <Display>DocumentLibraryForm</Display>
-  <Edit>DocumentLibraryForm</Edit>
-  <New>DocumentLibraryForm</New>
-</FormTemplates>
+<file path=customXml/itemProps2.xml><?xml version="1.0" encoding="utf-8"?>
+<ds:datastoreItem xmlns:ds="http://schemas.openxmlformats.org/officeDocument/2006/customXml" ds:itemID="{20C66F9F-F7B4-4B87-8910-A2DDB634D5E0}">
+  <ds:schemaRefs>
+    <ds:schemaRef ds:uri="http://schemas.microsoft.com/office/2006/metadata/properties"/>
+    <ds:schemaRef ds:uri="http://schemas.microsoft.com/office/infopath/2007/PartnerControls"/>
+    <ds:schemaRef ds:uri="fc2e0b91-73db-4711-986b-9e7114b1c780"/>
+    <ds:schemaRef ds:uri="aa22b7f0-1c77-4983-9187-bff8e7aaefd5"/>
+  </ds:schemaRefs>
+</ds:datastoreItem>
 </file>
 
-<file path=customXml/itemProps1.xml><?xml version="1.0" encoding="utf-8"?>
+<file path=customXml/itemProps3.xml><?xml version="1.0" encoding="utf-8"?>
 <ds:datastoreItem xmlns:ds="http://schemas.openxmlformats.org/officeDocument/2006/customXml" ds:itemID="{82045B43-7134-4D42-9F91-65658FCA0A3C}">
   <ds:schemaRefs>
     <ds:schemaRef ds:uri="http://schemas.microsoft.com/office/2006/metadata/contentType"/>
@@ -7015,23 +6166,4 @@
     <ds:schemaRef ds:uri="http://schemas.microsoft.com/internal/obd"/>
   </ds:schemaRefs>
 </ds:datastoreItem>
-</file>
-
-<file path=customXml/itemProps2.xml><?xml version="1.0" encoding="utf-8"?>
-<ds:datastoreItem xmlns:ds="http://schemas.openxmlformats.org/officeDocument/2006/customXml" ds:itemID="{20C66F9F-F7B4-4B87-8910-A2DDB634D5E0}">
-  <ds:schemaRefs>
-    <ds:schemaRef ds:uri="http://schemas.microsoft.com/office/2006/metadata/properties"/>
-    <ds:schemaRef ds:uri="http://schemas.microsoft.com/office/infopath/2007/PartnerControls"/>
-    <ds:schemaRef ds:uri="fc2e0b91-73db-4711-986b-9e7114b1c780"/>
-    <ds:schemaRef ds:uri="aa22b7f0-1c77-4983-9187-bff8e7aaefd5"/>
-  </ds:schemaRefs>
-</ds:datastoreItem>
-</file>
-
-<file path=customXml/itemProps3.xml><?xml version="1.0" encoding="utf-8"?>
-<ds:datastoreItem xmlns:ds="http://schemas.openxmlformats.org/officeDocument/2006/customXml" ds:itemID="{61801A56-0FD2-4394-93D8-612F28940603}">
-  <ds:schemaRefs>
-    <ds:schemaRef ds:uri="http://schemas.microsoft.com/sharepoint/v3/contenttype/forms"/>
-  </ds:schemaRefs>
-</ds:datastoreItem>
 </file>
</xml_diff>

<commit_message>
Some text updates and fixed address/cert of service issue.
</commit_message>
<xml_diff>
--- a/docassemble/USCISApplications/data/templates/COV_motion.docx
+++ b/docassemble/USCISApplications/data/templates/COV_motion.docx
@@ -49,6 +49,7 @@
         </w:rPr>
         <w:tab/>
       </w:r>
+      <w:proofErr w:type="spellStart"/>
       <w:r>
         <w:rPr>
           <w:b/>
@@ -56,6 +57,7 @@
         </w:rPr>
         <w:t>NonDetained</w:t>
       </w:r>
+      <w:proofErr w:type="spellEnd"/>
     </w:p>
     <w:p/>
     <w:p/>
@@ -119,8 +121,38 @@
         <w:rPr>
           <w:b/>
         </w:rPr>
-        <w:t>{% if dhs.different_court_location %}{{ dhs.court_city</w:t>
-      </w:r>
+        <w:t xml:space="preserve">{% if </w:t>
+      </w:r>
+      <w:proofErr w:type="spellStart"/>
+      <w:proofErr w:type="gramStart"/>
+      <w:r>
+        <w:rPr>
+          <w:b/>
+        </w:rPr>
+        <w:t>dhs.different</w:t>
+      </w:r>
+      <w:proofErr w:type="gramEnd"/>
+      <w:r>
+        <w:rPr>
+          <w:b/>
+        </w:rPr>
+        <w:t>_court_location</w:t>
+      </w:r>
+      <w:proofErr w:type="spellEnd"/>
+      <w:r>
+        <w:rPr>
+          <w:b/>
+        </w:rPr>
+        <w:t xml:space="preserve"> %}{{ </w:t>
+      </w:r>
+      <w:proofErr w:type="spellStart"/>
+      <w:r>
+        <w:rPr>
+          <w:b/>
+        </w:rPr>
+        <w:t>dhs.court_city</w:t>
+      </w:r>
+      <w:proofErr w:type="spellEnd"/>
       <w:r>
         <w:rPr>
           <w:b/>
@@ -133,18 +165,28 @@
         </w:rPr>
         <w:t xml:space="preserve">upper }}, {{ </w:t>
       </w:r>
-      <w:r>
-        <w:rPr>
-          <w:b/>
-        </w:rPr>
-        <w:t>state_name(</w:t>
-      </w:r>
+      <w:proofErr w:type="spellStart"/>
+      <w:r>
+        <w:rPr>
+          <w:b/>
+        </w:rPr>
+        <w:t>state_name</w:t>
+      </w:r>
+      <w:proofErr w:type="spellEnd"/>
+      <w:r>
+        <w:rPr>
+          <w:b/>
+        </w:rPr>
+        <w:t>(</w:t>
+      </w:r>
+      <w:proofErr w:type="spellStart"/>
       <w:r>
         <w:rPr>
           <w:b/>
         </w:rPr>
         <w:t>dhs.court_state</w:t>
       </w:r>
+      <w:proofErr w:type="spellEnd"/>
       <w:r>
         <w:rPr>
           <w:b/>
@@ -161,8 +203,16 @@
         <w:rPr>
           <w:b/>
         </w:rPr>
-        <w:t>upper }}{% else %}{{ dhs.address.city</w:t>
-      </w:r>
+        <w:t xml:space="preserve">upper }}{% else %}{{ </w:t>
+      </w:r>
+      <w:proofErr w:type="spellStart"/>
+      <w:r>
+        <w:rPr>
+          <w:b/>
+        </w:rPr>
+        <w:t>dhs.address.city</w:t>
+      </w:r>
+      <w:proofErr w:type="spellEnd"/>
       <w:r>
         <w:rPr>
           <w:b/>
@@ -178,12 +228,21 @@
         </w:rPr>
         <w:t xml:space="preserve">upper }}, {{ </w:t>
       </w:r>
-      <w:r>
-        <w:rPr>
-          <w:b/>
-        </w:rPr>
-        <w:t>state_name(</w:t>
-      </w:r>
+      <w:proofErr w:type="spellStart"/>
+      <w:r>
+        <w:rPr>
+          <w:b/>
+        </w:rPr>
+        <w:t>state_name</w:t>
+      </w:r>
+      <w:proofErr w:type="spellEnd"/>
+      <w:r>
+        <w:rPr>
+          <w:b/>
+        </w:rPr>
+        <w:t>(</w:t>
+      </w:r>
+      <w:proofErr w:type="spellStart"/>
       <w:r>
         <w:rPr>
           <w:b/>
@@ -196,6 +255,7 @@
         </w:rPr>
         <w:t>state</w:t>
       </w:r>
+      <w:proofErr w:type="spellEnd"/>
       <w:r>
         <w:rPr>
           <w:b/>
@@ -272,6 +332,7 @@
         </w:rPr>
         <w:t xml:space="preserve"> of:</w:t>
       </w:r>
+      <w:proofErr w:type="gramStart"/>
       <w:r>
         <w:tab/>
       </w:r>
@@ -281,6 +342,7 @@
       <w:r>
         <w:t>)</w:t>
       </w:r>
+      <w:proofErr w:type="gramEnd"/>
       <w:r>
         <w:rPr>
           <w:bCs/>
@@ -338,6 +400,7 @@
         </w:rPr>
         <w:t xml:space="preserve">{%p if </w:t>
       </w:r>
+      <w:proofErr w:type="spellStart"/>
       <w:r>
         <w:rPr>
           <w:bCs/>
@@ -354,7 +417,14 @@
         <w:rPr>
           <w:bCs/>
         </w:rPr>
-        <w:t>users | length == 1</w:t>
+        <w:t>users</w:t>
+      </w:r>
+      <w:proofErr w:type="spellEnd"/>
+      <w:r>
+        <w:rPr>
+          <w:bCs/>
+        </w:rPr>
+        <w:t xml:space="preserve"> | length == 1</w:t>
       </w:r>
       <w:r>
         <w:rPr>
@@ -378,50 +448,90 @@
           <w:bCs/>
         </w:rPr>
       </w:pPr>
+      <w:proofErr w:type="gramStart"/>
       <w:r>
         <w:rPr>
           <w:bCs/>
         </w:rPr>
         <w:t xml:space="preserve">{{ </w:t>
       </w:r>
+      <w:proofErr w:type="spellStart"/>
+      <w:r>
+        <w:rPr>
+          <w:bCs/>
+        </w:rPr>
+        <w:t>motion</w:t>
+      </w:r>
+      <w:proofErr w:type="gramEnd"/>
+      <w:r>
+        <w:rPr>
+          <w:bCs/>
+        </w:rPr>
+        <w:t>_users</w:t>
+      </w:r>
+      <w:proofErr w:type="spellEnd"/>
+      <w:r>
+        <w:rPr>
+          <w:bCs/>
+        </w:rPr>
+        <w:t>[0].</w:t>
+      </w:r>
+      <w:proofErr w:type="spellStart"/>
+      <w:r>
+        <w:rPr>
+          <w:bCs/>
+        </w:rPr>
+        <w:t>name.lastfirst</w:t>
+      </w:r>
+      <w:proofErr w:type="spellEnd"/>
+      <w:r>
+        <w:rPr>
+          <w:bCs/>
+        </w:rPr>
+        <w:t>()</w:t>
+      </w:r>
+      <w:r>
+        <w:rPr>
+          <w:bCs/>
+        </w:rPr>
+        <w:t>}}</w:t>
+      </w:r>
+      <w:r>
+        <w:t xml:space="preserve"> </w:t>
+      </w:r>
+      <w:r>
+        <w:rPr>
+          <w:bCs/>
+        </w:rPr>
+        <w:t xml:space="preserve">{{ </w:t>
+      </w:r>
+      <w:proofErr w:type="spellStart"/>
       <w:r>
         <w:rPr>
           <w:bCs/>
         </w:rPr>
         <w:t>motion_users</w:t>
       </w:r>
-      <w:r>
-        <w:rPr>
-          <w:bCs/>
-        </w:rPr>
-        <w:t>[0].name.lastfirst()</w:t>
-      </w:r>
-      <w:r>
-        <w:rPr>
-          <w:bCs/>
-        </w:rPr>
-        <w:t>}}</w:t>
-      </w:r>
-      <w:r>
-        <w:t xml:space="preserve"> </w:t>
-      </w:r>
-      <w:r>
-        <w:rPr>
-          <w:bCs/>
-        </w:rPr>
-        <w:t xml:space="preserve">{{ </w:t>
-      </w:r>
-      <w:r>
-        <w:rPr>
-          <w:bCs/>
-        </w:rPr>
-        <w:t>motion_users</w:t>
-      </w:r>
-      <w:r>
-        <w:rPr>
-          <w:bCs/>
-        </w:rPr>
-        <w:t xml:space="preserve">[0].name.middle </w:t>
+      <w:proofErr w:type="spellEnd"/>
+      <w:r>
+        <w:rPr>
+          <w:bCs/>
+        </w:rPr>
+        <w:t>[0].</w:t>
+      </w:r>
+      <w:proofErr w:type="spellStart"/>
+      <w:r>
+        <w:rPr>
+          <w:bCs/>
+        </w:rPr>
+        <w:t>name.middle</w:t>
+      </w:r>
+      <w:proofErr w:type="spellEnd"/>
+      <w:r>
+        <w:rPr>
+          <w:bCs/>
+        </w:rPr>
+        <w:t xml:space="preserve"> </w:t>
       </w:r>
       <w:r>
         <w:rPr>
@@ -458,12 +568,14 @@
         </w:rPr>
         <w:t xml:space="preserve">A# {{ </w:t>
       </w:r>
+      <w:proofErr w:type="spellStart"/>
       <w:r>
         <w:rPr>
           <w:bCs/>
         </w:rPr>
         <w:t>motion_users</w:t>
       </w:r>
+      <w:proofErr w:type="spellEnd"/>
       <w:r>
         <w:rPr>
           <w:bCs/>
@@ -476,11 +588,19 @@
         </w:rPr>
         <w:t>].</w:t>
       </w:r>
-      <w:r>
-        <w:rPr>
-          <w:bCs/>
-        </w:rPr>
-        <w:t>a_number }}</w:t>
+      <w:proofErr w:type="spellStart"/>
+      <w:r>
+        <w:rPr>
+          <w:bCs/>
+        </w:rPr>
+        <w:t>a_number</w:t>
+      </w:r>
+      <w:proofErr w:type="spellEnd"/>
+      <w:r>
+        <w:rPr>
+          <w:bCs/>
+        </w:rPr>
+        <w:t xml:space="preserve"> }}</w:t>
       </w:r>
     </w:p>
     <w:p>
@@ -568,12 +688,14 @@
         </w:rPr>
         <w:t xml:space="preserve">{%p for x in </w:t>
       </w:r>
+      <w:proofErr w:type="spellStart"/>
       <w:r>
         <w:rPr>
           <w:bCs/>
         </w:rPr>
         <w:t>motion_users</w:t>
       </w:r>
+      <w:proofErr w:type="spellEnd"/>
       <w:r>
         <w:rPr>
           <w:bCs/>
@@ -596,18 +718,22 @@
         </w:rPr>
         <w:t>{{</w:t>
       </w:r>
+      <w:proofErr w:type="spellStart"/>
       <w:r>
         <w:rPr>
           <w:bCs/>
         </w:rPr>
         <w:t>x.</w:t>
       </w:r>
+      <w:proofErr w:type="gramStart"/>
       <w:r>
         <w:rPr>
           <w:bCs/>
         </w:rPr>
         <w:t>name.lastfirst</w:t>
       </w:r>
+      <w:proofErr w:type="spellEnd"/>
+      <w:proofErr w:type="gramEnd"/>
       <w:r>
         <w:rPr>
           <w:bCs/>
@@ -626,6 +752,7 @@
         </w:rPr>
         <w:t>}} {{</w:t>
       </w:r>
+      <w:proofErr w:type="spellStart"/>
       <w:r>
         <w:rPr>
           <w:bCs/>
@@ -638,6 +765,7 @@
         </w:rPr>
         <w:t>.name.middle</w:t>
       </w:r>
+      <w:proofErr w:type="spellEnd"/>
       <w:r>
         <w:rPr>
           <w:bCs/>
@@ -677,7 +805,14 @@
         <w:rPr>
           <w:bCs/>
         </w:rPr>
-        <w:t xml:space="preserve"> x</w:t>
+        <w:t xml:space="preserve"> </w:t>
+      </w:r>
+      <w:proofErr w:type="spellStart"/>
+      <w:r>
+        <w:rPr>
+          <w:bCs/>
+        </w:rPr>
+        <w:t>x</w:t>
       </w:r>
       <w:r>
         <w:rPr>
@@ -689,7 +824,14 @@
         <w:rPr>
           <w:bCs/>
         </w:rPr>
-        <w:t>a_number }}</w:t>
+        <w:t>a_number</w:t>
+      </w:r>
+      <w:proofErr w:type="spellEnd"/>
+      <w:r>
+        <w:rPr>
+          <w:bCs/>
+        </w:rPr>
+        <w:t xml:space="preserve"> }}</w:t>
       </w:r>
     </w:p>
     <w:p>
@@ -705,7 +847,21 @@
         <w:rPr>
           <w:bCs/>
         </w:rPr>
-        <w:t>{%p endfor %}</w:t>
+        <w:t xml:space="preserve">{%p </w:t>
+      </w:r>
+      <w:proofErr w:type="spellStart"/>
+      <w:r>
+        <w:rPr>
+          <w:bCs/>
+        </w:rPr>
+        <w:t>endfor</w:t>
+      </w:r>
+      <w:proofErr w:type="spellEnd"/>
+      <w:r>
+        <w:rPr>
+          <w:bCs/>
+        </w:rPr>
+        <w:t xml:space="preserve"> %}</w:t>
       </w:r>
     </w:p>
     <w:p>
@@ -792,12 +948,14 @@
           <w:tab w:val="left" w:pos="5220"/>
         </w:tabs>
       </w:pPr>
+      <w:proofErr w:type="gramStart"/>
       <w:r>
         <w:t>{</w:t>
       </w:r>
       <w:r>
         <w:t xml:space="preserve">{ </w:t>
       </w:r>
+      <w:proofErr w:type="spellStart"/>
       <w:r>
         <w:t>immigration_judge.</w:t>
       </w:r>
@@ -807,6 +965,7 @@
         </w:rPr>
         <w:t>name</w:t>
       </w:r>
+      <w:proofErr w:type="gramEnd"/>
       <w:r>
         <w:rPr>
           <w:bCs/>
@@ -819,6 +978,7 @@
         </w:rPr>
         <w:t>full</w:t>
       </w:r>
+      <w:proofErr w:type="spellEnd"/>
       <w:r>
         <w:rPr>
           <w:bCs/>
@@ -852,11 +1012,24 @@
       <w:r>
         <w:t xml:space="preserve">{ </w:t>
       </w:r>
+      <w:proofErr w:type="spellStart"/>
       <w:r>
         <w:t>hearing_datetime</w:t>
       </w:r>
       <w:r>
-        <w:t>.format(“MM/dd/yyyy”)</w:t>
+        <w:t>.format</w:t>
+      </w:r>
+      <w:proofErr w:type="spellEnd"/>
+      <w:r>
+        <w:t>(“MM/dd/</w:t>
+      </w:r>
+      <w:proofErr w:type="spellStart"/>
+      <w:r>
+        <w:t>yyyy</w:t>
+      </w:r>
+      <w:proofErr w:type="spellEnd"/>
+      <w:r>
+        <w:t>”)</w:t>
       </w:r>
       <w:r>
         <w:t xml:space="preserve"> </w:t>
@@ -1041,8 +1214,38 @@
         <w:rPr>
           <w:b/>
         </w:rPr>
-        <w:t>{% if dhs.different_court_location %}{{ dhs.court_city</w:t>
-      </w:r>
+        <w:t xml:space="preserve">{% if </w:t>
+      </w:r>
+      <w:proofErr w:type="spellStart"/>
+      <w:proofErr w:type="gramStart"/>
+      <w:r>
+        <w:rPr>
+          <w:b/>
+        </w:rPr>
+        <w:t>dhs.different</w:t>
+      </w:r>
+      <w:proofErr w:type="gramEnd"/>
+      <w:r>
+        <w:rPr>
+          <w:b/>
+        </w:rPr>
+        <w:t>_court_location</w:t>
+      </w:r>
+      <w:proofErr w:type="spellEnd"/>
+      <w:r>
+        <w:rPr>
+          <w:b/>
+        </w:rPr>
+        <w:t xml:space="preserve"> %}{{ </w:t>
+      </w:r>
+      <w:proofErr w:type="spellStart"/>
+      <w:r>
+        <w:rPr>
+          <w:b/>
+        </w:rPr>
+        <w:t>dhs.court_city</w:t>
+      </w:r>
+      <w:proofErr w:type="spellEnd"/>
       <w:r>
         <w:rPr>
           <w:b/>
@@ -1055,18 +1258,28 @@
         </w:rPr>
         <w:t xml:space="preserve">upper }}, {{ </w:t>
       </w:r>
-      <w:r>
-        <w:rPr>
-          <w:b/>
-        </w:rPr>
-        <w:t>state_name(</w:t>
-      </w:r>
+      <w:proofErr w:type="spellStart"/>
+      <w:r>
+        <w:rPr>
+          <w:b/>
+        </w:rPr>
+        <w:t>state_name</w:t>
+      </w:r>
+      <w:proofErr w:type="spellEnd"/>
+      <w:r>
+        <w:rPr>
+          <w:b/>
+        </w:rPr>
+        <w:t>(</w:t>
+      </w:r>
+      <w:proofErr w:type="spellStart"/>
       <w:r>
         <w:rPr>
           <w:b/>
         </w:rPr>
         <w:t>dhs.court_state</w:t>
       </w:r>
+      <w:proofErr w:type="spellEnd"/>
       <w:r>
         <w:rPr>
           <w:b/>
@@ -1077,8 +1290,16 @@
         <w:rPr>
           <w:b/>
         </w:rPr>
-        <w:t>upper }}{% else %}{{ dhs.address.city</w:t>
-      </w:r>
+        <w:t xml:space="preserve">upper }}{% else %}{{ </w:t>
+      </w:r>
+      <w:proofErr w:type="spellStart"/>
+      <w:r>
+        <w:rPr>
+          <w:b/>
+        </w:rPr>
+        <w:t>dhs.address.city</w:t>
+      </w:r>
+      <w:proofErr w:type="spellEnd"/>
       <w:r>
         <w:rPr>
           <w:b/>
@@ -1094,12 +1315,21 @@
         </w:rPr>
         <w:t xml:space="preserve">upper }}, {{ </w:t>
       </w:r>
-      <w:r>
-        <w:rPr>
-          <w:b/>
-        </w:rPr>
-        <w:t>state_name(</w:t>
-      </w:r>
+      <w:proofErr w:type="spellStart"/>
+      <w:r>
+        <w:rPr>
+          <w:b/>
+        </w:rPr>
+        <w:t>state_name</w:t>
+      </w:r>
+      <w:proofErr w:type="spellEnd"/>
+      <w:r>
+        <w:rPr>
+          <w:b/>
+        </w:rPr>
+        <w:t>(</w:t>
+      </w:r>
+      <w:proofErr w:type="spellStart"/>
       <w:r>
         <w:rPr>
           <w:b/>
@@ -1110,7 +1340,14 @@
         <w:rPr>
           <w:b/>
         </w:rPr>
-        <w:t xml:space="preserve">state) | </w:t>
+        <w:t>state</w:t>
+      </w:r>
+      <w:proofErr w:type="spellEnd"/>
+      <w:r>
+        <w:rPr>
+          <w:b/>
+        </w:rPr>
+        <w:t xml:space="preserve">) | </w:t>
       </w:r>
       <w:r>
         <w:rPr>
@@ -1134,12 +1371,14 @@
         </w:rPr>
         <w:t xml:space="preserve">{{ </w:t>
       </w:r>
+      <w:proofErr w:type="spellStart"/>
       <w:r>
         <w:rPr>
           <w:bCs/>
         </w:rPr>
         <w:t>motion_users</w:t>
       </w:r>
+      <w:proofErr w:type="spellEnd"/>
       <w:r>
         <w:rPr>
           <w:bCs/>
@@ -1158,6 +1397,7 @@
         </w:rPr>
         <w:t>].</w:t>
       </w:r>
+      <w:proofErr w:type="spellStart"/>
       <w:r>
         <w:rPr>
           <w:bCs/>
@@ -1176,6 +1416,7 @@
         </w:rPr>
         <w:t>full</w:t>
       </w:r>
+      <w:proofErr w:type="spellEnd"/>
       <w:r>
         <w:rPr>
           <w:bCs/>
@@ -1213,7 +1454,14 @@
         <w:rPr>
           <w:bCs/>
         </w:rPr>
-        <w:t>{% if dhs.</w:t>
+        <w:t xml:space="preserve">{% if </w:t>
+      </w:r>
+      <w:proofErr w:type="spellStart"/>
+      <w:r>
+        <w:rPr>
+          <w:bCs/>
+        </w:rPr>
+        <w:t>dhs.</w:t>
       </w:r>
       <w:r>
         <w:rPr>
@@ -1221,6 +1469,7 @@
         </w:rPr>
         <w:t>different_court_location</w:t>
       </w:r>
+      <w:proofErr w:type="spellEnd"/>
       <w:r>
         <w:rPr>
           <w:bCs/>
@@ -1233,6 +1482,7 @@
         </w:rPr>
         <w:t xml:space="preserve"> </w:t>
       </w:r>
+      <w:proofErr w:type="spellStart"/>
       <w:r>
         <w:rPr>
           <w:bCs/>
@@ -1251,6 +1501,7 @@
         </w:rPr>
         <w:t>court_city</w:t>
       </w:r>
+      <w:proofErr w:type="spellEnd"/>
       <w:r>
         <w:rPr>
           <w:bCs/>
@@ -1269,6 +1520,7 @@
         </w:rPr>
         <w:t xml:space="preserve">{{ </w:t>
       </w:r>
+      <w:proofErr w:type="spellStart"/>
       <w:r>
         <w:rPr>
           <w:bCs/>
@@ -1287,6 +1539,7 @@
         </w:rPr>
         <w:t>court_state</w:t>
       </w:r>
+      <w:proofErr w:type="spellEnd"/>
       <w:r>
         <w:rPr>
           <w:bCs/>
@@ -1305,6 +1558,7 @@
         </w:rPr>
         <w:t xml:space="preserve"> </w:t>
       </w:r>
+      <w:proofErr w:type="spellStart"/>
       <w:r>
         <w:rPr>
           <w:bCs/>
@@ -1327,7 +1581,14 @@
         <w:rPr>
           <w:bCs/>
         </w:rPr>
-        <w:t>city }},</w:t>
+        <w:t>city</w:t>
+      </w:r>
+      <w:proofErr w:type="spellEnd"/>
+      <w:r>
+        <w:rPr>
+          <w:bCs/>
+        </w:rPr>
+        <w:t xml:space="preserve"> }},</w:t>
       </w:r>
       <w:r>
         <w:rPr>
@@ -1341,6 +1602,7 @@
         </w:rPr>
         <w:t xml:space="preserve">{{ </w:t>
       </w:r>
+      <w:proofErr w:type="spellStart"/>
       <w:r>
         <w:rPr>
           <w:bCs/>
@@ -1363,7 +1625,14 @@
         <w:rPr>
           <w:bCs/>
         </w:rPr>
-        <w:t>state }}</w:t>
+        <w:t>state</w:t>
+      </w:r>
+      <w:proofErr w:type="spellEnd"/>
+      <w:r>
+        <w:rPr>
+          <w:bCs/>
+        </w:rPr>
+        <w:t xml:space="preserve"> }}</w:t>
       </w:r>
       <w:r>
         <w:t xml:space="preserve">{% endif %} to the immigration court in Chicago, IL. </w:t>
@@ -1398,18 +1667,28 @@
       <w:r>
         <w:t xml:space="preserve">I currently reside at </w:t>
       </w:r>
+      <w:proofErr w:type="gramStart"/>
       <w:r>
         <w:rPr>
           <w:bCs/>
         </w:rPr>
         <w:t xml:space="preserve">{{ </w:t>
       </w:r>
-      <w:r>
-        <w:rPr>
-          <w:bCs/>
-        </w:rPr>
-        <w:t>motion_users</w:t>
-      </w:r>
+      <w:proofErr w:type="spellStart"/>
+      <w:r>
+        <w:rPr>
+          <w:bCs/>
+        </w:rPr>
+        <w:t>motion</w:t>
+      </w:r>
+      <w:proofErr w:type="gramEnd"/>
+      <w:r>
+        <w:rPr>
+          <w:bCs/>
+        </w:rPr>
+        <w:t>_users</w:t>
+      </w:r>
+      <w:proofErr w:type="spellEnd"/>
       <w:r>
         <w:rPr>
           <w:bCs/>
@@ -1428,11 +1707,19 @@
         </w:rPr>
         <w:t>].</w:t>
       </w:r>
-      <w:r>
-        <w:rPr>
-          <w:bCs/>
-        </w:rPr>
-        <w:t xml:space="preserve">address.on_one_line(bare=True) </w:t>
+      <w:proofErr w:type="spellStart"/>
+      <w:r>
+        <w:rPr>
+          <w:bCs/>
+        </w:rPr>
+        <w:t>address.on_one_line</w:t>
+      </w:r>
+      <w:proofErr w:type="spellEnd"/>
+      <w:r>
+        <w:rPr>
+          <w:bCs/>
+        </w:rPr>
+        <w:t xml:space="preserve">(bare=True) </w:t>
       </w:r>
       <w:r>
         <w:rPr>
@@ -1443,6 +1730,7 @@
       <w:r>
         <w:t xml:space="preserve">. I have been in the United States since </w:t>
       </w:r>
+      <w:proofErr w:type="gramStart"/>
       <w:r>
         <w:t>{{</w:t>
       </w:r>
@@ -1455,11 +1743,20 @@
         </w:rPr>
         <w:t xml:space="preserve"> </w:t>
       </w:r>
-      <w:r>
-        <w:t>entry_to_us_date</w:t>
-      </w:r>
-      <w:r>
-        <w:t>.format("M</w:t>
+      <w:proofErr w:type="spellStart"/>
+      <w:r>
+        <w:t>entry</w:t>
+      </w:r>
+      <w:proofErr w:type="gramEnd"/>
+      <w:r>
+        <w:t>_to_us_date</w:t>
+      </w:r>
+      <w:r>
+        <w:t>.format</w:t>
+      </w:r>
+      <w:proofErr w:type="spellEnd"/>
+      <w:r>
+        <w:t>("M</w:t>
       </w:r>
       <w:r>
         <w:t>MM</w:t>
@@ -1476,8 +1773,13 @@
       <w:r>
         <w:t xml:space="preserve">, </w:t>
       </w:r>
-      <w:r>
-        <w:t>yyyy") }}</w:t>
+      <w:proofErr w:type="spellStart"/>
+      <w:r>
+        <w:t>yyyy</w:t>
+      </w:r>
+      <w:proofErr w:type="spellEnd"/>
+      <w:r>
+        <w:t>") }}</w:t>
       </w:r>
       <w:r>
         <w:t xml:space="preserve"> </w:t>
@@ -1488,11 +1790,16 @@
       <w:r>
         <w:t xml:space="preserve">{{ </w:t>
       </w:r>
+      <w:proofErr w:type="spellStart"/>
       <w:r>
         <w:t>illinois_move_date</w:t>
       </w:r>
       <w:r>
-        <w:t>.format('MM</w:t>
+        <w:t>.format</w:t>
+      </w:r>
+      <w:proofErr w:type="spellEnd"/>
+      <w:r>
+        <w:t>('MM</w:t>
       </w:r>
       <w:r>
         <w:t xml:space="preserve">MM </w:t>
@@ -1503,8 +1810,13 @@
       <w:r>
         <w:t xml:space="preserve">, </w:t>
       </w:r>
-      <w:r>
-        <w:t>yyyy') }}</w:t>
+      <w:proofErr w:type="spellStart"/>
+      <w:r>
+        <w:t>yyyy</w:t>
+      </w:r>
+      <w:proofErr w:type="spellEnd"/>
+      <w:r>
+        <w:t>') }}</w:t>
       </w:r>
       <w:r>
         <w:t>.</w:t>
@@ -1526,14 +1838,30 @@
         <w:rPr>
           <w:bCs/>
         </w:rPr>
-        <w:t>{% if dhs.</w:t>
-      </w:r>
-      <w:r>
-        <w:rPr>
-          <w:bCs/>
-        </w:rPr>
-        <w:t>different_court_location</w:t>
-      </w:r>
+        <w:t xml:space="preserve">{% if </w:t>
+      </w:r>
+      <w:proofErr w:type="spellStart"/>
+      <w:proofErr w:type="gramStart"/>
+      <w:r>
+        <w:rPr>
+          <w:bCs/>
+        </w:rPr>
+        <w:t>dhs.</w:t>
+      </w:r>
+      <w:r>
+        <w:rPr>
+          <w:bCs/>
+        </w:rPr>
+        <w:t>different</w:t>
+      </w:r>
+      <w:proofErr w:type="gramEnd"/>
+      <w:r>
+        <w:rPr>
+          <w:bCs/>
+        </w:rPr>
+        <w:t>_court_location</w:t>
+      </w:r>
+      <w:proofErr w:type="spellEnd"/>
       <w:r>
         <w:rPr>
           <w:bCs/>
@@ -1546,6 +1874,7 @@
         </w:rPr>
         <w:t xml:space="preserve"> </w:t>
       </w:r>
+      <w:proofErr w:type="spellStart"/>
       <w:r>
         <w:rPr>
           <w:bCs/>
@@ -1564,6 +1893,7 @@
         </w:rPr>
         <w:t>court_city</w:t>
       </w:r>
+      <w:proofErr w:type="spellEnd"/>
       <w:r>
         <w:rPr>
           <w:bCs/>
@@ -1582,6 +1912,7 @@
         </w:rPr>
         <w:t xml:space="preserve">{{ </w:t>
       </w:r>
+      <w:proofErr w:type="spellStart"/>
       <w:r>
         <w:rPr>
           <w:bCs/>
@@ -1600,6 +1931,7 @@
         </w:rPr>
         <w:t>court_state</w:t>
       </w:r>
+      <w:proofErr w:type="spellEnd"/>
       <w:r>
         <w:rPr>
           <w:bCs/>
@@ -1618,6 +1950,7 @@
         </w:rPr>
         <w:t xml:space="preserve"> </w:t>
       </w:r>
+      <w:proofErr w:type="spellStart"/>
       <w:r>
         <w:rPr>
           <w:bCs/>
@@ -1640,7 +1973,14 @@
         <w:rPr>
           <w:bCs/>
         </w:rPr>
-        <w:t>city }},</w:t>
+        <w:t>city</w:t>
+      </w:r>
+      <w:proofErr w:type="spellEnd"/>
+      <w:r>
+        <w:rPr>
+          <w:bCs/>
+        </w:rPr>
+        <w:t xml:space="preserve"> }},</w:t>
       </w:r>
       <w:r>
         <w:rPr>
@@ -1654,6 +1994,7 @@
         </w:rPr>
         <w:t xml:space="preserve">{{ </w:t>
       </w:r>
+      <w:proofErr w:type="spellStart"/>
       <w:r>
         <w:rPr>
           <w:bCs/>
@@ -1676,7 +2017,14 @@
         <w:rPr>
           <w:bCs/>
         </w:rPr>
-        <w:t>state }}</w:t>
+        <w:t>state</w:t>
+      </w:r>
+      <w:proofErr w:type="spellEnd"/>
+      <w:r>
+        <w:rPr>
+          <w:bCs/>
+        </w:rPr>
+        <w:t xml:space="preserve"> }}</w:t>
       </w:r>
       <w:r>
         <w:t>{% endif %}</w:t>
@@ -1710,15 +2058,24 @@
           <w:numId w:val="9"/>
         </w:numPr>
         <w:spacing w:line="360" w:lineRule="auto"/>
+        <w:rPr>
+          <w:sz w:val="23"/>
+          <w:szCs w:val="23"/>
+        </w:rPr>
       </w:pPr>
       <w:r>
         <w:t xml:space="preserve">As of today, </w:t>
       </w:r>
+      <w:proofErr w:type="gramStart"/>
       <w:r>
         <w:t>{{</w:t>
       </w:r>
       <w:r>
-        <w:t xml:space="preserve"> today()</w:t>
+        <w:t xml:space="preserve"> today</w:t>
+      </w:r>
+      <w:proofErr w:type="gramEnd"/>
+      <w:r>
+        <w:t>()</w:t>
       </w:r>
       <w:r>
         <w:t>.format('MM</w:t>
@@ -1732,183 +2089,130 @@
       <w:r>
         <w:t xml:space="preserve">, </w:t>
       </w:r>
-      <w:r>
-        <w:t>yyyy') }}</w:t>
-      </w:r>
-      <w:r>
-        <w:t xml:space="preserve">, I have not appeared before an immigration judge and I have not submitted pleadings for my Notice to Appear. </w:t>
-      </w:r>
-    </w:p>
-    <w:p>
-      <w:pPr>
+      <w:proofErr w:type="spellStart"/>
+      <w:r>
+        <w:t>yyyy</w:t>
+      </w:r>
+      <w:proofErr w:type="spellEnd"/>
+      <w:r>
+        <w:t>') }}</w:t>
+      </w:r>
+      <w:r>
+        <w:t xml:space="preserve">, I have not appeared before an immigration judge and I have not submitted pleadings for my Notice to </w:t>
+      </w:r>
+      <w:r>
+        <w:rPr>
+          <w:sz w:val="23"/>
+          <w:szCs w:val="23"/>
+        </w:rPr>
+        <w:t>Appear dated</w:t>
+      </w:r>
+      <w:r>
+        <w:rPr>
+          <w:sz w:val="23"/>
+          <w:szCs w:val="23"/>
+        </w:rPr>
+        <w:t xml:space="preserve"> </w:t>
+      </w:r>
+      <w:r>
+        <w:t>{</w:t>
+      </w:r>
+      <w:r>
+        <w:t xml:space="preserve">{ </w:t>
+      </w:r>
+      <w:proofErr w:type="spellStart"/>
+      <w:r>
+        <w:t>notice_appear_date</w:t>
+      </w:r>
+      <w:r>
+        <w:t>.format</w:t>
+      </w:r>
+      <w:proofErr w:type="spellEnd"/>
+      <w:r>
+        <w:t>(“M</w:t>
+      </w:r>
+      <w:r>
+        <w:t>MM</w:t>
+      </w:r>
+      <w:r>
+        <w:t>M</w:t>
+      </w:r>
+      <w:r>
+        <w:t xml:space="preserve"> </w:t>
+      </w:r>
+      <w:r>
+        <w:t>d</w:t>
+      </w:r>
+      <w:r>
+        <w:t xml:space="preserve">, </w:t>
+      </w:r>
+      <w:proofErr w:type="spellStart"/>
+      <w:r>
+        <w:t>yyyy</w:t>
+      </w:r>
+      <w:proofErr w:type="spellEnd"/>
+      <w:r>
+        <w:t>”)</w:t>
+      </w:r>
+      <w:r>
+        <w:t xml:space="preserve"> </w:t>
+      </w:r>
+      <w:r>
+        <w:t>}}</w:t>
+      </w:r>
+    </w:p>
+    <w:p>
+      <w:pPr>
+        <w:pStyle w:val="NormalWeb"/>
         <w:numPr>
           <w:ilvl w:val="0"/>
           <w:numId w:val="9"/>
         </w:numPr>
-        <w:spacing w:line="360" w:lineRule="auto"/>
-        <w:rPr>
-          <w:sz w:val="23"/>
-          <w:szCs w:val="23"/>
-        </w:rPr>
-      </w:pPr>
-      <w:r>
-        <w:rPr>
-          <w:sz w:val="23"/>
-          <w:szCs w:val="23"/>
-        </w:rPr>
-        <w:t>I enter Pleadings as follows in response to Notice to Appear dated</w:t>
-      </w:r>
-      <w:r>
-        <w:rPr>
-          <w:sz w:val="23"/>
-          <w:szCs w:val="23"/>
-        </w:rPr>
-        <w:t xml:space="preserve"> </w:t>
-      </w:r>
-      <w:r>
-        <w:t>{</w:t>
-      </w:r>
-      <w:r>
-        <w:t xml:space="preserve">{ </w:t>
-      </w:r>
-      <w:r>
-        <w:t>notice_appear_date</w:t>
-      </w:r>
-      <w:r>
-        <w:t>.format(“M</w:t>
-      </w:r>
-      <w:r>
-        <w:t>MM</w:t>
-      </w:r>
-      <w:r>
-        <w:t>M</w:t>
-      </w:r>
-      <w:r>
-        <w:t xml:space="preserve"> </w:t>
-      </w:r>
-      <w:r>
-        <w:t>d</w:t>
-      </w:r>
-      <w:r>
-        <w:t xml:space="preserve">, </w:t>
-      </w:r>
-      <w:r>
-        <w:t>yyyy”)</w:t>
-      </w:r>
-      <w:r>
-        <w:t xml:space="preserve"> </w:t>
-      </w:r>
-      <w:r>
-        <w:t>}}</w:t>
-      </w:r>
-    </w:p>
-    <w:p>
-      <w:pPr>
-        <w:shd w:val="clear" w:color="auto" w:fill="FFFFFF"/>
-        <w:spacing w:before="20" w:line="360" w:lineRule="auto"/>
-        <w:ind w:left="720" w:firstLine="720"/>
-        <w:jc w:val="both"/>
-        <w:rPr>
-          <w:sz w:val="23"/>
-          <w:szCs w:val="23"/>
-        </w:rPr>
-      </w:pPr>
-      <w:r>
-        <w:rPr>
-          <w:sz w:val="23"/>
-          <w:szCs w:val="23"/>
-        </w:rPr>
-        <w:t xml:space="preserve">I admit the allegations in the Notice to Appear.  </w:t>
-      </w:r>
-    </w:p>
-    <w:p>
-      <w:pPr>
-        <w:shd w:val="clear" w:color="auto" w:fill="FFFFFF"/>
-        <w:spacing w:before="20" w:line="360" w:lineRule="auto"/>
-        <w:ind w:left="720" w:firstLine="720"/>
-        <w:jc w:val="both"/>
-        <w:rPr>
-          <w:sz w:val="23"/>
-          <w:szCs w:val="23"/>
-        </w:rPr>
-      </w:pPr>
-      <w:r>
-        <w:rPr>
-          <w:sz w:val="23"/>
-          <w:szCs w:val="23"/>
-        </w:rPr>
-        <w:t xml:space="preserve">I concede removability. </w:t>
-      </w:r>
-    </w:p>
-    <w:p>
-      <w:pPr>
-        <w:shd w:val="clear" w:color="auto" w:fill="FFFFFF"/>
-        <w:spacing w:line="360" w:lineRule="auto"/>
-        <w:ind w:left="720" w:firstLine="720"/>
-        <w:jc w:val="both"/>
-      </w:pPr>
-      <w:r>
-        <w:rPr>
-          <w:sz w:val="23"/>
-          <w:szCs w:val="23"/>
-        </w:rPr>
-        <w:t>I decline to designate a country of removal.</w:t>
-      </w:r>
-      <w:r>
-        <w:t xml:space="preserve">  </w:t>
-      </w:r>
-    </w:p>
-    <w:p>
-      <w:pPr>
-        <w:shd w:val="clear" w:color="auto" w:fill="FFFFFF"/>
-        <w:spacing w:line="360" w:lineRule="auto"/>
-        <w:ind w:left="720" w:firstLine="720"/>
-        <w:jc w:val="both"/>
-      </w:pPr>
-      <w:r>
-        <w:t>I will be seeking</w:t>
-      </w:r>
-      <w:r>
-        <w:t xml:space="preserve"> </w:t>
-      </w:r>
-      <w:r>
-        <w:rPr>
-          <w:bCs/>
-        </w:rPr>
-        <w:t>{{</w:t>
-      </w:r>
-      <w:r>
-        <w:rPr>
-          <w:bCs/>
-        </w:rPr>
-        <w:t xml:space="preserve"> </w:t>
-      </w:r>
-      <w:r>
-        <w:rPr>
-          <w:bCs/>
-        </w:rPr>
-        <w:t>type_of_relief</w:t>
-      </w:r>
-      <w:r>
-        <w:rPr>
-          <w:bCs/>
-        </w:rPr>
-        <w:t xml:space="preserve"> }}</w:t>
-      </w:r>
-      <w:r>
-        <w:t>.</w:t>
-      </w:r>
-    </w:p>
-    <w:p>
-      <w:pPr>
+        <w:spacing w:before="0" w:beforeAutospacing="0" w:after="0" w:afterAutospacing="0" w:line="360" w:lineRule="auto"/>
+        <w:textAlignment w:val="baseline"/>
+        <w:rPr>
+          <w:color w:val="000000"/>
+        </w:rPr>
+      </w:pPr>
+      <w:r>
+        <w:rPr>
+          <w:color w:val="000000"/>
+        </w:rPr>
+        <w:t xml:space="preserve">Given the Immigration Court Practice Manual does not require pleadings for motions to change venue, I am omitting pleadings from this motion because I would like to discuss the case with an attorney before entering pleadings. </w:t>
+      </w:r>
+      <w:r>
+        <w:rPr>
+          <w:i/>
+          <w:iCs/>
+          <w:color w:val="000000"/>
+        </w:rPr>
+        <w:t xml:space="preserve">See </w:t>
+      </w:r>
+      <w:r>
+        <w:rPr>
+          <w:color w:val="000000"/>
+        </w:rPr>
+        <w:t>ICPM Chap. 5.10(c). </w:t>
+      </w:r>
+    </w:p>
+    <w:p>
+      <w:pPr>
+        <w:pStyle w:val="NormalWeb"/>
         <w:numPr>
           <w:ilvl w:val="0"/>
           <w:numId w:val="9"/>
         </w:numPr>
-        <w:spacing w:line="360" w:lineRule="auto"/>
-      </w:pPr>
-      <w:r>
-        <w:t xml:space="preserve">I ask that the court please grant my request to change venue to Chicago, Illinois so that I can continue to reside in Illinois and attend all my court hearing in Chicago. </w:t>
+        <w:spacing w:before="0" w:beforeAutospacing="0" w:after="0" w:afterAutospacing="0" w:line="360" w:lineRule="auto"/>
+        <w:textAlignment w:val="baseline"/>
+        <w:rPr>
+          <w:color w:val="000000"/>
+        </w:rPr>
+      </w:pPr>
+      <w:r>
+        <w:rPr>
+          <w:color w:val="000000"/>
+        </w:rPr>
+        <w:t xml:space="preserve">I ask that the court please grant my request to change venue to Chicago, Illinois so that I can continue to reside in Illinois and attend all my court hearings in Chicago. </w:t>
       </w:r>
     </w:p>
     <w:p>
@@ -1960,6 +2264,7 @@
     </w:p>
     <w:p>
       <w:r>
+        <w:lastRenderedPageBreak/>
         <w:t>Name</w:t>
       </w:r>
       <w:r>
@@ -2054,8 +2359,38 @@
         <w:rPr>
           <w:b/>
         </w:rPr>
-        <w:t>{% if dhs.different_court_location %}{{ dhs.court_city</w:t>
-      </w:r>
+        <w:t xml:space="preserve">{% if </w:t>
+      </w:r>
+      <w:proofErr w:type="spellStart"/>
+      <w:proofErr w:type="gramStart"/>
+      <w:r>
+        <w:rPr>
+          <w:b/>
+        </w:rPr>
+        <w:t>dhs.different</w:t>
+      </w:r>
+      <w:proofErr w:type="gramEnd"/>
+      <w:r>
+        <w:rPr>
+          <w:b/>
+        </w:rPr>
+        <w:t>_court_location</w:t>
+      </w:r>
+      <w:proofErr w:type="spellEnd"/>
+      <w:r>
+        <w:rPr>
+          <w:b/>
+        </w:rPr>
+        <w:t xml:space="preserve"> %}{{ </w:t>
+      </w:r>
+      <w:proofErr w:type="spellStart"/>
+      <w:r>
+        <w:rPr>
+          <w:b/>
+        </w:rPr>
+        <w:t>dhs.court_city</w:t>
+      </w:r>
+      <w:proofErr w:type="spellEnd"/>
       <w:r>
         <w:rPr>
           <w:b/>
@@ -2068,18 +2403,28 @@
         </w:rPr>
         <w:t xml:space="preserve">upper }}, {{ </w:t>
       </w:r>
-      <w:r>
-        <w:rPr>
-          <w:b/>
-        </w:rPr>
-        <w:t>state_name(</w:t>
-      </w:r>
+      <w:proofErr w:type="spellStart"/>
+      <w:r>
+        <w:rPr>
+          <w:b/>
+        </w:rPr>
+        <w:t>state_name</w:t>
+      </w:r>
+      <w:proofErr w:type="spellEnd"/>
+      <w:r>
+        <w:rPr>
+          <w:b/>
+        </w:rPr>
+        <w:t>(</w:t>
+      </w:r>
+      <w:proofErr w:type="spellStart"/>
       <w:r>
         <w:rPr>
           <w:b/>
         </w:rPr>
         <w:t>dhs.court_state</w:t>
       </w:r>
+      <w:proofErr w:type="spellEnd"/>
       <w:r>
         <w:rPr>
           <w:b/>
@@ -2090,8 +2435,16 @@
         <w:rPr>
           <w:b/>
         </w:rPr>
-        <w:t>upper }}{% else %}{{ dhs.address.city</w:t>
-      </w:r>
+        <w:t xml:space="preserve">upper }}{% else %}{{ </w:t>
+      </w:r>
+      <w:proofErr w:type="spellStart"/>
+      <w:r>
+        <w:rPr>
+          <w:b/>
+        </w:rPr>
+        <w:t>dhs.address.city</w:t>
+      </w:r>
+      <w:proofErr w:type="spellEnd"/>
       <w:r>
         <w:rPr>
           <w:b/>
@@ -2107,12 +2460,21 @@
         </w:rPr>
         <w:t xml:space="preserve">upper }}, {{ </w:t>
       </w:r>
-      <w:r>
-        <w:rPr>
-          <w:b/>
-        </w:rPr>
-        <w:t>state_name(</w:t>
-      </w:r>
+      <w:proofErr w:type="spellStart"/>
+      <w:r>
+        <w:rPr>
+          <w:b/>
+        </w:rPr>
+        <w:t>state_name</w:t>
+      </w:r>
+      <w:proofErr w:type="spellEnd"/>
+      <w:r>
+        <w:rPr>
+          <w:b/>
+        </w:rPr>
+        <w:t>(</w:t>
+      </w:r>
+      <w:proofErr w:type="spellStart"/>
       <w:r>
         <w:rPr>
           <w:b/>
@@ -2123,7 +2485,14 @@
         <w:rPr>
           <w:b/>
         </w:rPr>
-        <w:t xml:space="preserve">state) | </w:t>
+        <w:t>state</w:t>
+      </w:r>
+      <w:proofErr w:type="spellEnd"/>
+      <w:r>
+        <w:rPr>
+          <w:b/>
+        </w:rPr>
+        <w:t xml:space="preserve">) | </w:t>
       </w:r>
       <w:r>
         <w:rPr>
@@ -2183,6 +2552,7 @@
         </w:rPr>
         <w:t xml:space="preserve">{%p if </w:t>
       </w:r>
+      <w:proofErr w:type="spellStart"/>
       <w:r>
         <w:rPr>
           <w:bCs/>
@@ -2193,7 +2563,14 @@
         <w:rPr>
           <w:bCs/>
         </w:rPr>
-        <w:t xml:space="preserve">_users </w:t>
+        <w:t>_users</w:t>
+      </w:r>
+      <w:proofErr w:type="spellEnd"/>
+      <w:r>
+        <w:rPr>
+          <w:bCs/>
+        </w:rPr>
+        <w:t xml:space="preserve"> </w:t>
       </w:r>
       <w:r>
         <w:rPr>
@@ -2211,50 +2588,90 @@
           <w:bCs/>
         </w:rPr>
       </w:pPr>
+      <w:proofErr w:type="gramStart"/>
       <w:r>
         <w:rPr>
           <w:bCs/>
         </w:rPr>
         <w:t xml:space="preserve">{{ </w:t>
       </w:r>
+      <w:proofErr w:type="spellStart"/>
+      <w:r>
+        <w:rPr>
+          <w:bCs/>
+        </w:rPr>
+        <w:t>motion</w:t>
+      </w:r>
+      <w:proofErr w:type="gramEnd"/>
+      <w:r>
+        <w:rPr>
+          <w:bCs/>
+        </w:rPr>
+        <w:t>_users</w:t>
+      </w:r>
+      <w:proofErr w:type="spellEnd"/>
+      <w:r>
+        <w:rPr>
+          <w:bCs/>
+        </w:rPr>
+        <w:t>[0].</w:t>
+      </w:r>
+      <w:proofErr w:type="spellStart"/>
+      <w:r>
+        <w:rPr>
+          <w:bCs/>
+        </w:rPr>
+        <w:t>name.lastfirst</w:t>
+      </w:r>
+      <w:proofErr w:type="spellEnd"/>
+      <w:r>
+        <w:rPr>
+          <w:bCs/>
+        </w:rPr>
+        <w:t>()</w:t>
+      </w:r>
+      <w:r>
+        <w:rPr>
+          <w:bCs/>
+        </w:rPr>
+        <w:t>}}</w:t>
+      </w:r>
+      <w:r>
+        <w:t xml:space="preserve"> </w:t>
+      </w:r>
+      <w:r>
+        <w:rPr>
+          <w:bCs/>
+        </w:rPr>
+        <w:t xml:space="preserve">{{ </w:t>
+      </w:r>
+      <w:proofErr w:type="spellStart"/>
       <w:r>
         <w:rPr>
           <w:bCs/>
         </w:rPr>
         <w:t>motion_users</w:t>
       </w:r>
-      <w:r>
-        <w:rPr>
-          <w:bCs/>
-        </w:rPr>
-        <w:t>[0].name.lastfirst()</w:t>
-      </w:r>
-      <w:r>
-        <w:rPr>
-          <w:bCs/>
-        </w:rPr>
-        <w:t>}}</w:t>
-      </w:r>
-      <w:r>
-        <w:t xml:space="preserve"> </w:t>
-      </w:r>
-      <w:r>
-        <w:rPr>
-          <w:bCs/>
-        </w:rPr>
-        <w:t xml:space="preserve">{{ </w:t>
-      </w:r>
-      <w:r>
-        <w:rPr>
-          <w:bCs/>
-        </w:rPr>
-        <w:t>motion_users</w:t>
-      </w:r>
-      <w:r>
-        <w:rPr>
-          <w:bCs/>
-        </w:rPr>
-        <w:t xml:space="preserve">[0].name.middle </w:t>
+      <w:proofErr w:type="spellEnd"/>
+      <w:r>
+        <w:rPr>
+          <w:bCs/>
+        </w:rPr>
+        <w:t>[0].</w:t>
+      </w:r>
+      <w:proofErr w:type="spellStart"/>
+      <w:r>
+        <w:rPr>
+          <w:bCs/>
+        </w:rPr>
+        <w:t>name.middle</w:t>
+      </w:r>
+      <w:proofErr w:type="spellEnd"/>
+      <w:r>
+        <w:rPr>
+          <w:bCs/>
+        </w:rPr>
+        <w:t xml:space="preserve"> </w:t>
       </w:r>
       <w:r>
         <w:rPr>
@@ -2288,12 +2705,14 @@
         </w:rPr>
         <w:t xml:space="preserve">A# {{ </w:t>
       </w:r>
+      <w:proofErr w:type="spellStart"/>
       <w:r>
         <w:rPr>
           <w:bCs/>
         </w:rPr>
         <w:t>motion_users</w:t>
       </w:r>
+      <w:proofErr w:type="spellEnd"/>
       <w:r>
         <w:rPr>
           <w:bCs/>
@@ -2312,11 +2731,19 @@
         </w:rPr>
         <w:t>].</w:t>
       </w:r>
-      <w:r>
-        <w:rPr>
-          <w:bCs/>
-        </w:rPr>
-        <w:t>a_number }}</w:t>
+      <w:proofErr w:type="spellStart"/>
+      <w:r>
+        <w:rPr>
+          <w:bCs/>
+        </w:rPr>
+        <w:t>a_number</w:t>
+      </w:r>
+      <w:proofErr w:type="spellEnd"/>
+      <w:r>
+        <w:rPr>
+          <w:bCs/>
+        </w:rPr>
+        <w:t xml:space="preserve"> }}</w:t>
       </w:r>
     </w:p>
     <w:p>
@@ -2383,12 +2810,14 @@
         </w:rPr>
         <w:t xml:space="preserve">{%p for x in </w:t>
       </w:r>
+      <w:proofErr w:type="spellStart"/>
       <w:r>
         <w:rPr>
           <w:bCs/>
         </w:rPr>
         <w:t>motion_users</w:t>
       </w:r>
+      <w:proofErr w:type="spellEnd"/>
       <w:r>
         <w:rPr>
           <w:bCs/>
@@ -2411,11 +2840,27 @@
         </w:rPr>
         <w:t>{{</w:t>
       </w:r>
-      <w:r>
-        <w:rPr>
-          <w:bCs/>
-        </w:rPr>
-        <w:t>x.name.lastfirst(</w:t>
+      <w:proofErr w:type="spellStart"/>
+      <w:r>
+        <w:rPr>
+          <w:bCs/>
+        </w:rPr>
+        <w:t>x.</w:t>
+      </w:r>
+      <w:proofErr w:type="gramStart"/>
+      <w:r>
+        <w:rPr>
+          <w:bCs/>
+        </w:rPr>
+        <w:t>name.lastfirst</w:t>
+      </w:r>
+      <w:proofErr w:type="spellEnd"/>
+      <w:proofErr w:type="gramEnd"/>
+      <w:r>
+        <w:rPr>
+          <w:bCs/>
+        </w:rPr>
+        <w:t>(</w:t>
       </w:r>
       <w:r>
         <w:rPr>
@@ -2427,8 +2872,16 @@
         <w:rPr>
           <w:bCs/>
         </w:rPr>
-        <w:t>}} {{x.name.middle</w:t>
-      </w:r>
+        <w:t>}} {{</w:t>
+      </w:r>
+      <w:proofErr w:type="spellStart"/>
+      <w:r>
+        <w:rPr>
+          <w:bCs/>
+        </w:rPr>
+        <w:t>x.name.middle</w:t>
+      </w:r>
+      <w:proofErr w:type="spellEnd"/>
       <w:r>
         <w:rPr>
           <w:bCs/>
@@ -2465,13 +2918,27 @@
         <w:rPr>
           <w:bCs/>
         </w:rPr>
-        <w:t xml:space="preserve"> x.</w:t>
-      </w:r>
-      <w:r>
-        <w:rPr>
-          <w:bCs/>
-        </w:rPr>
-        <w:t>a_number }}</w:t>
+        <w:t xml:space="preserve"> </w:t>
+      </w:r>
+      <w:proofErr w:type="spellStart"/>
+      <w:r>
+        <w:rPr>
+          <w:bCs/>
+        </w:rPr>
+        <w:t>x.</w:t>
+      </w:r>
+      <w:r>
+        <w:rPr>
+          <w:bCs/>
+        </w:rPr>
+        <w:t>a_number</w:t>
+      </w:r>
+      <w:proofErr w:type="spellEnd"/>
+      <w:r>
+        <w:rPr>
+          <w:bCs/>
+        </w:rPr>
+        <w:t xml:space="preserve"> }}</w:t>
       </w:r>
     </w:p>
     <w:p>
@@ -2487,7 +2954,21 @@
         <w:rPr>
           <w:bCs/>
         </w:rPr>
-        <w:t>{%p endfor %}</w:t>
+        <w:t xml:space="preserve">{%p </w:t>
+      </w:r>
+      <w:proofErr w:type="spellStart"/>
+      <w:r>
+        <w:rPr>
+          <w:bCs/>
+        </w:rPr>
+        <w:t>endfor</w:t>
+      </w:r>
+      <w:proofErr w:type="spellEnd"/>
+      <w:r>
+        <w:rPr>
+          <w:bCs/>
+        </w:rPr>
+        <w:t xml:space="preserve"> %}</w:t>
       </w:r>
     </w:p>
     <w:p>
@@ -2641,8 +3122,21 @@
         </w:rPr>
         <w:t xml:space="preserve"> </w:t>
       </w:r>
-      <w:r>
-        <w:t>{{ output_checkbox(False) }}</w:t>
+      <w:proofErr w:type="gramStart"/>
+      <w:r>
+        <w:t xml:space="preserve">{{ </w:t>
+      </w:r>
+      <w:proofErr w:type="spellStart"/>
+      <w:r>
+        <w:t>output</w:t>
+      </w:r>
+      <w:proofErr w:type="gramEnd"/>
+      <w:r>
+        <w:t>_checkbox</w:t>
+      </w:r>
+      <w:proofErr w:type="spellEnd"/>
+      <w:r>
+        <w:t>(False) }}</w:t>
       </w:r>
       <w:r>
         <w:rPr>
@@ -2665,7 +3159,15 @@
         <w:t xml:space="preserve">GRANTED </w:t>
       </w:r>
       <w:r>
-        <w:t>{{ output_checkbox(False) }}</w:t>
+        <w:t xml:space="preserve">{{ </w:t>
+      </w:r>
+      <w:proofErr w:type="spellStart"/>
+      <w:r>
+        <w:t>output_checkbox</w:t>
+      </w:r>
+      <w:proofErr w:type="spellEnd"/>
+      <w:r>
+        <w:t>(False) }}</w:t>
       </w:r>
       <w:r>
         <w:rPr>
@@ -2714,8 +3216,21 @@
           <w:rFonts w:eastAsia="Calibri"/>
         </w:rPr>
       </w:pPr>
-      <w:r>
-        <w:t>{{ output_checkbox(False) }}</w:t>
+      <w:proofErr w:type="gramStart"/>
+      <w:r>
+        <w:t xml:space="preserve">{{ </w:t>
+      </w:r>
+      <w:proofErr w:type="spellStart"/>
+      <w:r>
+        <w:t>output</w:t>
+      </w:r>
+      <w:proofErr w:type="gramEnd"/>
+      <w:r>
+        <w:t>_checkbox</w:t>
+      </w:r>
+      <w:proofErr w:type="spellEnd"/>
+      <w:r>
+        <w:t>(False) }}</w:t>
       </w:r>
       <w:r>
         <w:t xml:space="preserve">  </w:t>
@@ -2737,8 +3252,21 @@
           <w:rFonts w:eastAsia="Calibri"/>
         </w:rPr>
       </w:pPr>
-      <w:r>
-        <w:t>{{ output_checkbox(False) }}</w:t>
+      <w:proofErr w:type="gramStart"/>
+      <w:r>
+        <w:t xml:space="preserve">{{ </w:t>
+      </w:r>
+      <w:proofErr w:type="spellStart"/>
+      <w:r>
+        <w:t>output</w:t>
+      </w:r>
+      <w:proofErr w:type="gramEnd"/>
+      <w:r>
+        <w:t>_checkbox</w:t>
+      </w:r>
+      <w:proofErr w:type="spellEnd"/>
+      <w:r>
+        <w:t>(False) }}</w:t>
       </w:r>
       <w:r>
         <w:t xml:space="preserve">  </w:t>
@@ -2760,8 +3288,21 @@
           <w:rFonts w:eastAsia="Calibri"/>
         </w:rPr>
       </w:pPr>
-      <w:r>
-        <w:t>{{ output_checkbox(False) }}</w:t>
+      <w:proofErr w:type="gramStart"/>
+      <w:r>
+        <w:t xml:space="preserve">{{ </w:t>
+      </w:r>
+      <w:proofErr w:type="spellStart"/>
+      <w:r>
+        <w:t>output</w:t>
+      </w:r>
+      <w:proofErr w:type="gramEnd"/>
+      <w:r>
+        <w:t>_checkbox</w:t>
+      </w:r>
+      <w:proofErr w:type="spellEnd"/>
+      <w:r>
+        <w:t>(False) }}</w:t>
       </w:r>
       <w:r>
         <w:t xml:space="preserve">  </w:t>
@@ -2783,8 +3324,21 @@
           <w:rFonts w:eastAsia="Calibri"/>
         </w:rPr>
       </w:pPr>
-      <w:r>
-        <w:t>{{ output_checkbox(False) }}</w:t>
+      <w:proofErr w:type="gramStart"/>
+      <w:r>
+        <w:t xml:space="preserve">{{ </w:t>
+      </w:r>
+      <w:proofErr w:type="spellStart"/>
+      <w:r>
+        <w:t>output</w:t>
+      </w:r>
+      <w:proofErr w:type="gramEnd"/>
+      <w:r>
+        <w:t>_checkbox</w:t>
+      </w:r>
+      <w:proofErr w:type="spellEnd"/>
+      <w:r>
+        <w:t>(False) }}</w:t>
       </w:r>
       <w:r>
         <w:t xml:space="preserve">  </w:t>
@@ -2806,8 +3360,21 @@
           <w:rFonts w:eastAsia="Calibri"/>
         </w:rPr>
       </w:pPr>
-      <w:r>
-        <w:t>{{ output_checkbox(False) }}</w:t>
+      <w:proofErr w:type="gramStart"/>
+      <w:r>
+        <w:t xml:space="preserve">{{ </w:t>
+      </w:r>
+      <w:proofErr w:type="spellStart"/>
+      <w:r>
+        <w:t>output</w:t>
+      </w:r>
+      <w:proofErr w:type="gramEnd"/>
+      <w:r>
+        <w:t>_checkbox</w:t>
+      </w:r>
+      <w:proofErr w:type="spellEnd"/>
+      <w:r>
+        <w:t>(False) }}</w:t>
       </w:r>
       <w:r>
         <w:t xml:space="preserve">  </w:t>
@@ -2829,8 +3396,21 @@
           <w:rFonts w:eastAsia="Calibri"/>
         </w:rPr>
       </w:pPr>
-      <w:r>
-        <w:t>{{ output_checkbox(False) }}</w:t>
+      <w:proofErr w:type="gramStart"/>
+      <w:r>
+        <w:t xml:space="preserve">{{ </w:t>
+      </w:r>
+      <w:proofErr w:type="spellStart"/>
+      <w:r>
+        <w:t>output</w:t>
+      </w:r>
+      <w:proofErr w:type="gramEnd"/>
+      <w:r>
+        <w:t>_checkbox</w:t>
+      </w:r>
+      <w:proofErr w:type="spellEnd"/>
+      <w:r>
+        <w:t>(False) }}</w:t>
       </w:r>
       <w:r>
         <w:t xml:space="preserve">  </w:t>
@@ -2852,8 +3432,21 @@
           <w:rFonts w:eastAsia="Calibri"/>
         </w:rPr>
       </w:pPr>
-      <w:r>
-        <w:t>{{ output_checkbox(False) }}</w:t>
+      <w:proofErr w:type="gramStart"/>
+      <w:r>
+        <w:t xml:space="preserve">{{ </w:t>
+      </w:r>
+      <w:proofErr w:type="spellStart"/>
+      <w:r>
+        <w:t>output</w:t>
+      </w:r>
+      <w:proofErr w:type="gramEnd"/>
+      <w:r>
+        <w:t>_checkbox</w:t>
+      </w:r>
+      <w:proofErr w:type="spellEnd"/>
+      <w:r>
+        <w:t>(False) }}</w:t>
       </w:r>
       <w:r>
         <w:t xml:space="preserve">  </w:t>
@@ -2912,8 +3505,21 @@
           <w:rFonts w:eastAsia="Calibri"/>
         </w:rPr>
       </w:pPr>
-      <w:r>
-        <w:t>{{ output_checkbox(False) }}</w:t>
+      <w:proofErr w:type="gramStart"/>
+      <w:r>
+        <w:t xml:space="preserve">{{ </w:t>
+      </w:r>
+      <w:proofErr w:type="spellStart"/>
+      <w:r>
+        <w:t>output</w:t>
+      </w:r>
+      <w:proofErr w:type="gramEnd"/>
+      <w:r>
+        <w:t>_checkbox</w:t>
+      </w:r>
+      <w:proofErr w:type="spellEnd"/>
+      <w:r>
+        <w:t>(False) }}</w:t>
       </w:r>
       <w:r>
         <w:t xml:space="preserve">  </w:t>
@@ -2935,8 +3541,21 @@
           <w:rFonts w:eastAsia="Calibri"/>
         </w:rPr>
       </w:pPr>
-      <w:r>
-        <w:t>{{ output_checkbox(False) }}</w:t>
+      <w:proofErr w:type="gramStart"/>
+      <w:r>
+        <w:t xml:space="preserve">{{ </w:t>
+      </w:r>
+      <w:proofErr w:type="spellStart"/>
+      <w:r>
+        <w:t>output</w:t>
+      </w:r>
+      <w:proofErr w:type="gramEnd"/>
+      <w:r>
+        <w:t>_checkbox</w:t>
+      </w:r>
+      <w:proofErr w:type="spellEnd"/>
+      <w:r>
+        <w:t>(False) }}</w:t>
       </w:r>
       <w:r>
         <w:t xml:space="preserve">  </w:t>
@@ -3164,7 +3783,21 @@
         <w:rPr>
           <w:rFonts w:eastAsia="Calibri"/>
         </w:rPr>
-        <w:t xml:space="preserve">MAIL (     )   PERSONAL SERVICE (     )   ELECTRONIC SERVICE (     ) </w:t>
+        <w:t xml:space="preserve">MAIL </w:t>
+      </w:r>
+      <w:proofErr w:type="gramStart"/>
+      <w:r>
+        <w:rPr>
+          <w:rFonts w:eastAsia="Calibri"/>
+        </w:rPr>
+        <w:t xml:space="preserve">(  </w:t>
+      </w:r>
+      <w:proofErr w:type="gramEnd"/>
+      <w:r>
+        <w:rPr>
+          <w:rFonts w:eastAsia="Calibri"/>
+        </w:rPr>
+        <w:t xml:space="preserve">   )   PERSONAL SERVICE (     )   ELECTRONIC SERVICE (     ) </w:t>
       </w:r>
     </w:p>
     <w:p>
@@ -3181,7 +3814,21 @@
         <w:rPr>
           <w:rFonts w:eastAsia="Calibri"/>
         </w:rPr>
-        <w:t xml:space="preserve">TO: RESPONDENT (     )    RESPONDENT’S C/O CUSTODIAL OFFICER (     )   RESPONDENT’S ATTY/REP (     )    DHS (     ) </w:t>
+        <w:t xml:space="preserve">TO: RESPONDENT </w:t>
+      </w:r>
+      <w:proofErr w:type="gramStart"/>
+      <w:r>
+        <w:rPr>
+          <w:rFonts w:eastAsia="Calibri"/>
+        </w:rPr>
+        <w:t xml:space="preserve">(  </w:t>
+      </w:r>
+      <w:proofErr w:type="gramEnd"/>
+      <w:r>
+        <w:rPr>
+          <w:rFonts w:eastAsia="Calibri"/>
+        </w:rPr>
+        <w:t xml:space="preserve">   )    RESPONDENT’S C/O CUSTODIAL OFFICER (     )   RESPONDENT’S ATTY/REP (     )    DHS (     ) </w:t>
       </w:r>
     </w:p>
     <w:p>
@@ -3194,11 +3841,19 @@
           <w:rFonts w:eastAsia="Calibri"/>
         </w:rPr>
       </w:pPr>
-      <w:r>
-        <w:rPr>
-          <w:rFonts w:eastAsia="Calibri"/>
-        </w:rPr>
-        <w:t>DATE:____________________   BY: COURT STAFF_________________________________</w:t>
+      <w:proofErr w:type="gramStart"/>
+      <w:r>
+        <w:rPr>
+          <w:rFonts w:eastAsia="Calibri"/>
+        </w:rPr>
+        <w:t>DATE:_</w:t>
+      </w:r>
+      <w:proofErr w:type="gramEnd"/>
+      <w:r>
+        <w:rPr>
+          <w:rFonts w:eastAsia="Calibri"/>
+        </w:rPr>
+        <w:t>___________________   BY: COURT STAFF_________________________________</w:t>
       </w:r>
     </w:p>
     <w:p>
@@ -3215,7 +3870,21 @@
         <w:rPr>
           <w:rFonts w:eastAsia="Calibri"/>
         </w:rPr>
-        <w:t>ATTACHMENTS: EOIR-33 (     )   EOIR-28 (    )   LEGAL SERVICES LIST (   )    OTHER</w:t>
+        <w:t xml:space="preserve">ATTACHMENTS: EOIR-33 </w:t>
+      </w:r>
+      <w:proofErr w:type="gramStart"/>
+      <w:r>
+        <w:rPr>
+          <w:rFonts w:eastAsia="Calibri"/>
+        </w:rPr>
+        <w:t xml:space="preserve">(  </w:t>
+      </w:r>
+      <w:proofErr w:type="gramEnd"/>
+      <w:r>
+        <w:rPr>
+          <w:rFonts w:eastAsia="Calibri"/>
+        </w:rPr>
+        <w:t xml:space="preserve">   )   EOIR-28 (    )   LEGAL SERVICES LIST (   )    OTHER</w:t>
       </w:r>
     </w:p>
     <w:p>
@@ -3269,12 +3938,14 @@
         </w:rPr>
         <w:t xml:space="preserve">{%p if </w:t>
       </w:r>
+      <w:proofErr w:type="spellStart"/>
       <w:r>
         <w:rPr>
           <w:bCs/>
         </w:rPr>
         <w:t>motion_users</w:t>
       </w:r>
+      <w:proofErr w:type="spellEnd"/>
       <w:r>
         <w:rPr>
           <w:bCs/>
@@ -3297,18 +3968,89 @@
           <w:bCs/>
         </w:rPr>
       </w:pPr>
+      <w:proofErr w:type="gramStart"/>
       <w:r>
         <w:rPr>
           <w:bCs/>
         </w:rPr>
         <w:t xml:space="preserve">{{ </w:t>
       </w:r>
+      <w:proofErr w:type="spellStart"/>
+      <w:r>
+        <w:rPr>
+          <w:bCs/>
+        </w:rPr>
+        <w:t>motion</w:t>
+      </w:r>
+      <w:proofErr w:type="gramEnd"/>
+      <w:r>
+        <w:rPr>
+          <w:bCs/>
+        </w:rPr>
+        <w:t>_users</w:t>
+      </w:r>
+      <w:proofErr w:type="spellEnd"/>
+      <w:r>
+        <w:rPr>
+          <w:bCs/>
+        </w:rPr>
+        <w:t>[0</w:t>
+      </w:r>
+      <w:r>
+        <w:rPr>
+          <w:bCs/>
+        </w:rPr>
+        <w:t>]</w:t>
+      </w:r>
+      <w:r>
+        <w:rPr>
+          <w:bCs/>
+        </w:rPr>
+        <w:t>.</w:t>
+      </w:r>
+      <w:proofErr w:type="spellStart"/>
+      <w:r>
+        <w:rPr>
+          <w:bCs/>
+        </w:rPr>
+        <w:t>name</w:t>
+      </w:r>
+      <w:r>
+        <w:rPr>
+          <w:bCs/>
+        </w:rPr>
+        <w:t>.lastfirst</w:t>
+      </w:r>
+      <w:proofErr w:type="spellEnd"/>
+      <w:r>
+        <w:rPr>
+          <w:bCs/>
+        </w:rPr>
+        <w:t>()</w:t>
+      </w:r>
+      <w:r>
+        <w:rPr>
+          <w:bCs/>
+        </w:rPr>
+        <w:t>}}</w:t>
+      </w:r>
+      <w:r>
+        <w:t xml:space="preserve"> </w:t>
+      </w:r>
+      <w:r>
+        <w:rPr>
+          <w:bCs/>
+        </w:rPr>
+        <w:t xml:space="preserve">{{ </w:t>
+      </w:r>
+      <w:proofErr w:type="spellStart"/>
       <w:r>
         <w:rPr>
           <w:bCs/>
         </w:rPr>
         <w:t>motion_users</w:t>
       </w:r>
+      <w:proofErr w:type="spellEnd"/>
       <w:r>
         <w:rPr>
           <w:bCs/>
@@ -3325,58 +4067,27 @@
         <w:rPr>
           <w:bCs/>
         </w:rPr>
-        <w:t>.name</w:t>
-      </w:r>
-      <w:r>
-        <w:rPr>
-          <w:bCs/>
-        </w:rPr>
-        <w:t>.lastfirst()</w:t>
-      </w:r>
-      <w:r>
-        <w:rPr>
-          <w:bCs/>
-        </w:rPr>
-        <w:t>}}</w:t>
-      </w:r>
-      <w:r>
-        <w:t xml:space="preserve"> </w:t>
-      </w:r>
-      <w:r>
-        <w:rPr>
-          <w:bCs/>
-        </w:rPr>
-        <w:t xml:space="preserve">{{ </w:t>
-      </w:r>
-      <w:r>
-        <w:rPr>
-          <w:bCs/>
-        </w:rPr>
-        <w:t>motion_users</w:t>
-      </w:r>
-      <w:r>
-        <w:rPr>
-          <w:bCs/>
-        </w:rPr>
-        <w:t>[0</w:t>
-      </w:r>
-      <w:r>
-        <w:rPr>
-          <w:bCs/>
-        </w:rPr>
-        <w:t>]</w:t>
-      </w:r>
-      <w:r>
-        <w:rPr>
-          <w:bCs/>
-        </w:rPr>
-        <w:t>.name</w:t>
-      </w:r>
-      <w:r>
-        <w:rPr>
-          <w:bCs/>
-        </w:rPr>
-        <w:t xml:space="preserve">.middle </w:t>
+        <w:t>.</w:t>
+      </w:r>
+      <w:proofErr w:type="spellStart"/>
+      <w:r>
+        <w:rPr>
+          <w:bCs/>
+        </w:rPr>
+        <w:t>name</w:t>
+      </w:r>
+      <w:r>
+        <w:rPr>
+          <w:bCs/>
+        </w:rPr>
+        <w:t>.middle</w:t>
+      </w:r>
+      <w:proofErr w:type="spellEnd"/>
+      <w:r>
+        <w:rPr>
+          <w:bCs/>
+        </w:rPr>
+        <w:t xml:space="preserve"> </w:t>
       </w:r>
       <w:r>
         <w:rPr>
@@ -3410,12 +4121,14 @@
         </w:rPr>
         <w:t xml:space="preserve">A# {{ </w:t>
       </w:r>
+      <w:proofErr w:type="spellStart"/>
       <w:r>
         <w:rPr>
           <w:bCs/>
         </w:rPr>
         <w:t>motion_users</w:t>
       </w:r>
+      <w:proofErr w:type="spellEnd"/>
       <w:r>
         <w:rPr>
           <w:bCs/>
@@ -3428,11 +4141,19 @@
         </w:rPr>
         <w:t>].</w:t>
       </w:r>
-      <w:r>
-        <w:rPr>
-          <w:bCs/>
-        </w:rPr>
-        <w:t>a_number }}</w:t>
+      <w:proofErr w:type="spellStart"/>
+      <w:r>
+        <w:rPr>
+          <w:bCs/>
+        </w:rPr>
+        <w:t>a_number</w:t>
+      </w:r>
+      <w:proofErr w:type="spellEnd"/>
+      <w:r>
+        <w:rPr>
+          <w:bCs/>
+        </w:rPr>
+        <w:t xml:space="preserve"> }}</w:t>
       </w:r>
     </w:p>
     <w:p>
@@ -3499,12 +4220,14 @@
         </w:rPr>
         <w:t xml:space="preserve">{%p for x in </w:t>
       </w:r>
+      <w:proofErr w:type="spellStart"/>
       <w:r>
         <w:rPr>
           <w:bCs/>
         </w:rPr>
         <w:t>motion_users</w:t>
       </w:r>
+      <w:proofErr w:type="spellEnd"/>
       <w:r>
         <w:rPr>
           <w:bCs/>
@@ -3527,11 +4250,27 @@
         </w:rPr>
         <w:t>{{</w:t>
       </w:r>
-      <w:r>
-        <w:rPr>
-          <w:bCs/>
-        </w:rPr>
-        <w:t>x.name.lastfirst(</w:t>
+      <w:proofErr w:type="spellStart"/>
+      <w:r>
+        <w:rPr>
+          <w:bCs/>
+        </w:rPr>
+        <w:t>x.</w:t>
+      </w:r>
+      <w:proofErr w:type="gramStart"/>
+      <w:r>
+        <w:rPr>
+          <w:bCs/>
+        </w:rPr>
+        <w:t>name.lastfirst</w:t>
+      </w:r>
+      <w:proofErr w:type="spellEnd"/>
+      <w:proofErr w:type="gramEnd"/>
+      <w:r>
+        <w:rPr>
+          <w:bCs/>
+        </w:rPr>
+        <w:t>(</w:t>
       </w:r>
       <w:r>
         <w:rPr>
@@ -3543,8 +4282,16 @@
         <w:rPr>
           <w:bCs/>
         </w:rPr>
-        <w:t>}} {{x.name.middle</w:t>
-      </w:r>
+        <w:t>}} {{</w:t>
+      </w:r>
+      <w:proofErr w:type="spellStart"/>
+      <w:r>
+        <w:rPr>
+          <w:bCs/>
+        </w:rPr>
+        <w:t>x.name.middle</w:t>
+      </w:r>
+      <w:proofErr w:type="spellEnd"/>
       <w:r>
         <w:rPr>
           <w:bCs/>
@@ -3581,13 +4328,27 @@
         <w:rPr>
           <w:bCs/>
         </w:rPr>
-        <w:t xml:space="preserve"> x.</w:t>
-      </w:r>
-      <w:r>
-        <w:rPr>
-          <w:bCs/>
-        </w:rPr>
-        <w:t>a_number }}</w:t>
+        <w:t xml:space="preserve"> </w:t>
+      </w:r>
+      <w:proofErr w:type="spellStart"/>
+      <w:r>
+        <w:rPr>
+          <w:bCs/>
+        </w:rPr>
+        <w:t>x.</w:t>
+      </w:r>
+      <w:r>
+        <w:rPr>
+          <w:bCs/>
+        </w:rPr>
+        <w:t>a_number</w:t>
+      </w:r>
+      <w:proofErr w:type="spellEnd"/>
+      <w:r>
+        <w:rPr>
+          <w:bCs/>
+        </w:rPr>
+        <w:t xml:space="preserve"> }}</w:t>
       </w:r>
     </w:p>
     <w:p>
@@ -3603,7 +4364,21 @@
         <w:rPr>
           <w:bCs/>
         </w:rPr>
-        <w:t>{%p endfor %}</w:t>
+        <w:t xml:space="preserve">{%p </w:t>
+      </w:r>
+      <w:proofErr w:type="spellStart"/>
+      <w:r>
+        <w:rPr>
+          <w:bCs/>
+        </w:rPr>
+        <w:t>endfor</w:t>
+      </w:r>
+      <w:proofErr w:type="spellEnd"/>
+      <w:r>
+        <w:rPr>
+          <w:bCs/>
+        </w:rPr>
+        <w:t xml:space="preserve"> %}</w:t>
       </w:r>
     </w:p>
     <w:p>
@@ -3696,12 +4471,28 @@
         </w:rPr>
         <w:t xml:space="preserve">{% if </w:t>
       </w:r>
+      <w:proofErr w:type="spellStart"/>
+      <w:r>
+        <w:rPr>
+          <w:bCs/>
+        </w:rPr>
+        <w:t>motion_users</w:t>
+      </w:r>
+      <w:proofErr w:type="spellEnd"/>
+      <w:r>
+        <w:rPr>
+          <w:bCs/>
+        </w:rPr>
+        <w:t>[0].</w:t>
+      </w:r>
+      <w:proofErr w:type="spellStart"/>
       <w:r>
         <w:rPr>
           <w:bCs/>
         </w:rPr>
         <w:t>cert_of_service</w:t>
       </w:r>
+      <w:proofErr w:type="spellEnd"/>
       <w:r>
         <w:rPr>
           <w:bCs/>
@@ -3715,7 +4506,36 @@
         <w:t>%}</w:t>
       </w:r>
       <w:r>
-        <w:t>{{ today().format("MM/dd/yyyy"</w:t>
+        <w:t>{{ today().format("</w:t>
+      </w:r>
+      <w:r>
+        <w:t>M</w:t>
+      </w:r>
+      <w:r>
+        <w:t>M</w:t>
+      </w:r>
+      <w:r>
+        <w:t>M</w:t>
+      </w:r>
+      <w:r>
+        <w:t>M</w:t>
+      </w:r>
+      <w:r>
+        <w:t xml:space="preserve"> </w:t>
+      </w:r>
+      <w:r>
+        <w:t>d</w:t>
+      </w:r>
+      <w:r>
+        <w:t xml:space="preserve">, </w:t>
+      </w:r>
+      <w:proofErr w:type="spellStart"/>
+      <w:r>
+        <w:t>yyyy</w:t>
+      </w:r>
+      <w:proofErr w:type="spellEnd"/>
+      <w:r>
+        <w:t>"</w:t>
       </w:r>
       <w:r>
         <w:t xml:space="preserve">) </w:t>
@@ -3735,11 +4555,19 @@
         </w:rPr>
         <w:t xml:space="preserve">{{ </w:t>
       </w:r>
-      <w:r>
-        <w:rPr>
-          <w:bCs/>
-        </w:rPr>
-        <w:t>motion_users[0]</w:t>
+      <w:proofErr w:type="spellStart"/>
+      <w:r>
+        <w:rPr>
+          <w:bCs/>
+        </w:rPr>
+        <w:t>motion_users</w:t>
+      </w:r>
+      <w:proofErr w:type="spellEnd"/>
+      <w:r>
+        <w:rPr>
+          <w:bCs/>
+        </w:rPr>
+        <w:t>[0]</w:t>
       </w:r>
       <w:r>
         <w:rPr>
@@ -3747,6 +4575,7 @@
         </w:rPr>
         <w:t>.</w:t>
       </w:r>
+      <w:proofErr w:type="spellStart"/>
       <w:r>
         <w:rPr>
           <w:bCs/>
@@ -3765,6 +4594,7 @@
         </w:rPr>
         <w:t>full</w:t>
       </w:r>
+      <w:proofErr w:type="spellEnd"/>
       <w:r>
         <w:rPr>
           <w:bCs/>
@@ -3835,6 +4665,7 @@
         </w:rPr>
         <w:t xml:space="preserve">{{ </w:t>
       </w:r>
+      <w:proofErr w:type="spellStart"/>
       <w:r>
         <w:rPr>
           <w:bCs/>
@@ -3857,7 +4688,14 @@
         <w:rPr>
           <w:bCs/>
         </w:rPr>
-        <w:t>city }},</w:t>
+        <w:t>city</w:t>
+      </w:r>
+      <w:proofErr w:type="spellEnd"/>
+      <w:r>
+        <w:rPr>
+          <w:bCs/>
+        </w:rPr>
+        <w:t xml:space="preserve"> }},</w:t>
       </w:r>
       <w:r>
         <w:rPr>
@@ -3871,6 +4709,7 @@
         </w:rPr>
         <w:t xml:space="preserve">{{ </w:t>
       </w:r>
+      <w:proofErr w:type="spellStart"/>
       <w:r>
         <w:rPr>
           <w:bCs/>
@@ -3893,7 +4732,14 @@
         <w:rPr>
           <w:bCs/>
         </w:rPr>
-        <w:t>state }}</w:t>
+        <w:t>state</w:t>
+      </w:r>
+      <w:proofErr w:type="spellEnd"/>
+      <w:r>
+        <w:rPr>
+          <w:bCs/>
+        </w:rPr>
+        <w:t xml:space="preserve"> }}</w:t>
       </w:r>
       <w:r>
         <w:rPr>
@@ -3921,6 +4767,7 @@
       <w:r>
         <w:t xml:space="preserve">{ </w:t>
       </w:r>
+      <w:proofErr w:type="spellStart"/>
       <w:r>
         <w:rPr>
           <w:bCs/>
@@ -3934,7 +4781,11 @@
         <w:t>.address</w:t>
       </w:r>
       <w:r>
-        <w:t>.on_one_line(</w:t>
+        <w:t>.on_one_line</w:t>
+      </w:r>
+      <w:proofErr w:type="spellEnd"/>
+      <w:r>
+        <w:t>(</w:t>
       </w:r>
       <w:r>
         <w:t>bare=True</w:t>
@@ -4692,6 +5543,119 @@
     </w:lvl>
   </w:abstractNum>
   <w:abstractNum w:abstractNumId="5" w15:restartNumberingAfterBreak="0">
+    <w:nsid w:val="57D85356"/>
+    <w:multiLevelType w:val="multilevel"/>
+    <w:tmpl w:val="876221C2"/>
+    <w:lvl w:ilvl="0">
+      <w:start w:val="1"/>
+      <w:numFmt w:val="decimal"/>
+      <w:lvlText w:val="%1."/>
+      <w:lvlJc w:val="left"/>
+      <w:pPr>
+        <w:tabs>
+          <w:tab w:val="num" w:pos="720"/>
+        </w:tabs>
+        <w:ind w:left="720" w:hanging="360"/>
+      </w:pPr>
+    </w:lvl>
+    <w:lvl w:ilvl="1" w:tentative="1">
+      <w:start w:val="1"/>
+      <w:numFmt w:val="decimal"/>
+      <w:lvlText w:val="%2."/>
+      <w:lvlJc w:val="left"/>
+      <w:pPr>
+        <w:tabs>
+          <w:tab w:val="num" w:pos="1440"/>
+        </w:tabs>
+        <w:ind w:left="1440" w:hanging="360"/>
+      </w:pPr>
+    </w:lvl>
+    <w:lvl w:ilvl="2" w:tentative="1">
+      <w:start w:val="1"/>
+      <w:numFmt w:val="decimal"/>
+      <w:lvlText w:val="%3."/>
+      <w:lvlJc w:val="left"/>
+      <w:pPr>
+        <w:tabs>
+          <w:tab w:val="num" w:pos="2160"/>
+        </w:tabs>
+        <w:ind w:left="2160" w:hanging="360"/>
+      </w:pPr>
+    </w:lvl>
+    <w:lvl w:ilvl="3" w:tentative="1">
+      <w:start w:val="1"/>
+      <w:numFmt w:val="decimal"/>
+      <w:lvlText w:val="%4."/>
+      <w:lvlJc w:val="left"/>
+      <w:pPr>
+        <w:tabs>
+          <w:tab w:val="num" w:pos="2880"/>
+        </w:tabs>
+        <w:ind w:left="2880" w:hanging="360"/>
+      </w:pPr>
+    </w:lvl>
+    <w:lvl w:ilvl="4" w:tentative="1">
+      <w:start w:val="1"/>
+      <w:numFmt w:val="decimal"/>
+      <w:lvlText w:val="%5."/>
+      <w:lvlJc w:val="left"/>
+      <w:pPr>
+        <w:tabs>
+          <w:tab w:val="num" w:pos="3600"/>
+        </w:tabs>
+        <w:ind w:left="3600" w:hanging="360"/>
+      </w:pPr>
+    </w:lvl>
+    <w:lvl w:ilvl="5" w:tentative="1">
+      <w:start w:val="1"/>
+      <w:numFmt w:val="decimal"/>
+      <w:lvlText w:val="%6."/>
+      <w:lvlJc w:val="left"/>
+      <w:pPr>
+        <w:tabs>
+          <w:tab w:val="num" w:pos="4320"/>
+        </w:tabs>
+        <w:ind w:left="4320" w:hanging="360"/>
+      </w:pPr>
+    </w:lvl>
+    <w:lvl w:ilvl="6" w:tentative="1">
+      <w:start w:val="1"/>
+      <w:numFmt w:val="decimal"/>
+      <w:lvlText w:val="%7."/>
+      <w:lvlJc w:val="left"/>
+      <w:pPr>
+        <w:tabs>
+          <w:tab w:val="num" w:pos="5040"/>
+        </w:tabs>
+        <w:ind w:left="5040" w:hanging="360"/>
+      </w:pPr>
+    </w:lvl>
+    <w:lvl w:ilvl="7" w:tentative="1">
+      <w:start w:val="1"/>
+      <w:numFmt w:val="decimal"/>
+      <w:lvlText w:val="%8."/>
+      <w:lvlJc w:val="left"/>
+      <w:pPr>
+        <w:tabs>
+          <w:tab w:val="num" w:pos="5760"/>
+        </w:tabs>
+        <w:ind w:left="5760" w:hanging="360"/>
+      </w:pPr>
+    </w:lvl>
+    <w:lvl w:ilvl="8" w:tentative="1">
+      <w:start w:val="1"/>
+      <w:numFmt w:val="decimal"/>
+      <w:lvlText w:val="%9."/>
+      <w:lvlJc w:val="left"/>
+      <w:pPr>
+        <w:tabs>
+          <w:tab w:val="num" w:pos="6480"/>
+        </w:tabs>
+        <w:ind w:left="6480" w:hanging="360"/>
+      </w:pPr>
+    </w:lvl>
+  </w:abstractNum>
+  <w:abstractNum w:abstractNumId="6" w15:restartNumberingAfterBreak="0">
     <w:nsid w:val="5B1D27F7"/>
     <w:multiLevelType w:val="hybridMultilevel"/>
     <w:tmpl w:val="C944E6F8"/>
@@ -4777,7 +5741,7 @@
       </w:pPr>
     </w:lvl>
   </w:abstractNum>
-  <w:abstractNum w:abstractNumId="6" w15:restartNumberingAfterBreak="0">
+  <w:abstractNum w:abstractNumId="7" w15:restartNumberingAfterBreak="0">
     <w:nsid w:val="72B01F26"/>
     <w:multiLevelType w:val="hybridMultilevel"/>
     <w:tmpl w:val="06C2A96A"/>
@@ -4866,7 +5830,7 @@
       </w:pPr>
     </w:lvl>
   </w:abstractNum>
-  <w:abstractNum w:abstractNumId="7" w15:restartNumberingAfterBreak="0">
+  <w:abstractNum w:abstractNumId="8" w15:restartNumberingAfterBreak="0">
     <w:nsid w:val="78275148"/>
     <w:multiLevelType w:val="multilevel"/>
     <w:tmpl w:val="04967120"/>
@@ -4956,7 +5920,7 @@
     <w:abstractNumId w:val="2"/>
   </w:num>
   <w:num w:numId="2" w16cid:durableId="510411580">
-    <w:abstractNumId w:val="6"/>
+    <w:abstractNumId w:val="7"/>
   </w:num>
   <w:num w:numId="3" w16cid:durableId="1910184917">
     <w:abstractNumId w:val="1"/>
@@ -4965,7 +5929,7 @@
     <w:abstractNumId w:val="2"/>
   </w:num>
   <w:num w:numId="5" w16cid:durableId="745348825">
-    <w:abstractNumId w:val="5"/>
+    <w:abstractNumId w:val="6"/>
   </w:num>
   <w:num w:numId="6" w16cid:durableId="640423890">
     <w:abstractNumId w:val="4"/>
@@ -4977,7 +5941,10 @@
     <w:abstractNumId w:val="3"/>
   </w:num>
   <w:num w:numId="9" w16cid:durableId="1432317788">
-    <w:abstractNumId w:val="7"/>
+    <w:abstractNumId w:val="8"/>
+  </w:num>
+  <w:num w:numId="10" w16cid:durableId="1268196904">
+    <w:abstractNumId w:val="5"/>
   </w:num>
 </w:numbering>
 </file>
@@ -5553,6 +6520,17 @@
     <w:rPr>
       <w:color w:val="808080"/>
     </w:rPr>
+  </w:style>
+  <w:style w:type="paragraph" w:styleId="NormalWeb">
+    <w:name w:val="Normal (Web)"/>
+    <w:basedOn w:val="Normal"/>
+    <w:uiPriority w:val="99"/>
+    <w:semiHidden/>
+    <w:unhideWhenUsed/>
+    <w:rsid w:val="00203743"/>
+    <w:pPr>
+      <w:spacing w:before="100" w:beforeAutospacing="1" w:after="100" w:afterAutospacing="1"/>
+    </w:pPr>
   </w:style>
 </w:styles>
 </file>

</xml_diff>